<commit_message>
correccion de errores de vista
</commit_message>
<xml_diff>
--- a/templates/Borrador_Demanda_Auto_Moto.docx
+++ b/templates/Borrador_Demanda_Auto_Moto.docx
@@ -1312,6 +1312,54 @@
     <w:p>
       <w:pPr>
         <w:spacing w:after="0" w:line="360" w:lineRule="auto"/>
+        <w:jc w:val="both"/>
+        <w:rPr>
+          <w:rFonts w:ascii="Times New Roman" w:eastAsia="Times New Roman" w:hAnsi="Times New Roman" w:cs="Times New Roman"/>
+          <w:sz w:val="24"/>
+          <w:szCs w:val="24"/>
+        </w:rPr>
+      </w:pPr>
+      <w:r>
+        <w:rPr>
+          <w:rFonts w:ascii="Times New Roman" w:eastAsia="Times New Roman" w:hAnsi="Times New Roman" w:cs="Times New Roman"/>
+          <w:sz w:val="24"/>
+          <w:szCs w:val="24"/>
+        </w:rPr>
+        <w:t xml:space="preserve">         </w:t>
+      </w:r>
+      <w:r>
+        <w:rPr>
+          <w:rFonts w:ascii="Times New Roman" w:eastAsia="Times New Roman" w:hAnsi="Times New Roman" w:cs="Times New Roman"/>
+          <w:sz w:val="24"/>
+          <w:szCs w:val="24"/>
+          <w:highlight w:val="yellow"/>
+        </w:rPr>
+        <w:t>{{</w:t>
+      </w:r>
+      <w:proofErr w:type="spellStart"/>
+      <w:r>
+        <w:rPr>
+          <w:rFonts w:ascii="Times New Roman" w:eastAsia="Times New Roman" w:hAnsi="Times New Roman" w:cs="Times New Roman"/>
+          <w:sz w:val="24"/>
+          <w:szCs w:val="24"/>
+          <w:highlight w:val="yellow"/>
+        </w:rPr>
+        <w:t>Intervencion</w:t>
+      </w:r>
+      <w:proofErr w:type="spellEnd"/>
+      <w:r>
+        <w:rPr>
+          <w:rFonts w:ascii="Times New Roman" w:eastAsia="Times New Roman" w:hAnsi="Times New Roman" w:cs="Times New Roman"/>
+          <w:sz w:val="24"/>
+          <w:szCs w:val="24"/>
+          <w:highlight w:val="yellow"/>
+        </w:rPr>
+        <w:t>}}</w:t>
+      </w:r>
+    </w:p>
+    <w:p>
+      <w:pPr>
+        <w:spacing w:after="0" w:line="360" w:lineRule="auto"/>
         <w:ind w:firstLine="554"/>
         <w:jc w:val="both"/>
         <w:rPr>
@@ -1673,16 +1721,8 @@
           <w:sz w:val="24"/>
           <w:szCs w:val="24"/>
         </w:rPr>
-        <w:t xml:space="preserve">Al aplicarse el art. 1758, se invierte la carga de la prueba, colocándose a la víctima del daño en una situación más cómoda al permitir afinar la apreciación de la responsabilidad </w:t>
-      </w:r>
-      <w:r>
-        <w:rPr>
-          <w:rFonts w:ascii="Times New Roman" w:eastAsia="Times New Roman" w:hAnsi="Times New Roman" w:cs="Times New Roman"/>
-          <w:sz w:val="24"/>
-          <w:szCs w:val="24"/>
-        </w:rPr>
         <w:lastRenderedPageBreak/>
-        <w:t>del conductor de un automóvil que, en todo momento, debe tener el más absoluto control del rodado que guía, y por ende, se supone que gobierna (</w:t>
+        <w:t>Al aplicarse el art. 1758, se invierte la carga de la prueba, colocándose a la víctima del daño en una situación más cómoda al permitir afinar la apreciación de la responsabilidad del conductor de un automóvil que, en todo momento, debe tener el más absoluto control del rodado que guía, y por ende, se supone que gobierna (</w:t>
       </w:r>
       <w:proofErr w:type="spellStart"/>
       <w:r>
@@ -2096,7 +2136,18 @@
           <w:sz w:val="24"/>
           <w:szCs w:val="24"/>
         </w:rPr>
-        <w:t>Ha de considerarse inapropiada la velocidad de un vehículo cuando, con independencia de la máxima reglamentaria, no se adapta a las circunstancia de tiempo y lugar y por tal razón vulnera el deber de circular con cuidado y prevención que impone el Código de Tránsito.</w:t>
+        <w:t xml:space="preserve">Ha de considerarse inapropiada la velocidad de un vehículo cuando, con independencia de la máxima reglamentaria, no se adapta a las circunstancia de tiempo y lugar y por tal razón vulnera el deber de circular con cuidado y prevención que </w:t>
+      </w:r>
+      <w:r>
+        <w:rPr>
+          <w:rFonts w:ascii="Times New Roman" w:eastAsia="Times New Roman" w:hAnsi="Times New Roman" w:cs="Times New Roman"/>
+          <w:i/>
+          <w:iCs/>
+          <w:sz w:val="24"/>
+          <w:szCs w:val="24"/>
+        </w:rPr>
+        <w:lastRenderedPageBreak/>
+        <w:t>impone el Código de Tránsito.</w:t>
       </w:r>
       <w:r>
         <w:rPr>
@@ -2122,16 +2173,7 @@
           <w:sz w:val="24"/>
           <w:szCs w:val="24"/>
         </w:rPr>
-        <w:t xml:space="preserve"> Norberto Domingo </w:t>
-      </w:r>
-      <w:r>
-        <w:rPr>
-          <w:rFonts w:ascii="Times New Roman" w:eastAsia="Times New Roman" w:hAnsi="Times New Roman" w:cs="Times New Roman"/>
-          <w:sz w:val="24"/>
-          <w:szCs w:val="24"/>
-        </w:rPr>
-        <w:lastRenderedPageBreak/>
-        <w:t>s/ Daños y perjuicios MAG. VOTANTES: Telechea Rivero de Knezovich-</w:t>
+        <w:t xml:space="preserve"> Norberto Domingo s/ Daños y perjuicios MAG. VOTANTES: Telechea Rivero de Knezovich-</w:t>
       </w:r>
       <w:proofErr w:type="spellStart"/>
       <w:r>
@@ -2569,7 +2611,18 @@
           <w:sz w:val="24"/>
           <w:szCs w:val="24"/>
         </w:rPr>
-        <w:t>es la contingencia del daño que puede provenir de cualquier cosa, riesgosa o no por su naturaleza, en tanto en cuanto por las especiales circunstancias del caso dado, haya resultado apta para llegar a ocasionar el perjuicio, haya podido tener efectiva incidencia causal en su producción.</w:t>
+        <w:t xml:space="preserve">es la contingencia del daño que puede provenir de cualquier cosa, riesgosa o no por su naturaleza, en tanto en cuanto por las especiales circunstancias del caso dado, haya </w:t>
+      </w:r>
+      <w:r>
+        <w:rPr>
+          <w:rFonts w:ascii="Times New Roman" w:eastAsia="Times New Roman" w:hAnsi="Times New Roman" w:cs="Times New Roman"/>
+          <w:i/>
+          <w:iCs/>
+          <w:sz w:val="24"/>
+          <w:szCs w:val="24"/>
+        </w:rPr>
+        <w:lastRenderedPageBreak/>
+        <w:t>resultado apta para llegar a ocasionar el perjuicio, haya podido tener efectiva incidencia causal en su producción.</w:t>
       </w:r>
       <w:r>
         <w:rPr>
@@ -2597,7 +2650,6 @@
           <w:sz w:val="24"/>
           <w:szCs w:val="24"/>
         </w:rPr>
-        <w:lastRenderedPageBreak/>
         <w:t>El fin específico de la figura del riesgo creado es posibilitar la indemnización del daño causado por el riesgo o vicio con indiferencia de toda idea de culpa. Es así que el riesgo creado regula la responsabilidad civil por el hecho de las cosas y constituye el principio rector de la materia. Ergo resulta responsable no sólo el conductor sino la titular registral del automóvil. Se cita jurisprudencia que avala nuestra postura:</w:t>
       </w:r>
     </w:p>
@@ -2888,7 +2940,7 @@
           <w:sz w:val="24"/>
           <w:szCs w:val="24"/>
         </w:rPr>
-        <w:t xml:space="preserve">, “Volver las cosas al estado que tendrían si no hubiera ocurrido el hecho dañoso”, la indemnización se traduce siempre en el pago de una suma de dinero, pues “el patrimonio de la víctima debe ser reestablecido cuantitativamente en sus valores menoscabados, de modo </w:t>
+        <w:t xml:space="preserve">, “Volver las cosas al estado que tendrían si no hubiera ocurrido el hecho dañoso”, la </w:t>
       </w:r>
       <w:r>
         <w:rPr>
@@ -2897,7 +2949,7 @@
           <w:szCs w:val="24"/>
         </w:rPr>
         <w:lastRenderedPageBreak/>
-        <w:t>que quede eliminada la diferencia que existe entre la situación actual del patrimonio y aquella que habría existido de no suceder el acto ilícito”. Por lo cual la indemnización se traduce siempre en el pago de una suma de dinero.</w:t>
+        <w:t>indemnización se traduce siempre en el pago de una suma de dinero, pues “el patrimonio de la víctima debe ser reestablecido cuantitativamente en sus valores menoscabados, de modo que quede eliminada la diferencia que existe entre la situación actual del patrimonio y aquella que habría existido de no suceder el acto ilícito”. Por lo cual la indemnización se traduce siempre en el pago de una suma de dinero.</w:t>
       </w:r>
     </w:p>
     <w:p>
@@ -3845,7 +3897,16 @@
           <w:sz w:val="24"/>
           <w:szCs w:val="24"/>
         </w:rPr>
-        <w:t xml:space="preserve"> los cuales me remito "</w:t>
+        <w:t xml:space="preserve"> los cuales me remito </w:t>
+      </w:r>
+      <w:r>
+        <w:rPr>
+          <w:rFonts w:ascii="Times New Roman" w:eastAsia="Times New Roman" w:hAnsi="Times New Roman" w:cs="Times New Roman"/>
+          <w:sz w:val="24"/>
+          <w:szCs w:val="24"/>
+        </w:rPr>
+        <w:lastRenderedPageBreak/>
+        <w:t>"</w:t>
       </w:r>
       <w:proofErr w:type="spellStart"/>
       <w:r>
@@ -4446,6 +4507,7 @@
           <w:sz w:val="24"/>
           <w:szCs w:val="24"/>
         </w:rPr>
+        <w:lastRenderedPageBreak/>
         <w:t>Como expone Cipriano: "</w:t>
       </w:r>
       <w:r>
@@ -4476,7 +4538,6 @@
           <w:sz w:val="24"/>
           <w:szCs w:val="24"/>
         </w:rPr>
-        <w:lastRenderedPageBreak/>
         <w:t xml:space="preserve">También destaca: </w:t>
       </w:r>
       <w:r>
@@ -4879,6 +4940,7 @@
           <w:sz w:val="24"/>
           <w:szCs w:val="24"/>
         </w:rPr>
+        <w:lastRenderedPageBreak/>
         <w:t xml:space="preserve">Cabe destacar que quien suscribe permanentemente se angustia por su situación física, y por las enormes secuelas que padeció y padece. Es menester mencionar que por el estado en el que se encuentra el actor, su familia está permanentemente angustiada y nerviosa. </w:t>
       </w:r>
     </w:p>
@@ -4899,16 +4961,7 @@
           <w:sz w:val="24"/>
           <w:szCs w:val="24"/>
         </w:rPr>
-        <w:t xml:space="preserve">Para resarcir el daño moral no es exigible prueba acabada del padecimiento, sino que basta la acreditación de las circunstancias que rodearon el hecho y que permitan inferir la </w:t>
-      </w:r>
-      <w:r>
-        <w:rPr>
-          <w:rFonts w:ascii="Times New Roman" w:eastAsia="Times New Roman" w:hAnsi="Times New Roman" w:cs="Times New Roman"/>
-          <w:sz w:val="24"/>
-          <w:szCs w:val="24"/>
-        </w:rPr>
-        <w:lastRenderedPageBreak/>
-        <w:t>existencia y extensión" (</w:t>
+        <w:t>Para resarcir el daño moral no es exigible prueba acabada del padecimiento, sino que basta la acreditación de las circunstancias que rodearon el hecho y que permitan inferir la existencia y extensión" (</w:t>
       </w:r>
       <w:proofErr w:type="spellStart"/>
       <w:r>
@@ -5488,7 +5541,16 @@
           <w:sz w:val="24"/>
           <w:szCs w:val="24"/>
         </w:rPr>
-        <w:t>un  trauma</w:t>
+        <w:t xml:space="preserve">un  </w:t>
+      </w:r>
+      <w:r>
+        <w:rPr>
+          <w:rFonts w:ascii="Times New Roman" w:eastAsia="Times New Roman" w:hAnsi="Times New Roman" w:cs="Times New Roman"/>
+          <w:sz w:val="24"/>
+          <w:szCs w:val="24"/>
+        </w:rPr>
+        <w:lastRenderedPageBreak/>
+        <w:t>trauma</w:t>
       </w:r>
       <w:proofErr w:type="gramEnd"/>
       <w:r>
@@ -5535,7 +5597,6 @@
           <w:sz w:val="24"/>
           <w:szCs w:val="24"/>
         </w:rPr>
-        <w:lastRenderedPageBreak/>
         <w:t>Al momento de la presente demanda el actor se encuentra tanto en tratamiento físico como psicológico, atento a las lesiones padecidas y al traumático momento que protagonizaron, tal como se describe en los puntos anteriores.</w:t>
       </w:r>
     </w:p>
@@ -5842,7 +5903,16 @@
           <w:sz w:val="24"/>
           <w:szCs w:val="24"/>
         </w:rPr>
-        <w:t>, Berta S. de C. c/ Cantini Francisco s/Sumario”). – En igual sentido, la Cámara Comercial se ha expresado manifestando que “el daño psíquico debe ser entendido como un disturbio o disfunción psíquico-orgánica, que puede afectar las esferas afectiva y/ o intelectiva y/ o volitiva, limitando la capacidad de goce individual, familiar, laboral, social y/o recreativa de quien lo padece” (</w:t>
+        <w:t xml:space="preserve">, Berta S. de C. c/ Cantini Francisco s/Sumario”). – En igual sentido, la Cámara Comercial se ha expresado manifestando que “el daño psíquico debe ser entendido como un disturbio o disfunción </w:t>
+      </w:r>
+      <w:r>
+        <w:rPr>
+          <w:rFonts w:ascii="Times New Roman" w:eastAsia="Times New Roman" w:hAnsi="Times New Roman" w:cs="Times New Roman"/>
+          <w:sz w:val="24"/>
+          <w:szCs w:val="24"/>
+        </w:rPr>
+        <w:lastRenderedPageBreak/>
+        <w:t>psíquico-orgánica, que puede afectar las esferas afectiva y/ o intelectiva y/ o volitiva, limitando la capacidad de goce individual, familiar, laboral, social y/o recreativa de quien lo padece” (</w:t>
       </w:r>
       <w:proofErr w:type="spellStart"/>
       <w:r>
@@ -5869,16 +5939,622 @@
           <w:sz w:val="24"/>
           <w:szCs w:val="24"/>
         </w:rPr>
-        <w:t xml:space="preserve">97 </w:t>
-      </w:r>
-      <w:r>
-        <w:rPr>
-          <w:rFonts w:ascii="Times New Roman" w:eastAsia="Times New Roman" w:hAnsi="Times New Roman" w:cs="Times New Roman"/>
-          <w:sz w:val="24"/>
-          <w:szCs w:val="24"/>
+        <w:t>97 ;ALI</w:t>
+      </w:r>
+      <w:proofErr w:type="gramEnd"/>
+      <w:r>
+        <w:rPr>
+          <w:rFonts w:ascii="Times New Roman" w:eastAsia="Times New Roman" w:hAnsi="Times New Roman" w:cs="Times New Roman"/>
+          <w:sz w:val="24"/>
+          <w:szCs w:val="24"/>
+        </w:rPr>
+        <w:t xml:space="preserve"> PACHA, MONICA C/ BERNARDINO RIVADAVIA SA. DE TRANSP. LINEA 63 S/ ORD.;). –</w:t>
+      </w:r>
+    </w:p>
+    <w:p>
+      <w:pPr>
+        <w:spacing w:after="0" w:line="360" w:lineRule="auto"/>
+        <w:ind w:firstLine="720"/>
+        <w:jc w:val="both"/>
+        <w:rPr>
+          <w:rFonts w:ascii="Times New Roman" w:eastAsia="Times New Roman" w:hAnsi="Times New Roman" w:cs="Times New Roman"/>
+          <w:sz w:val="24"/>
+          <w:szCs w:val="24"/>
+        </w:rPr>
+      </w:pPr>
+      <w:r>
+        <w:rPr>
+          <w:rFonts w:ascii="Times New Roman" w:eastAsia="Times New Roman" w:hAnsi="Times New Roman" w:cs="Times New Roman"/>
+          <w:sz w:val="24"/>
+          <w:szCs w:val="24"/>
+        </w:rPr>
+        <w:t>El aquí actor ha padecido como consecuencia del trauma del accidente, de las curaciones y de la discapacidad actual, de una perturbación espiritual que debe ser resarcida.- En el caso de autos existe entre el daño psicológico y el accidente una relación de causalidad, por lo cual se ha aconsejado, para paliar las secuelas conflictivas del evento dañoso, una terapia dirigida o breve, tendiente a neutralizar los disturbios mentales que padece, lo cual tiene una raíz específica y cuya duración y costo puede determinarse, por la concurrencia a los facultativos dos veces por semana durante un lapso aproximado de 2 años.-</w:t>
+      </w:r>
+    </w:p>
+    <w:p>
+      <w:pPr>
+        <w:spacing w:after="0" w:line="360" w:lineRule="auto"/>
+        <w:ind w:firstLine="720"/>
+        <w:jc w:val="both"/>
+        <w:rPr>
+          <w:rFonts w:ascii="Times New Roman" w:eastAsia="Times New Roman" w:hAnsi="Times New Roman" w:cs="Times New Roman"/>
+          <w:sz w:val="24"/>
+          <w:szCs w:val="24"/>
+        </w:rPr>
+      </w:pPr>
+      <w:r>
+        <w:rPr>
+          <w:rFonts w:ascii="Times New Roman" w:eastAsia="Times New Roman" w:hAnsi="Times New Roman" w:cs="Times New Roman"/>
+          <w:sz w:val="24"/>
+          <w:szCs w:val="24"/>
+        </w:rPr>
+        <w:t xml:space="preserve">La afección desde este punto de vista es manifiesta, es por ello </w:t>
+      </w:r>
+      <w:proofErr w:type="gramStart"/>
+      <w:r>
+        <w:rPr>
+          <w:rFonts w:ascii="Times New Roman" w:eastAsia="Times New Roman" w:hAnsi="Times New Roman" w:cs="Times New Roman"/>
+          <w:sz w:val="24"/>
+          <w:szCs w:val="24"/>
+        </w:rPr>
+        <w:t>que</w:t>
+      </w:r>
+      <w:proofErr w:type="gramEnd"/>
+      <w:r>
+        <w:rPr>
+          <w:rFonts w:ascii="Times New Roman" w:eastAsia="Times New Roman" w:hAnsi="Times New Roman" w:cs="Times New Roman"/>
+          <w:sz w:val="24"/>
+          <w:szCs w:val="24"/>
+        </w:rPr>
+        <w:t xml:space="preserve"> esta parte estima por el aquí actor, para responder por este rubro la suma </w:t>
+      </w:r>
+      <w:r>
+        <w:rPr>
+          <w:rFonts w:ascii="Times New Roman" w:eastAsia="Times New Roman" w:hAnsi="Times New Roman" w:cs="Times New Roman"/>
+          <w:b/>
+          <w:bCs/>
+          <w:sz w:val="24"/>
+          <w:szCs w:val="24"/>
+        </w:rPr>
+        <w:t xml:space="preserve">de </w:t>
+      </w:r>
+      <w:r>
+        <w:rPr>
+          <w:rFonts w:ascii="Times New Roman" w:eastAsia="Times New Roman" w:hAnsi="Times New Roman" w:cs="Times New Roman"/>
+          <w:b/>
+          <w:bCs/>
+          <w:sz w:val="24"/>
+          <w:szCs w:val="24"/>
+          <w:highlight w:val="yellow"/>
+        </w:rPr>
+        <w:t>{</w:t>
+      </w:r>
+      <w:r>
+        <w:rPr>
+          <w:rFonts w:ascii="Times New Roman" w:eastAsia="Times New Roman" w:hAnsi="Times New Roman" w:cs="Times New Roman"/>
+          <w:sz w:val="24"/>
+          <w:szCs w:val="24"/>
+          <w:highlight w:val="yellow"/>
+        </w:rPr>
+        <w:t>{</w:t>
+      </w:r>
+      <w:proofErr w:type="spellStart"/>
+      <w:r>
+        <w:rPr>
+          <w:rFonts w:ascii="Times New Roman" w:eastAsia="Times New Roman" w:hAnsi="Times New Roman" w:cs="Times New Roman"/>
+          <w:sz w:val="24"/>
+          <w:szCs w:val="24"/>
+          <w:highlight w:val="yellow"/>
+        </w:rPr>
+        <w:t>LiquiDano</w:t>
+      </w:r>
+      <w:r>
+        <w:rPr>
+          <w:rFonts w:ascii="Times New Roman" w:eastAsia="Times New Roman" w:hAnsi="Times New Roman" w:cs="Times New Roman"/>
+          <w:sz w:val="24"/>
+          <w:szCs w:val="24"/>
+          <w:highlight w:val="yellow"/>
+        </w:rPr>
+        <w:t>Psicologico</w:t>
+      </w:r>
+      <w:r>
+        <w:rPr>
+          <w:rFonts w:ascii="Times New Roman" w:eastAsia="Times New Roman" w:hAnsi="Times New Roman" w:cs="Times New Roman"/>
+          <w:sz w:val="24"/>
+          <w:szCs w:val="24"/>
+          <w:highlight w:val="yellow"/>
+        </w:rPr>
+        <w:t>Letras</w:t>
+      </w:r>
+      <w:proofErr w:type="spellEnd"/>
+      <w:r>
+        <w:rPr>
+          <w:rFonts w:ascii="Times New Roman" w:eastAsia="Times New Roman" w:hAnsi="Times New Roman" w:cs="Times New Roman"/>
+          <w:sz w:val="24"/>
+          <w:szCs w:val="24"/>
+          <w:highlight w:val="yellow"/>
+        </w:rPr>
+        <w:t>}}</w:t>
+      </w:r>
+      <w:r>
+        <w:rPr>
+          <w:rFonts w:ascii="Times New Roman" w:eastAsia="Times New Roman" w:hAnsi="Times New Roman" w:cs="Times New Roman"/>
+          <w:b/>
+          <w:bCs/>
+          <w:sz w:val="24"/>
+          <w:szCs w:val="24"/>
+        </w:rPr>
+        <w:t xml:space="preserve"> </w:t>
+      </w:r>
+      <w:r>
+        <w:rPr>
+          <w:rFonts w:ascii="Times New Roman" w:eastAsia="Times New Roman" w:hAnsi="Times New Roman" w:cs="Times New Roman"/>
+          <w:b/>
+          <w:bCs/>
+          <w:sz w:val="24"/>
+          <w:szCs w:val="24"/>
+        </w:rPr>
+        <w:t>(</w:t>
+      </w:r>
+      <w:r>
+        <w:rPr>
+          <w:rFonts w:ascii="Times New Roman" w:eastAsia="Times New Roman" w:hAnsi="Times New Roman" w:cs="Times New Roman"/>
+          <w:b/>
+          <w:bCs/>
+          <w:sz w:val="24"/>
+          <w:szCs w:val="24"/>
+          <w:highlight w:val="yellow"/>
+        </w:rPr>
+        <w:t>{{</w:t>
+      </w:r>
+      <w:proofErr w:type="spellStart"/>
+      <w:r>
+        <w:rPr>
+          <w:rFonts w:ascii="Times New Roman" w:eastAsia="Times New Roman" w:hAnsi="Times New Roman" w:cs="Times New Roman"/>
+          <w:sz w:val="24"/>
+          <w:szCs w:val="24"/>
+          <w:highlight w:val="yellow"/>
+        </w:rPr>
+        <w:t>LiquiDanoPsicologicoNum</w:t>
+      </w:r>
+      <w:proofErr w:type="spellEnd"/>
+      <w:r>
+        <w:rPr>
+          <w:rFonts w:ascii="Times New Roman" w:eastAsia="Times New Roman" w:hAnsi="Times New Roman" w:cs="Times New Roman"/>
+          <w:sz w:val="24"/>
+          <w:szCs w:val="24"/>
+          <w:highlight w:val="yellow"/>
+        </w:rPr>
+        <w:t>}}</w:t>
+      </w:r>
+      <w:r>
+        <w:rPr>
+          <w:rFonts w:ascii="Times New Roman" w:eastAsia="Times New Roman" w:hAnsi="Times New Roman" w:cs="Times New Roman"/>
+          <w:b/>
+          <w:bCs/>
+          <w:sz w:val="24"/>
+          <w:szCs w:val="24"/>
+        </w:rPr>
+        <w:t>)</w:t>
+      </w:r>
+      <w:r>
+        <w:rPr>
+          <w:rFonts w:ascii="Times New Roman" w:eastAsia="Times New Roman" w:hAnsi="Times New Roman" w:cs="Times New Roman"/>
+          <w:b/>
+          <w:bCs/>
+          <w:sz w:val="24"/>
+          <w:szCs w:val="24"/>
+        </w:rPr>
+        <w:t xml:space="preserve">, </w:t>
+      </w:r>
+      <w:r>
+        <w:rPr>
+          <w:rFonts w:ascii="Times New Roman" w:eastAsia="Times New Roman" w:hAnsi="Times New Roman" w:cs="Times New Roman"/>
+          <w:sz w:val="24"/>
+          <w:szCs w:val="24"/>
+        </w:rPr>
+        <w:t xml:space="preserve">o lo </w:t>
+      </w:r>
+      <w:proofErr w:type="gramStart"/>
+      <w:r>
+        <w:rPr>
+          <w:rFonts w:ascii="Times New Roman" w:eastAsia="Times New Roman" w:hAnsi="Times New Roman" w:cs="Times New Roman"/>
+          <w:sz w:val="24"/>
+          <w:szCs w:val="24"/>
+        </w:rPr>
+        <w:t>que</w:t>
+      </w:r>
+      <w:proofErr w:type="gramEnd"/>
+      <w:r>
+        <w:rPr>
+          <w:rFonts w:ascii="Times New Roman" w:eastAsia="Times New Roman" w:hAnsi="Times New Roman" w:cs="Times New Roman"/>
+          <w:sz w:val="24"/>
+          <w:szCs w:val="24"/>
+        </w:rPr>
+        <w:t xml:space="preserve"> en más en menos, V.S estime corresponder.</w:t>
+      </w:r>
+    </w:p>
+    <w:p>
+      <w:pPr>
+        <w:spacing w:after="0" w:line="360" w:lineRule="auto"/>
+        <w:jc w:val="both"/>
+        <w:rPr>
+          <w:rFonts w:ascii="Times New Roman" w:eastAsia="Times New Roman" w:hAnsi="Times New Roman" w:cs="Times New Roman"/>
+          <w:sz w:val="24"/>
+          <w:szCs w:val="24"/>
+          <w:highlight w:val="yellow"/>
+        </w:rPr>
+      </w:pPr>
+    </w:p>
+    <w:p>
+      <w:pPr>
+        <w:spacing w:after="0" w:line="360" w:lineRule="auto"/>
+        <w:jc w:val="both"/>
+        <w:rPr>
+          <w:rFonts w:ascii="Times New Roman" w:eastAsia="Times New Roman" w:hAnsi="Times New Roman" w:cs="Times New Roman"/>
+          <w:b/>
+          <w:bCs/>
+          <w:sz w:val="24"/>
+          <w:szCs w:val="24"/>
+          <w:u w:val="single"/>
+        </w:rPr>
+      </w:pPr>
+      <w:r>
+        <w:rPr>
+          <w:rFonts w:ascii="Times New Roman" w:eastAsia="Times New Roman" w:hAnsi="Times New Roman" w:cs="Times New Roman"/>
+          <w:b/>
+          <w:bCs/>
+          <w:sz w:val="24"/>
+          <w:szCs w:val="24"/>
+          <w:u w:val="single"/>
+        </w:rPr>
+        <w:t xml:space="preserve">5. TRATAMIENTO PSICOFARMACOLÓGICO FUTURO. </w:t>
+      </w:r>
+    </w:p>
+    <w:p>
+      <w:pPr>
+        <w:spacing w:after="0" w:line="360" w:lineRule="auto"/>
+        <w:ind w:firstLine="720"/>
+        <w:jc w:val="both"/>
+        <w:rPr>
+          <w:rFonts w:ascii="Times New Roman" w:eastAsia="Times New Roman" w:hAnsi="Times New Roman" w:cs="Times New Roman"/>
+          <w:sz w:val="24"/>
+          <w:szCs w:val="24"/>
+        </w:rPr>
+      </w:pPr>
+      <w:r>
+        <w:rPr>
+          <w:rFonts w:ascii="Times New Roman" w:eastAsia="Times New Roman" w:hAnsi="Times New Roman" w:cs="Times New Roman"/>
+          <w:sz w:val="24"/>
+          <w:szCs w:val="24"/>
+        </w:rPr>
+        <w:t xml:space="preserve">Como fuera mencionado ut supra, ha sido aconsejado la actora, para paliar las secuelas conflictivas del evento dañoso, una terapia dirigida o breve, tendiente a neutralizar los disturbios mentales que padece, los cuales tienen una raíz específica desde el accidente. Concretamente le ha sido recomendada la realización de un tratamiento psicológico, con dos sesiones semanales por el lapso aproximado de </w:t>
+      </w:r>
+      <w:proofErr w:type="gramStart"/>
+      <w:r>
+        <w:rPr>
+          <w:rFonts w:ascii="Times New Roman" w:eastAsia="Times New Roman" w:hAnsi="Times New Roman" w:cs="Times New Roman"/>
+          <w:sz w:val="24"/>
+          <w:szCs w:val="24"/>
+        </w:rPr>
+        <w:t>dos  años</w:t>
+      </w:r>
+      <w:proofErr w:type="gramEnd"/>
+      <w:r>
+        <w:rPr>
+          <w:rFonts w:ascii="Times New Roman" w:eastAsia="Times New Roman" w:hAnsi="Times New Roman" w:cs="Times New Roman"/>
+          <w:sz w:val="24"/>
+          <w:szCs w:val="24"/>
+        </w:rPr>
+        <w:t>, lo cual se encuentra supeditado a su estado psicofísico actual y futuro.</w:t>
+      </w:r>
+    </w:p>
+    <w:p>
+      <w:pPr>
+        <w:spacing w:after="0" w:line="360" w:lineRule="auto"/>
+        <w:ind w:firstLine="720"/>
+        <w:jc w:val="both"/>
+        <w:rPr>
+          <w:rFonts w:ascii="Times New Roman" w:eastAsia="Times New Roman" w:hAnsi="Times New Roman" w:cs="Times New Roman"/>
+          <w:sz w:val="24"/>
+          <w:szCs w:val="24"/>
+        </w:rPr>
+      </w:pPr>
+      <w:r>
+        <w:rPr>
+          <w:rFonts w:ascii="Times New Roman" w:eastAsia="Times New Roman" w:hAnsi="Times New Roman" w:cs="Times New Roman"/>
+          <w:sz w:val="24"/>
+          <w:szCs w:val="24"/>
+        </w:rPr>
+        <w:t>En este caso, el requisito de certidumbre solicitado para hacer lugar al presente reclamo es claro, ya que se trata de consecuencias del hecho ilícito que aparecen como una prolongación previsible e inevitable del daño padecido. La jurisprudencia establece al respecto que “comprobada la responsabilidad del demandado en el acaecimiento del ilícito, forzoso es concluir en su deber de cargar con las erogaciones de una terapia psicológica que, al menos, contribuya a sobrellevar las secuelas conflictivas sobrevinientes y que sean consecuencia directa del evento” (</w:t>
+      </w:r>
+      <w:proofErr w:type="spellStart"/>
+      <w:r>
+        <w:rPr>
+          <w:rFonts w:ascii="Times New Roman" w:eastAsia="Times New Roman" w:hAnsi="Times New Roman" w:cs="Times New Roman"/>
+          <w:sz w:val="24"/>
+          <w:szCs w:val="24"/>
+        </w:rPr>
+        <w:t>CNCiv</w:t>
+      </w:r>
+      <w:proofErr w:type="spellEnd"/>
+      <w:r>
+        <w:rPr>
+          <w:rFonts w:ascii="Times New Roman" w:eastAsia="Times New Roman" w:hAnsi="Times New Roman" w:cs="Times New Roman"/>
+          <w:sz w:val="24"/>
+          <w:szCs w:val="24"/>
+        </w:rPr>
+        <w:t xml:space="preserve">., Sala A, 19/06/97, “Leiva, Natividad c/ </w:t>
+      </w:r>
+      <w:proofErr w:type="spellStart"/>
+      <w:r>
+        <w:rPr>
+          <w:rFonts w:ascii="Times New Roman" w:eastAsia="Times New Roman" w:hAnsi="Times New Roman" w:cs="Times New Roman"/>
+          <w:sz w:val="24"/>
+          <w:szCs w:val="24"/>
+        </w:rPr>
+        <w:t>Petrola</w:t>
+      </w:r>
+      <w:proofErr w:type="spellEnd"/>
+      <w:r>
+        <w:rPr>
+          <w:rFonts w:ascii="Times New Roman" w:eastAsia="Times New Roman" w:hAnsi="Times New Roman" w:cs="Times New Roman"/>
+          <w:sz w:val="24"/>
+          <w:szCs w:val="24"/>
+        </w:rPr>
+        <w:t xml:space="preserve">, Raúl R. s/ daños y perjuicios”). “Respecto al costo de una psicoterapia solicitada por la actora, sea que las lesiones de carácter </w:t>
+      </w:r>
+      <w:proofErr w:type="gramStart"/>
+      <w:r>
+        <w:rPr>
+          <w:rFonts w:ascii="Times New Roman" w:eastAsia="Times New Roman" w:hAnsi="Times New Roman" w:cs="Times New Roman"/>
+          <w:sz w:val="24"/>
+          <w:szCs w:val="24"/>
+        </w:rPr>
+        <w:t>psicológico,</w:t>
+      </w:r>
+      <w:proofErr w:type="gramEnd"/>
+      <w:r>
+        <w:rPr>
+          <w:rFonts w:ascii="Times New Roman" w:eastAsia="Times New Roman" w:hAnsi="Times New Roman" w:cs="Times New Roman"/>
+          <w:sz w:val="24"/>
+          <w:szCs w:val="24"/>
+        </w:rPr>
+        <w:t xml:space="preserve"> puedan superarse o no, corresponde resarcir lo que fuere necesario para el tratamiento, al menos con el propósito de evitar el empeoramiento; ello pese a que falte precisión en el dictamen acerca del costo de las sesiones” (</w:t>
+      </w:r>
+      <w:proofErr w:type="spellStart"/>
+      <w:r>
+        <w:rPr>
+          <w:rFonts w:ascii="Times New Roman" w:eastAsia="Times New Roman" w:hAnsi="Times New Roman" w:cs="Times New Roman"/>
+          <w:sz w:val="24"/>
+          <w:szCs w:val="24"/>
+        </w:rPr>
+        <w:t>CNCiv</w:t>
+      </w:r>
+      <w:proofErr w:type="spellEnd"/>
+      <w:r>
+        <w:rPr>
+          <w:rFonts w:ascii="Times New Roman" w:eastAsia="Times New Roman" w:hAnsi="Times New Roman" w:cs="Times New Roman"/>
+          <w:sz w:val="24"/>
+          <w:szCs w:val="24"/>
+        </w:rPr>
+        <w:t>, Sala B, 12/07/96, “Arroyo, Jorge E c/ Reyes, Arandu s/ daños y perjuicios”).</w:t>
+      </w:r>
+    </w:p>
+    <w:p>
+      <w:pPr>
+        <w:spacing w:after="0" w:line="360" w:lineRule="auto"/>
+        <w:ind w:firstLine="720"/>
+        <w:jc w:val="both"/>
+        <w:rPr>
+          <w:rFonts w:ascii="Times New Roman" w:eastAsia="Times New Roman" w:hAnsi="Times New Roman" w:cs="Times New Roman"/>
+          <w:sz w:val="24"/>
+          <w:szCs w:val="24"/>
+        </w:rPr>
+      </w:pPr>
+      <w:r>
+        <w:rPr>
+          <w:rFonts w:ascii="Times New Roman" w:eastAsia="Times New Roman" w:hAnsi="Times New Roman" w:cs="Times New Roman"/>
+          <w:sz w:val="24"/>
+          <w:szCs w:val="24"/>
+        </w:rPr>
+        <w:t xml:space="preserve">Por lo expuesto reclamo por este rubro la suma de </w:t>
+      </w:r>
+      <w:r>
+        <w:rPr>
+          <w:rFonts w:ascii="Times New Roman" w:eastAsia="Times New Roman" w:hAnsi="Times New Roman" w:cs="Times New Roman"/>
+          <w:sz w:val="24"/>
+          <w:szCs w:val="24"/>
+          <w:highlight w:val="yellow"/>
+        </w:rPr>
+        <w:t>{{</w:t>
+      </w:r>
+      <w:proofErr w:type="spellStart"/>
+      <w:r>
+        <w:rPr>
+          <w:rFonts w:ascii="Times New Roman" w:eastAsia="Times New Roman" w:hAnsi="Times New Roman" w:cs="Times New Roman"/>
+          <w:sz w:val="24"/>
+          <w:szCs w:val="24"/>
+          <w:highlight w:val="yellow"/>
+        </w:rPr>
+        <w:t>LiquiGastosFarmaciaLetras</w:t>
+      </w:r>
+      <w:proofErr w:type="spellEnd"/>
+      <w:r>
+        <w:rPr>
+          <w:rFonts w:ascii="Times New Roman" w:eastAsia="Times New Roman" w:hAnsi="Times New Roman" w:cs="Times New Roman"/>
+          <w:sz w:val="24"/>
+          <w:szCs w:val="24"/>
+          <w:highlight w:val="yellow"/>
+        </w:rPr>
+        <w:t>}}</w:t>
+      </w:r>
+      <w:r>
+        <w:rPr>
+          <w:rFonts w:ascii="Times New Roman" w:eastAsia="Times New Roman" w:hAnsi="Times New Roman" w:cs="Times New Roman"/>
+          <w:sz w:val="24"/>
+          <w:szCs w:val="24"/>
+        </w:rPr>
+        <w:t xml:space="preserve"> (</w:t>
+      </w:r>
+      <w:r>
+        <w:rPr>
+          <w:rFonts w:ascii="Times New Roman" w:eastAsia="Times New Roman" w:hAnsi="Times New Roman" w:cs="Times New Roman"/>
+          <w:sz w:val="24"/>
+          <w:szCs w:val="24"/>
+          <w:highlight w:val="yellow"/>
+        </w:rPr>
+        <w:t>{{</w:t>
+      </w:r>
+      <w:proofErr w:type="spellStart"/>
+      <w:r>
+        <w:rPr>
+          <w:rFonts w:ascii="Times New Roman" w:eastAsia="Times New Roman" w:hAnsi="Times New Roman" w:cs="Times New Roman"/>
+          <w:sz w:val="24"/>
+          <w:szCs w:val="24"/>
+          <w:highlight w:val="yellow"/>
+        </w:rPr>
+        <w:t>LiquiGastosFarmaciaNum</w:t>
+      </w:r>
+      <w:proofErr w:type="spellEnd"/>
+      <w:r>
+        <w:rPr>
+          <w:rFonts w:ascii="Times New Roman" w:eastAsia="Times New Roman" w:hAnsi="Times New Roman" w:cs="Times New Roman"/>
+          <w:sz w:val="24"/>
+          <w:szCs w:val="24"/>
+          <w:highlight w:val="yellow"/>
+        </w:rPr>
+        <w:t>}</w:t>
+      </w:r>
+      <w:proofErr w:type="gramStart"/>
+      <w:r>
+        <w:rPr>
+          <w:rFonts w:ascii="Times New Roman" w:eastAsia="Times New Roman" w:hAnsi="Times New Roman" w:cs="Times New Roman"/>
+          <w:sz w:val="24"/>
+          <w:szCs w:val="24"/>
+          <w:highlight w:val="yellow"/>
+        </w:rPr>
+        <w:t>}</w:t>
+      </w:r>
+      <w:r>
+        <w:rPr>
+          <w:rFonts w:ascii="Times New Roman" w:eastAsia="Times New Roman" w:hAnsi="Times New Roman" w:cs="Times New Roman"/>
+          <w:sz w:val="24"/>
+          <w:szCs w:val="24"/>
+        </w:rPr>
+        <w:t>)</w:t>
+      </w:r>
+      <w:r>
+        <w:rPr>
+          <w:rFonts w:ascii="Times New Roman" w:eastAsia="Times New Roman" w:hAnsi="Times New Roman" w:cs="Times New Roman"/>
+          <w:b/>
+          <w:bCs/>
+          <w:sz w:val="24"/>
+          <w:szCs w:val="24"/>
+        </w:rPr>
+        <w:t xml:space="preserve">  </w:t>
+      </w:r>
+      <w:r>
+        <w:rPr>
+          <w:rFonts w:ascii="Times New Roman" w:eastAsia="Times New Roman" w:hAnsi="Times New Roman" w:cs="Times New Roman"/>
+          <w:sz w:val="24"/>
+          <w:szCs w:val="24"/>
+        </w:rPr>
+        <w:t>o</w:t>
+      </w:r>
+      <w:proofErr w:type="gramEnd"/>
+      <w:r>
+        <w:rPr>
+          <w:rFonts w:ascii="Times New Roman" w:eastAsia="Times New Roman" w:hAnsi="Times New Roman" w:cs="Times New Roman"/>
+          <w:sz w:val="24"/>
+          <w:szCs w:val="24"/>
+        </w:rPr>
+        <w:t xml:space="preserve"> lo que en más o en menos resulte de las probanzas de autos.</w:t>
+      </w:r>
+    </w:p>
+    <w:p>
+      <w:pPr>
+        <w:spacing w:after="0" w:line="360" w:lineRule="auto"/>
+        <w:jc w:val="both"/>
+        <w:rPr>
+          <w:rFonts w:ascii="Times New Roman" w:eastAsia="Times New Roman" w:hAnsi="Times New Roman" w:cs="Times New Roman"/>
+          <w:sz w:val="24"/>
+          <w:szCs w:val="24"/>
+          <w:highlight w:val="yellow"/>
+        </w:rPr>
+      </w:pPr>
+    </w:p>
+    <w:p>
+      <w:pPr>
+        <w:spacing w:after="0" w:line="360" w:lineRule="auto"/>
+        <w:jc w:val="both"/>
+        <w:rPr>
+          <w:rFonts w:ascii="Times New Roman" w:eastAsia="Times New Roman" w:hAnsi="Times New Roman" w:cs="Times New Roman"/>
+          <w:b/>
+          <w:bCs/>
+          <w:sz w:val="24"/>
+          <w:szCs w:val="24"/>
+          <w:u w:val="single"/>
+        </w:rPr>
+      </w:pPr>
+      <w:r>
+        <w:rPr>
+          <w:rFonts w:ascii="Times New Roman" w:eastAsia="Times New Roman" w:hAnsi="Times New Roman" w:cs="Times New Roman"/>
+          <w:b/>
+          <w:bCs/>
+          <w:sz w:val="24"/>
+          <w:szCs w:val="24"/>
+          <w:u w:val="single"/>
         </w:rPr>
         <w:lastRenderedPageBreak/>
-        <w:t>;ALI</w:t>
+        <w:t>6. ASISTENCIA MÉDICA - GASTOS FARMACOLÓGICOS</w:t>
+      </w:r>
+    </w:p>
+    <w:p>
+      <w:pPr>
+        <w:spacing w:after="0" w:line="360" w:lineRule="auto"/>
+        <w:ind w:firstLine="720"/>
+        <w:jc w:val="both"/>
+        <w:rPr>
+          <w:rFonts w:ascii="Times New Roman" w:eastAsia="Times New Roman" w:hAnsi="Times New Roman" w:cs="Times New Roman"/>
+          <w:sz w:val="24"/>
+          <w:szCs w:val="24"/>
+        </w:rPr>
+      </w:pPr>
+      <w:r>
+        <w:rPr>
+          <w:rFonts w:ascii="Times New Roman" w:eastAsia="Times New Roman" w:hAnsi="Times New Roman" w:cs="Times New Roman"/>
+          <w:sz w:val="24"/>
+          <w:szCs w:val="24"/>
+        </w:rPr>
+        <w:t xml:space="preserve">La atención médica </w:t>
+      </w:r>
+      <w:proofErr w:type="spellStart"/>
+      <w:r>
+        <w:rPr>
+          <w:rFonts w:ascii="Times New Roman" w:eastAsia="Times New Roman" w:hAnsi="Times New Roman" w:cs="Times New Roman"/>
+          <w:sz w:val="24"/>
+          <w:szCs w:val="24"/>
+        </w:rPr>
+        <w:t>querecibio</w:t>
+      </w:r>
+      <w:proofErr w:type="spellEnd"/>
+      <w:r>
+        <w:rPr>
+          <w:rFonts w:ascii="Times New Roman" w:eastAsia="Times New Roman" w:hAnsi="Times New Roman" w:cs="Times New Roman"/>
+          <w:sz w:val="24"/>
+          <w:szCs w:val="24"/>
+        </w:rPr>
+        <w:t xml:space="preserve"> se </w:t>
+      </w:r>
+      <w:proofErr w:type="gramStart"/>
+      <w:r>
+        <w:rPr>
+          <w:rFonts w:ascii="Times New Roman" w:eastAsia="Times New Roman" w:hAnsi="Times New Roman" w:cs="Times New Roman"/>
+          <w:sz w:val="24"/>
+          <w:szCs w:val="24"/>
+        </w:rPr>
+        <w:t>realizó  en</w:t>
       </w:r>
       <w:proofErr w:type="gramEnd"/>
       <w:r>
@@ -5887,7 +6563,7 @@
           <w:sz w:val="24"/>
           <w:szCs w:val="24"/>
         </w:rPr>
-        <w:t xml:space="preserve"> PACHA, MONICA C/ BERNARDINO RIVADAVIA SA. DE TRANSP. LINEA 63 S/ ORD.;). –</w:t>
+        <w:t xml:space="preserve"> el centro mencionado, debiendo luego de la consulta continuar con tratamiento ambulatorio hasta la actualidad. Se generaron considerables gastos (tomografías, medicamentos, calmantes, analgésicos, antibióticos, radiografías, psicofármacos, estudios, inyectables, antiinflamatorios) los cuales fueron solventados con la ayuda de familiares y amigos. </w:t>
       </w:r>
     </w:p>
     <w:p>
@@ -5907,7 +6583,7 @@
           <w:sz w:val="24"/>
           <w:szCs w:val="24"/>
         </w:rPr>
-        <w:t>El aquí actor ha padecido como consecuencia del trauma del accidente, de las curaciones y de la discapacidad actual, de una perturbación espiritual que debe ser resarcida.- En el caso de autos existe entre el daño psicológico y el accidente una relación de causalidad, por lo cual se ha aconsejado, para paliar las secuelas conflictivas del evento dañoso, una terapia dirigida o breve, tendiente a neutralizar los disturbios mentales que padece, lo cual tiene una raíz específica y cuya duración y costo puede determinarse, por la concurrencia a los facultativos dos veces por semana durante un lapso aproximado de 2 años.-</w:t>
+        <w:t>Conforme al art. 68 de la Ley Nacional de Tránsito, establece que: “...Los gastos de sanatorio o velatorio de terceros, serán abonados de inmediato por el asegurador, sin perjuicio de los derechos que se pueden hacer valer luego...”</w:t>
       </w:r>
     </w:p>
     <w:p>
@@ -5927,7 +6603,7 @@
           <w:sz w:val="24"/>
           <w:szCs w:val="24"/>
         </w:rPr>
-        <w:t xml:space="preserve">La afección desde este punto de vista es manifiesta, es por ello </w:t>
+        <w:t xml:space="preserve">Es pacífica la jurisprudencia en conceder este rubro y se ha resuelto </w:t>
       </w:r>
       <w:proofErr w:type="gramStart"/>
       <w:r>
@@ -5945,37 +6621,7 @@
           <w:sz w:val="24"/>
           <w:szCs w:val="24"/>
         </w:rPr>
-        <w:t xml:space="preserve"> esta parte estima por el aquí actor, para responder por este rubro la suma </w:t>
-      </w:r>
-      <w:r>
-        <w:rPr>
-          <w:rFonts w:ascii="Times New Roman" w:eastAsia="Times New Roman" w:hAnsi="Times New Roman" w:cs="Times New Roman"/>
-          <w:b/>
-          <w:bCs/>
-          <w:sz w:val="24"/>
-          <w:szCs w:val="24"/>
-        </w:rPr>
-        <w:t xml:space="preserve">de </w:t>
-      </w:r>
-      <w:r>
-        <w:rPr>
-          <w:rFonts w:ascii="Times New Roman" w:eastAsia="Times New Roman" w:hAnsi="Times New Roman" w:cs="Times New Roman"/>
-          <w:b/>
-          <w:bCs/>
-          <w:sz w:val="24"/>
-          <w:szCs w:val="24"/>
-          <w:highlight w:val="yellow"/>
-        </w:rPr>
-        <w:t>{</w:t>
-      </w:r>
-      <w:r>
-        <w:rPr>
-          <w:rFonts w:ascii="Times New Roman" w:eastAsia="Times New Roman" w:hAnsi="Times New Roman" w:cs="Times New Roman"/>
-          <w:sz w:val="24"/>
-          <w:szCs w:val="24"/>
-          <w:highlight w:val="yellow"/>
-        </w:rPr>
-        <w:t>{</w:t>
+        <w:t xml:space="preserve"> probado el daño, este rubro procede sin necesidad de la prueba concreta y acabada. En efecto, en este sentido se manifiesta que: “Resulta procedente indemnizar los gastos médicos producidos como consecuencia del accidente, </w:t>
       </w:r>
       <w:proofErr w:type="spellStart"/>
       <w:r>
@@ -5983,27 +6629,8 @@
           <w:rFonts w:ascii="Times New Roman" w:eastAsia="Times New Roman" w:hAnsi="Times New Roman" w:cs="Times New Roman"/>
           <w:sz w:val="24"/>
           <w:szCs w:val="24"/>
-          <w:highlight w:val="yellow"/>
-        </w:rPr>
-        <w:t>LiquiDano</w:t>
-      </w:r>
-      <w:r>
-        <w:rPr>
-          <w:rFonts w:ascii="Times New Roman" w:eastAsia="Times New Roman" w:hAnsi="Times New Roman" w:cs="Times New Roman"/>
-          <w:sz w:val="24"/>
-          <w:szCs w:val="24"/>
-          <w:highlight w:val="yellow"/>
-        </w:rPr>
-        <w:t>Psicologico</w:t>
-      </w:r>
-      <w:r>
-        <w:rPr>
-          <w:rFonts w:ascii="Times New Roman" w:eastAsia="Times New Roman" w:hAnsi="Times New Roman" w:cs="Times New Roman"/>
-          <w:sz w:val="24"/>
-          <w:szCs w:val="24"/>
-          <w:highlight w:val="yellow"/>
-        </w:rPr>
-        <w:t>Letras</w:t>
+        </w:rPr>
+        <w:t>aún</w:t>
       </w:r>
       <w:proofErr w:type="spellEnd"/>
       <w:r>
@@ -6011,6 +6638,166 @@
           <w:rFonts w:ascii="Times New Roman" w:eastAsia="Times New Roman" w:hAnsi="Times New Roman" w:cs="Times New Roman"/>
           <w:sz w:val="24"/>
           <w:szCs w:val="24"/>
+        </w:rPr>
+        <w:t xml:space="preserve"> cuando no exista prueba documental, ya que la asistencia hospitalaria provoca una serie de desembolso de no fácil acreditación...” (Conf. Cam. </w:t>
+      </w:r>
+      <w:proofErr w:type="spellStart"/>
+      <w:r>
+        <w:rPr>
+          <w:rFonts w:ascii="Times New Roman" w:eastAsia="Times New Roman" w:hAnsi="Times New Roman" w:cs="Times New Roman"/>
+          <w:sz w:val="24"/>
+          <w:szCs w:val="24"/>
+        </w:rPr>
+        <w:t>Civ</w:t>
+      </w:r>
+      <w:proofErr w:type="spellEnd"/>
+      <w:r>
+        <w:rPr>
+          <w:rFonts w:ascii="Times New Roman" w:eastAsia="Times New Roman" w:hAnsi="Times New Roman" w:cs="Times New Roman"/>
+          <w:sz w:val="24"/>
+          <w:szCs w:val="24"/>
+        </w:rPr>
+        <w:t xml:space="preserve">. y Com. Fed. Sala II, marzo 24 de 1981). A su vez se establece que: “cuando se han acreditado lesiones, deben presumirse erogaciones por gastos médicos, y farmacéuticos, aun cuando hayan intervenido establecimientos asistenciales hospitalarios y no se encuentren documentado su importe, pues es evidente que existen gastos que debe soportar el accidentado, además el art 1086 del CC establece que la indemnización comprenderá el pago de todos los gastos de curación y convalecencia del ofendido” (Sala II, Cam. </w:t>
+      </w:r>
+      <w:proofErr w:type="spellStart"/>
+      <w:r>
+        <w:rPr>
+          <w:rFonts w:ascii="Times New Roman" w:eastAsia="Times New Roman" w:hAnsi="Times New Roman" w:cs="Times New Roman"/>
+          <w:sz w:val="24"/>
+          <w:szCs w:val="24"/>
+        </w:rPr>
+        <w:t>Civ</w:t>
+      </w:r>
+      <w:proofErr w:type="spellEnd"/>
+      <w:r>
+        <w:rPr>
+          <w:rFonts w:ascii="Times New Roman" w:eastAsia="Times New Roman" w:hAnsi="Times New Roman" w:cs="Times New Roman"/>
+          <w:sz w:val="24"/>
+          <w:szCs w:val="24"/>
+        </w:rPr>
+        <w:t xml:space="preserve">. Y Com. Morón, CC002 MORSD- 7-93 s 4-2-93, “Caceres </w:t>
+      </w:r>
+      <w:proofErr w:type="spellStart"/>
+      <w:r>
+        <w:rPr>
+          <w:rFonts w:ascii="Times New Roman" w:eastAsia="Times New Roman" w:hAnsi="Times New Roman" w:cs="Times New Roman"/>
+          <w:sz w:val="24"/>
+          <w:szCs w:val="24"/>
+        </w:rPr>
+        <w:t>Perez</w:t>
+      </w:r>
+      <w:proofErr w:type="spellEnd"/>
+      <w:r>
+        <w:rPr>
+          <w:rFonts w:ascii="Times New Roman" w:eastAsia="Times New Roman" w:hAnsi="Times New Roman" w:cs="Times New Roman"/>
+          <w:sz w:val="24"/>
+          <w:szCs w:val="24"/>
+        </w:rPr>
+        <w:t xml:space="preserve"> Alma C/ Morais </w:t>
+      </w:r>
+      <w:proofErr w:type="spellStart"/>
+      <w:r>
+        <w:rPr>
+          <w:rFonts w:ascii="Times New Roman" w:eastAsia="Times New Roman" w:hAnsi="Times New Roman" w:cs="Times New Roman"/>
+          <w:sz w:val="24"/>
+          <w:szCs w:val="24"/>
+        </w:rPr>
+        <w:t>Maria</w:t>
+      </w:r>
+      <w:proofErr w:type="spellEnd"/>
+      <w:r>
+        <w:rPr>
+          <w:rFonts w:ascii="Times New Roman" w:eastAsia="Times New Roman" w:hAnsi="Times New Roman" w:cs="Times New Roman"/>
+          <w:sz w:val="24"/>
+          <w:szCs w:val="24"/>
+        </w:rPr>
+        <w:t xml:space="preserve"> Elena S/ Daños y Perjuicios).</w:t>
+      </w:r>
+    </w:p>
+    <w:p>
+      <w:pPr>
+        <w:spacing w:after="0" w:line="360" w:lineRule="auto"/>
+        <w:ind w:firstLine="720"/>
+        <w:jc w:val="both"/>
+        <w:rPr>
+          <w:rFonts w:ascii="Times New Roman" w:eastAsia="Times New Roman" w:hAnsi="Times New Roman" w:cs="Times New Roman"/>
+          <w:sz w:val="24"/>
+          <w:szCs w:val="24"/>
+        </w:rPr>
+      </w:pPr>
+      <w:r>
+        <w:rPr>
+          <w:rFonts w:ascii="Times New Roman" w:eastAsia="Times New Roman" w:hAnsi="Times New Roman" w:cs="Times New Roman"/>
+          <w:sz w:val="24"/>
+          <w:szCs w:val="24"/>
+        </w:rPr>
+        <w:t>Todas las erogaciones realizadas con la finalidad de recuperar el estado del lesionado, anterior a las lesiones sufridas, entran en el concepto de gastos de curación y convalecencia (</w:t>
+      </w:r>
+      <w:proofErr w:type="spellStart"/>
+      <w:r>
+        <w:rPr>
+          <w:rFonts w:ascii="Times New Roman" w:eastAsia="Times New Roman" w:hAnsi="Times New Roman" w:cs="Times New Roman"/>
+          <w:sz w:val="24"/>
+          <w:szCs w:val="24"/>
+        </w:rPr>
+        <w:t>CNCiv</w:t>
+      </w:r>
+      <w:proofErr w:type="spellEnd"/>
+      <w:r>
+        <w:rPr>
+          <w:rFonts w:ascii="Times New Roman" w:eastAsia="Times New Roman" w:hAnsi="Times New Roman" w:cs="Times New Roman"/>
+          <w:sz w:val="24"/>
+          <w:szCs w:val="24"/>
+        </w:rPr>
+        <w:t>. Sala A, 29-3-95, Saavedra, Dora y otro c/ Lorenzo s/ Daños y perjuicios).</w:t>
+      </w:r>
+    </w:p>
+    <w:p>
+      <w:pPr>
+        <w:spacing w:after="0" w:line="360" w:lineRule="auto"/>
+        <w:ind w:firstLine="720"/>
+        <w:jc w:val="both"/>
+        <w:rPr>
+          <w:rFonts w:ascii="Times New Roman" w:eastAsia="Times New Roman" w:hAnsi="Times New Roman" w:cs="Times New Roman"/>
+          <w:sz w:val="24"/>
+          <w:szCs w:val="24"/>
+        </w:rPr>
+      </w:pPr>
+      <w:r>
+        <w:rPr>
+          <w:rFonts w:ascii="Times New Roman" w:eastAsia="Times New Roman" w:hAnsi="Times New Roman" w:cs="Times New Roman"/>
+          <w:sz w:val="24"/>
+          <w:szCs w:val="24"/>
+        </w:rPr>
+        <w:t>Por lo expuesto, estimo en este rubro la suma de </w:t>
+      </w:r>
+      <w:r>
+        <w:rPr>
+          <w:rFonts w:ascii="Times New Roman" w:eastAsia="Times New Roman" w:hAnsi="Times New Roman" w:cs="Times New Roman"/>
+          <w:b/>
+          <w:bCs/>
+          <w:sz w:val="24"/>
+          <w:szCs w:val="24"/>
+          <w:highlight w:val="yellow"/>
+        </w:rPr>
+        <w:t>{{</w:t>
+      </w:r>
+      <w:proofErr w:type="spellStart"/>
+      <w:r>
+        <w:rPr>
+          <w:rFonts w:ascii="Times New Roman" w:eastAsia="Times New Roman" w:hAnsi="Times New Roman" w:cs="Times New Roman"/>
+          <w:sz w:val="24"/>
+          <w:szCs w:val="24"/>
+          <w:highlight w:val="yellow"/>
+        </w:rPr>
+        <w:t>LiquiGastosMedicosLetras</w:t>
+      </w:r>
+      <w:proofErr w:type="spellEnd"/>
+      <w:r>
+        <w:rPr>
+          <w:rFonts w:ascii="Times New Roman" w:eastAsia="Times New Roman" w:hAnsi="Times New Roman" w:cs="Times New Roman"/>
+          <w:sz w:val="24"/>
+          <w:szCs w:val="24"/>
           <w:highlight w:val="yellow"/>
         </w:rPr>
         <w:t>}}</w:t>
@@ -6023,23 +6810,193 @@
           <w:sz w:val="24"/>
           <w:szCs w:val="24"/>
         </w:rPr>
+        <w:t xml:space="preserve"> (</w:t>
+      </w:r>
+      <w:r>
+        <w:rPr>
+          <w:rFonts w:ascii="Times New Roman" w:eastAsia="Times New Roman" w:hAnsi="Times New Roman" w:cs="Times New Roman"/>
+          <w:b/>
+          <w:bCs/>
+          <w:sz w:val="24"/>
+          <w:szCs w:val="24"/>
+          <w:highlight w:val="yellow"/>
+        </w:rPr>
+        <w:t>{{</w:t>
+      </w:r>
+      <w:proofErr w:type="spellStart"/>
+      <w:r>
+        <w:rPr>
+          <w:rFonts w:ascii="Times New Roman" w:eastAsia="Times New Roman" w:hAnsi="Times New Roman" w:cs="Times New Roman"/>
+          <w:sz w:val="24"/>
+          <w:szCs w:val="24"/>
+          <w:highlight w:val="yellow"/>
+        </w:rPr>
+        <w:t>LiquiGastosMedicos</w:t>
+      </w:r>
+      <w:r>
+        <w:rPr>
+          <w:rFonts w:ascii="Times New Roman" w:eastAsia="Times New Roman" w:hAnsi="Times New Roman" w:cs="Times New Roman"/>
+          <w:sz w:val="24"/>
+          <w:szCs w:val="24"/>
+          <w:highlight w:val="yellow"/>
+        </w:rPr>
+        <w:t>Num</w:t>
+      </w:r>
+      <w:proofErr w:type="spellEnd"/>
+      <w:r>
+        <w:rPr>
+          <w:rFonts w:ascii="Times New Roman" w:eastAsia="Times New Roman" w:hAnsi="Times New Roman" w:cs="Times New Roman"/>
+          <w:sz w:val="24"/>
+          <w:szCs w:val="24"/>
+          <w:highlight w:val="yellow"/>
+        </w:rPr>
+        <w:t>}}</w:t>
+      </w:r>
+      <w:r>
+        <w:rPr>
+          <w:rFonts w:ascii="Times New Roman" w:eastAsia="Times New Roman" w:hAnsi="Times New Roman" w:cs="Times New Roman"/>
+          <w:b/>
+          <w:bCs/>
+          <w:sz w:val="24"/>
+          <w:szCs w:val="24"/>
+        </w:rPr>
+        <w:t>)</w:t>
+      </w:r>
+      <w:r>
+        <w:rPr>
+          <w:rFonts w:ascii="Times New Roman" w:eastAsia="Times New Roman" w:hAnsi="Times New Roman" w:cs="Times New Roman"/>
+          <w:b/>
+          <w:bCs/>
+          <w:sz w:val="24"/>
+          <w:szCs w:val="24"/>
+        </w:rPr>
         <w:t xml:space="preserve"> </w:t>
       </w:r>
       <w:r>
         <w:rPr>
           <w:rFonts w:ascii="Times New Roman" w:eastAsia="Times New Roman" w:hAnsi="Times New Roman" w:cs="Times New Roman"/>
-          <w:b/>
-          <w:bCs/>
-          <w:sz w:val="24"/>
-          <w:szCs w:val="24"/>
-        </w:rPr>
-        <w:t>(</w:t>
-      </w:r>
-      <w:r>
-        <w:rPr>
-          <w:rFonts w:ascii="Times New Roman" w:eastAsia="Times New Roman" w:hAnsi="Times New Roman" w:cs="Times New Roman"/>
-          <w:b/>
-          <w:bCs/>
+          <w:sz w:val="24"/>
+          <w:szCs w:val="24"/>
+        </w:rPr>
+        <w:t>por la asistencia médica y gastos farmacológicos del aquí actor.</w:t>
+      </w:r>
+    </w:p>
+    <w:p>
+      <w:pPr>
+        <w:spacing w:after="0" w:line="360" w:lineRule="auto"/>
+        <w:jc w:val="both"/>
+        <w:rPr>
+          <w:rFonts w:ascii="Times New Roman" w:eastAsia="Times New Roman" w:hAnsi="Times New Roman" w:cs="Times New Roman"/>
+          <w:sz w:val="24"/>
+          <w:szCs w:val="24"/>
+        </w:rPr>
+      </w:pPr>
+    </w:p>
+    <w:p>
+      <w:pPr>
+        <w:spacing w:after="0" w:line="360" w:lineRule="auto"/>
+        <w:jc w:val="both"/>
+        <w:rPr>
+          <w:rFonts w:ascii="Times New Roman" w:eastAsia="Times New Roman" w:hAnsi="Times New Roman" w:cs="Times New Roman"/>
+          <w:sz w:val="24"/>
+          <w:szCs w:val="24"/>
+          <w:highlight w:val="yellow"/>
+        </w:rPr>
+      </w:pPr>
+    </w:p>
+    <w:p>
+      <w:pPr>
+        <w:spacing w:after="0" w:line="360" w:lineRule="auto"/>
+        <w:jc w:val="both"/>
+        <w:rPr>
+          <w:rFonts w:ascii="Times New Roman" w:eastAsia="Times New Roman" w:hAnsi="Times New Roman" w:cs="Times New Roman"/>
+          <w:b/>
+          <w:bCs/>
+          <w:sz w:val="24"/>
+          <w:szCs w:val="24"/>
+          <w:u w:val="single"/>
+        </w:rPr>
+      </w:pPr>
+      <w:r>
+        <w:rPr>
+          <w:rFonts w:ascii="Times New Roman" w:eastAsia="Times New Roman" w:hAnsi="Times New Roman" w:cs="Times New Roman"/>
+          <w:b/>
+          <w:bCs/>
+          <w:sz w:val="24"/>
+          <w:szCs w:val="24"/>
+          <w:u w:val="single"/>
+        </w:rPr>
+        <w:t>VIII. LIQUIDACIÓN:</w:t>
+      </w:r>
+    </w:p>
+    <w:p>
+      <w:pPr>
+        <w:spacing w:after="0" w:line="360" w:lineRule="auto"/>
+        <w:ind w:firstLine="554"/>
+        <w:jc w:val="both"/>
+        <w:rPr>
+          <w:rFonts w:ascii="Times New Roman" w:eastAsia="Times New Roman" w:hAnsi="Times New Roman" w:cs="Times New Roman"/>
+          <w:sz w:val="24"/>
+          <w:szCs w:val="24"/>
+        </w:rPr>
+      </w:pPr>
+      <w:r>
+        <w:rPr>
+          <w:rFonts w:ascii="Times New Roman" w:eastAsia="Times New Roman" w:hAnsi="Times New Roman" w:cs="Times New Roman"/>
+          <w:sz w:val="24"/>
+          <w:szCs w:val="24"/>
+        </w:rPr>
+        <w:t>Se practica la siguiente liquidación, suma que se reclama debidamente actualizada, con más sus intereses desde la fecha del evento hasta la de su efectivo pago, o la que en más o en menos resulte de las probanzas a rendirse en autos:</w:t>
+      </w:r>
+    </w:p>
+    <w:p>
+      <w:pPr>
+        <w:spacing w:after="0" w:line="360" w:lineRule="auto"/>
+        <w:jc w:val="both"/>
+        <w:rPr>
+          <w:rFonts w:ascii="Times New Roman" w:eastAsia="Times New Roman" w:hAnsi="Times New Roman" w:cs="Times New Roman"/>
+          <w:sz w:val="24"/>
+          <w:szCs w:val="24"/>
+          <w:highlight w:val="yellow"/>
+        </w:rPr>
+      </w:pPr>
+    </w:p>
+    <w:p>
+      <w:pPr>
+        <w:spacing w:after="0" w:line="360" w:lineRule="auto"/>
+        <w:rPr>
+          <w:rFonts w:ascii="Times New Roman" w:eastAsia="Times New Roman" w:hAnsi="Times New Roman" w:cs="Times New Roman"/>
+          <w:sz w:val="24"/>
+          <w:szCs w:val="24"/>
+        </w:rPr>
+      </w:pPr>
+      <w:r>
+        <w:rPr>
+          <w:rFonts w:ascii="Times New Roman" w:eastAsia="Times New Roman" w:hAnsi="Times New Roman" w:cs="Times New Roman"/>
+          <w:sz w:val="24"/>
+          <w:szCs w:val="24"/>
+        </w:rPr>
+        <w:t>1. DAÑO MATERIAL …………</w:t>
+      </w:r>
+      <w:r>
+        <w:rPr>
+          <w:rFonts w:ascii="Times New Roman" w:eastAsia="Times New Roman" w:hAnsi="Times New Roman" w:cs="Times New Roman"/>
+          <w:sz w:val="24"/>
+          <w:szCs w:val="24"/>
+        </w:rPr>
+        <w:t xml:space="preserve">………. </w:t>
+      </w:r>
+      <w:r>
+        <w:rPr>
+          <w:rFonts w:ascii="Times New Roman" w:eastAsia="Times New Roman" w:hAnsi="Times New Roman" w:cs="Times New Roman"/>
+          <w:sz w:val="24"/>
+          <w:szCs w:val="24"/>
+        </w:rPr>
+        <w:t xml:space="preserve"> </w:t>
+      </w:r>
+      <w:r>
+        <w:rPr>
+          <w:rFonts w:ascii="Times New Roman" w:eastAsia="Times New Roman" w:hAnsi="Times New Roman" w:cs="Times New Roman"/>
           <w:sz w:val="24"/>
           <w:szCs w:val="24"/>
           <w:highlight w:val="yellow"/>
@@ -6054,6 +7011,199 @@
           <w:szCs w:val="24"/>
           <w:highlight w:val="yellow"/>
         </w:rPr>
+        <w:t>LiquiDanoMaterialNum</w:t>
+      </w:r>
+      <w:proofErr w:type="spellEnd"/>
+      <w:r>
+        <w:rPr>
+          <w:rFonts w:ascii="Times New Roman" w:eastAsia="Times New Roman" w:hAnsi="Times New Roman" w:cs="Times New Roman"/>
+          <w:sz w:val="24"/>
+          <w:szCs w:val="24"/>
+          <w:highlight w:val="yellow"/>
+        </w:rPr>
+        <w:t>}}</w:t>
+      </w:r>
+    </w:p>
+    <w:p>
+      <w:pPr>
+        <w:spacing w:after="0" w:line="360" w:lineRule="auto"/>
+        <w:rPr>
+          <w:rFonts w:ascii="Times New Roman" w:eastAsia="Times New Roman" w:hAnsi="Times New Roman" w:cs="Times New Roman"/>
+          <w:sz w:val="24"/>
+          <w:szCs w:val="24"/>
+        </w:rPr>
+      </w:pPr>
+      <w:r>
+        <w:rPr>
+          <w:rFonts w:ascii="Times New Roman" w:eastAsia="Times New Roman" w:hAnsi="Times New Roman" w:cs="Times New Roman"/>
+          <w:sz w:val="24"/>
+          <w:szCs w:val="24"/>
+        </w:rPr>
+        <w:t>2.  DAÑO FÍSICO E INCAPACIDAD</w:t>
+      </w:r>
+      <w:proofErr w:type="gramStart"/>
+      <w:r>
+        <w:rPr>
+          <w:rFonts w:ascii="Times New Roman" w:eastAsia="Times New Roman" w:hAnsi="Times New Roman" w:cs="Times New Roman"/>
+          <w:sz w:val="24"/>
+          <w:szCs w:val="24"/>
+        </w:rPr>
+        <w:t xml:space="preserve"> ..</w:t>
+      </w:r>
+      <w:proofErr w:type="gramEnd"/>
+      <w:r>
+        <w:rPr>
+          <w:rFonts w:ascii="Times New Roman" w:eastAsia="Times New Roman" w:hAnsi="Times New Roman" w:cs="Times New Roman"/>
+          <w:sz w:val="24"/>
+          <w:szCs w:val="24"/>
+        </w:rPr>
+        <w:t>…</w:t>
+      </w:r>
+      <w:r>
+        <w:rPr>
+          <w:rFonts w:ascii="Times New Roman" w:eastAsia="Times New Roman" w:hAnsi="Times New Roman" w:cs="Times New Roman"/>
+          <w:sz w:val="24"/>
+          <w:szCs w:val="24"/>
+          <w:highlight w:val="yellow"/>
+        </w:rPr>
+        <w:t>{{</w:t>
+      </w:r>
+      <w:proofErr w:type="spellStart"/>
+      <w:r>
+        <w:rPr>
+          <w:rFonts w:ascii="Times New Roman" w:eastAsia="Times New Roman" w:hAnsi="Times New Roman" w:cs="Times New Roman"/>
+          <w:sz w:val="24"/>
+          <w:szCs w:val="24"/>
+          <w:highlight w:val="yellow"/>
+        </w:rPr>
+        <w:t>LiquiIncapacidadFisicaNum</w:t>
+      </w:r>
+      <w:proofErr w:type="spellEnd"/>
+      <w:r>
+        <w:rPr>
+          <w:rFonts w:ascii="Times New Roman" w:eastAsia="Times New Roman" w:hAnsi="Times New Roman" w:cs="Times New Roman"/>
+          <w:sz w:val="24"/>
+          <w:szCs w:val="24"/>
+          <w:highlight w:val="yellow"/>
+        </w:rPr>
+        <w:t>}}</w:t>
+      </w:r>
+    </w:p>
+    <w:p>
+      <w:pPr>
+        <w:spacing w:after="0" w:line="360" w:lineRule="auto"/>
+        <w:rPr>
+          <w:rFonts w:ascii="Times New Roman" w:eastAsia="Times New Roman" w:hAnsi="Times New Roman" w:cs="Times New Roman"/>
+          <w:sz w:val="24"/>
+          <w:szCs w:val="24"/>
+        </w:rPr>
+      </w:pPr>
+      <w:r>
+        <w:rPr>
+          <w:rFonts w:ascii="Times New Roman" w:eastAsia="Times New Roman" w:hAnsi="Times New Roman" w:cs="Times New Roman"/>
+          <w:sz w:val="24"/>
+          <w:szCs w:val="24"/>
+        </w:rPr>
+        <w:t>3. DAÑO MORAL</w:t>
+      </w:r>
+      <w:proofErr w:type="gramStart"/>
+      <w:r>
+        <w:rPr>
+          <w:rFonts w:ascii="Times New Roman" w:eastAsia="Times New Roman" w:hAnsi="Times New Roman" w:cs="Times New Roman"/>
+          <w:sz w:val="24"/>
+          <w:szCs w:val="24"/>
+        </w:rPr>
+        <w:t xml:space="preserve"> ….</w:t>
+      </w:r>
+      <w:proofErr w:type="gramEnd"/>
+      <w:r>
+        <w:rPr>
+          <w:rFonts w:ascii="Times New Roman" w:eastAsia="Times New Roman" w:hAnsi="Times New Roman" w:cs="Times New Roman"/>
+          <w:sz w:val="24"/>
+          <w:szCs w:val="24"/>
+        </w:rPr>
+        <w:t xml:space="preserve">.…………… </w:t>
+      </w:r>
+      <w:r>
+        <w:rPr>
+          <w:rFonts w:ascii="Times New Roman" w:eastAsia="Times New Roman" w:hAnsi="Times New Roman" w:cs="Times New Roman"/>
+          <w:sz w:val="24"/>
+          <w:szCs w:val="24"/>
+          <w:highlight w:val="yellow"/>
+        </w:rPr>
+        <w:t>{{</w:t>
+      </w:r>
+      <w:proofErr w:type="spellStart"/>
+      <w:r>
+        <w:rPr>
+          <w:rFonts w:ascii="Times New Roman" w:eastAsia="Times New Roman" w:hAnsi="Times New Roman" w:cs="Times New Roman"/>
+          <w:sz w:val="24"/>
+          <w:szCs w:val="24"/>
+          <w:highlight w:val="yellow"/>
+        </w:rPr>
+        <w:t>LiquiDanoMoralNum</w:t>
+      </w:r>
+      <w:proofErr w:type="spellEnd"/>
+      <w:r>
+        <w:rPr>
+          <w:rFonts w:ascii="Times New Roman" w:eastAsia="Times New Roman" w:hAnsi="Times New Roman" w:cs="Times New Roman"/>
+          <w:sz w:val="24"/>
+          <w:szCs w:val="24"/>
+          <w:highlight w:val="yellow"/>
+        </w:rPr>
+        <w:t>}}</w:t>
+      </w:r>
+    </w:p>
+    <w:p>
+      <w:pPr>
+        <w:spacing w:after="0" w:line="360" w:lineRule="auto"/>
+        <w:rPr>
+          <w:rFonts w:ascii="Times New Roman" w:eastAsia="Times New Roman" w:hAnsi="Times New Roman" w:cs="Times New Roman"/>
+          <w:sz w:val="24"/>
+          <w:szCs w:val="24"/>
+        </w:rPr>
+      </w:pPr>
+      <w:r>
+        <w:rPr>
+          <w:rFonts w:ascii="Times New Roman" w:eastAsia="Times New Roman" w:hAnsi="Times New Roman" w:cs="Times New Roman"/>
+          <w:sz w:val="24"/>
+          <w:szCs w:val="24"/>
+        </w:rPr>
+        <w:t>4. DAÑO PSICOLÓGICO …</w:t>
+      </w:r>
+      <w:r>
+        <w:rPr>
+          <w:rFonts w:ascii="Times New Roman" w:eastAsia="Times New Roman" w:hAnsi="Times New Roman" w:cs="Times New Roman"/>
+          <w:sz w:val="24"/>
+          <w:szCs w:val="24"/>
+        </w:rPr>
+        <w:t>….</w:t>
+      </w:r>
+      <w:r>
+        <w:rPr>
+          <w:rFonts w:ascii="Times New Roman" w:eastAsia="Times New Roman" w:hAnsi="Times New Roman" w:cs="Times New Roman"/>
+          <w:sz w:val="24"/>
+          <w:szCs w:val="24"/>
+        </w:rPr>
+        <w:t xml:space="preserve"> </w:t>
+      </w:r>
+      <w:r>
+        <w:rPr>
+          <w:rFonts w:ascii="Times New Roman" w:eastAsia="Times New Roman" w:hAnsi="Times New Roman" w:cs="Times New Roman"/>
+          <w:sz w:val="24"/>
+          <w:szCs w:val="24"/>
+          <w:highlight w:val="yellow"/>
+        </w:rPr>
+        <w:t>{{</w:t>
+      </w:r>
+      <w:proofErr w:type="spellStart"/>
+      <w:r>
+        <w:rPr>
+          <w:rFonts w:ascii="Times New Roman" w:eastAsia="Times New Roman" w:hAnsi="Times New Roman" w:cs="Times New Roman"/>
+          <w:sz w:val="24"/>
+          <w:szCs w:val="24"/>
+          <w:highlight w:val="yellow"/>
+        </w:rPr>
         <w:t>LiquiDanoPsicologicoNum</w:t>
       </w:r>
       <w:proofErr w:type="spellEnd"/>
@@ -6066,69 +7216,198 @@
         </w:rPr>
         <w:t>}}</w:t>
       </w:r>
-      <w:r>
-        <w:rPr>
-          <w:rFonts w:ascii="Times New Roman" w:eastAsia="Times New Roman" w:hAnsi="Times New Roman" w:cs="Times New Roman"/>
-          <w:b/>
-          <w:bCs/>
-          <w:sz w:val="24"/>
-          <w:szCs w:val="24"/>
-        </w:rPr>
-        <w:t>)</w:t>
-      </w:r>
-      <w:r>
-        <w:rPr>
-          <w:rFonts w:ascii="Times New Roman" w:eastAsia="Times New Roman" w:hAnsi="Times New Roman" w:cs="Times New Roman"/>
-          <w:b/>
-          <w:bCs/>
-          <w:sz w:val="24"/>
-          <w:szCs w:val="24"/>
-        </w:rPr>
-        <w:t xml:space="preserve">, </w:t>
-      </w:r>
-      <w:r>
-        <w:rPr>
-          <w:rFonts w:ascii="Times New Roman" w:eastAsia="Times New Roman" w:hAnsi="Times New Roman" w:cs="Times New Roman"/>
-          <w:sz w:val="24"/>
-          <w:szCs w:val="24"/>
-        </w:rPr>
-        <w:t xml:space="preserve">o lo </w:t>
-      </w:r>
-      <w:proofErr w:type="gramStart"/>
-      <w:r>
-        <w:rPr>
-          <w:rFonts w:ascii="Times New Roman" w:eastAsia="Times New Roman" w:hAnsi="Times New Roman" w:cs="Times New Roman"/>
-          <w:sz w:val="24"/>
-          <w:szCs w:val="24"/>
-        </w:rPr>
-        <w:t>que</w:t>
-      </w:r>
-      <w:proofErr w:type="gramEnd"/>
-      <w:r>
-        <w:rPr>
-          <w:rFonts w:ascii="Times New Roman" w:eastAsia="Times New Roman" w:hAnsi="Times New Roman" w:cs="Times New Roman"/>
-          <w:sz w:val="24"/>
-          <w:szCs w:val="24"/>
-        </w:rPr>
-        <w:t xml:space="preserve"> en más en menos, V.S estime corresponder.</w:t>
-      </w:r>
-    </w:p>
-    <w:p>
-      <w:pPr>
-        <w:spacing w:after="0" w:line="360" w:lineRule="auto"/>
-        <w:jc w:val="both"/>
-        <w:rPr>
-          <w:rFonts w:ascii="Times New Roman" w:eastAsia="Times New Roman" w:hAnsi="Times New Roman" w:cs="Times New Roman"/>
-          <w:sz w:val="24"/>
-          <w:szCs w:val="24"/>
-          <w:highlight w:val="yellow"/>
-        </w:rPr>
-      </w:pPr>
-    </w:p>
-    <w:p>
-      <w:pPr>
-        <w:spacing w:after="0" w:line="360" w:lineRule="auto"/>
-        <w:jc w:val="both"/>
+    </w:p>
+    <w:p>
+      <w:pPr>
+        <w:spacing w:after="0" w:line="360" w:lineRule="auto"/>
+        <w:rPr>
+          <w:rFonts w:ascii="Times New Roman" w:eastAsia="Times New Roman" w:hAnsi="Times New Roman" w:cs="Times New Roman"/>
+          <w:sz w:val="24"/>
+          <w:szCs w:val="24"/>
+        </w:rPr>
+      </w:pPr>
+      <w:r>
+        <w:rPr>
+          <w:rFonts w:ascii="Times New Roman" w:eastAsia="Times New Roman" w:hAnsi="Times New Roman" w:cs="Times New Roman"/>
+          <w:sz w:val="24"/>
+          <w:szCs w:val="24"/>
+        </w:rPr>
+        <w:t>5. DAÑO PSICOFARMACOLÓGICO FUTURO.…</w:t>
+      </w:r>
+      <w:r>
+        <w:rPr>
+          <w:rFonts w:ascii="Times New Roman" w:eastAsia="Times New Roman" w:hAnsi="Times New Roman" w:cs="Times New Roman"/>
+          <w:sz w:val="24"/>
+          <w:szCs w:val="24"/>
+        </w:rPr>
+        <w:t xml:space="preserve"> </w:t>
+      </w:r>
+      <w:r>
+        <w:rPr>
+          <w:rFonts w:ascii="Times New Roman" w:eastAsia="Times New Roman" w:hAnsi="Times New Roman" w:cs="Times New Roman"/>
+          <w:sz w:val="24"/>
+          <w:szCs w:val="24"/>
+          <w:highlight w:val="yellow"/>
+        </w:rPr>
+        <w:t>{{</w:t>
+      </w:r>
+      <w:proofErr w:type="spellStart"/>
+      <w:r>
+        <w:rPr>
+          <w:rFonts w:ascii="Times New Roman" w:eastAsia="Times New Roman" w:hAnsi="Times New Roman" w:cs="Times New Roman"/>
+          <w:sz w:val="24"/>
+          <w:szCs w:val="24"/>
+          <w:highlight w:val="yellow"/>
+        </w:rPr>
+        <w:t>Liqui</w:t>
+      </w:r>
+      <w:r>
+        <w:rPr>
+          <w:rFonts w:ascii="Times New Roman" w:eastAsia="Times New Roman" w:hAnsi="Times New Roman" w:cs="Times New Roman"/>
+          <w:sz w:val="24"/>
+          <w:szCs w:val="24"/>
+          <w:highlight w:val="yellow"/>
+        </w:rPr>
+        <w:t>GastosFarmacia</w:t>
+      </w:r>
+      <w:r>
+        <w:rPr>
+          <w:rFonts w:ascii="Times New Roman" w:eastAsia="Times New Roman" w:hAnsi="Times New Roman" w:cs="Times New Roman"/>
+          <w:sz w:val="24"/>
+          <w:szCs w:val="24"/>
+          <w:highlight w:val="yellow"/>
+        </w:rPr>
+        <w:t>Num</w:t>
+      </w:r>
+      <w:proofErr w:type="spellEnd"/>
+      <w:r>
+        <w:rPr>
+          <w:rFonts w:ascii="Times New Roman" w:eastAsia="Times New Roman" w:hAnsi="Times New Roman" w:cs="Times New Roman"/>
+          <w:sz w:val="24"/>
+          <w:szCs w:val="24"/>
+          <w:highlight w:val="yellow"/>
+        </w:rPr>
+        <w:t>}}</w:t>
+      </w:r>
+    </w:p>
+    <w:p>
+      <w:pPr>
+        <w:spacing w:after="0" w:line="360" w:lineRule="auto"/>
+        <w:rPr>
+          <w:rFonts w:ascii="Times New Roman" w:eastAsia="Times New Roman" w:hAnsi="Times New Roman" w:cs="Times New Roman"/>
+          <w:sz w:val="24"/>
+          <w:szCs w:val="24"/>
+        </w:rPr>
+      </w:pPr>
+      <w:r>
+        <w:rPr>
+          <w:rFonts w:ascii="Times New Roman" w:eastAsia="Times New Roman" w:hAnsi="Times New Roman" w:cs="Times New Roman"/>
+          <w:sz w:val="24"/>
+          <w:szCs w:val="24"/>
+        </w:rPr>
+        <w:lastRenderedPageBreak/>
+        <w:t>6. ASISTENCIA MÉDICA- GASTOS</w:t>
+      </w:r>
+      <w:r>
+        <w:rPr>
+          <w:rFonts w:ascii="Times New Roman" w:eastAsia="Times New Roman" w:hAnsi="Times New Roman" w:cs="Times New Roman"/>
+          <w:sz w:val="24"/>
+          <w:szCs w:val="24"/>
+        </w:rPr>
+        <w:t xml:space="preserve"> </w:t>
+      </w:r>
+      <w:r>
+        <w:rPr>
+          <w:rFonts w:ascii="Times New Roman" w:eastAsia="Times New Roman" w:hAnsi="Times New Roman" w:cs="Times New Roman"/>
+          <w:sz w:val="24"/>
+          <w:szCs w:val="24"/>
+        </w:rPr>
+        <w:t>FARMACOLÓGICOS</w:t>
+      </w:r>
+      <w:r>
+        <w:rPr>
+          <w:rFonts w:ascii="Times New Roman" w:eastAsia="Times New Roman" w:hAnsi="Times New Roman" w:cs="Times New Roman"/>
+          <w:sz w:val="24"/>
+          <w:szCs w:val="24"/>
+        </w:rPr>
+        <w:t xml:space="preserve"> </w:t>
+      </w:r>
+      <w:r>
+        <w:rPr>
+          <w:rFonts w:ascii="Times New Roman" w:eastAsia="Times New Roman" w:hAnsi="Times New Roman" w:cs="Times New Roman"/>
+          <w:sz w:val="24"/>
+          <w:szCs w:val="24"/>
+          <w:highlight w:val="yellow"/>
+        </w:rPr>
+        <w:t>{{</w:t>
+      </w:r>
+      <w:proofErr w:type="spellStart"/>
+      <w:r>
+        <w:rPr>
+          <w:rFonts w:ascii="Times New Roman" w:eastAsia="Times New Roman" w:hAnsi="Times New Roman" w:cs="Times New Roman"/>
+          <w:sz w:val="24"/>
+          <w:szCs w:val="24"/>
+          <w:highlight w:val="yellow"/>
+        </w:rPr>
+        <w:t>Liqui</w:t>
+      </w:r>
+      <w:r>
+        <w:rPr>
+          <w:rFonts w:ascii="Times New Roman" w:eastAsia="Times New Roman" w:hAnsi="Times New Roman" w:cs="Times New Roman"/>
+          <w:sz w:val="24"/>
+          <w:szCs w:val="24"/>
+          <w:highlight w:val="yellow"/>
+        </w:rPr>
+        <w:t>GastosMedicos</w:t>
+      </w:r>
+      <w:r>
+        <w:rPr>
+          <w:rFonts w:ascii="Times New Roman" w:eastAsia="Times New Roman" w:hAnsi="Times New Roman" w:cs="Times New Roman"/>
+          <w:sz w:val="24"/>
+          <w:szCs w:val="24"/>
+          <w:highlight w:val="yellow"/>
+        </w:rPr>
+        <w:t>Num</w:t>
+      </w:r>
+      <w:proofErr w:type="spellEnd"/>
+      <w:r>
+        <w:rPr>
+          <w:rFonts w:ascii="Times New Roman" w:eastAsia="Times New Roman" w:hAnsi="Times New Roman" w:cs="Times New Roman"/>
+          <w:sz w:val="24"/>
+          <w:szCs w:val="24"/>
+          <w:highlight w:val="yellow"/>
+        </w:rPr>
+        <w:t>}}</w:t>
+      </w:r>
+    </w:p>
+    <w:p>
+      <w:pPr>
+        <w:spacing w:after="0" w:line="360" w:lineRule="auto"/>
+        <w:jc w:val="both"/>
+        <w:rPr>
+          <w:rFonts w:ascii="Times New Roman" w:eastAsia="Times New Roman" w:hAnsi="Times New Roman" w:cs="Times New Roman"/>
+          <w:b/>
+          <w:bCs/>
+          <w:sz w:val="24"/>
+          <w:szCs w:val="24"/>
+          <w:highlight w:val="yellow"/>
+        </w:rPr>
+      </w:pPr>
+    </w:p>
+    <w:p>
+      <w:pPr>
+        <w:spacing w:after="0" w:line="360" w:lineRule="auto"/>
+        <w:jc w:val="both"/>
+        <w:rPr>
+          <w:rFonts w:ascii="Times New Roman" w:eastAsia="Times New Roman" w:hAnsi="Times New Roman" w:cs="Times New Roman"/>
+          <w:b/>
+          <w:bCs/>
+          <w:sz w:val="24"/>
+          <w:szCs w:val="24"/>
+          <w:highlight w:val="yellow"/>
+        </w:rPr>
+      </w:pPr>
+      <w:r>
         <w:rPr>
           <w:rFonts w:ascii="Times New Roman" w:eastAsia="Times New Roman" w:hAnsi="Times New Roman" w:cs="Times New Roman"/>
           <w:b/>
@@ -6137,1232 +7416,6 @@
           <w:szCs w:val="24"/>
           <w:u w:val="single"/>
         </w:rPr>
-      </w:pPr>
-      <w:r>
-        <w:rPr>
-          <w:rFonts w:ascii="Times New Roman" w:eastAsia="Times New Roman" w:hAnsi="Times New Roman" w:cs="Times New Roman"/>
-          <w:b/>
-          <w:bCs/>
-          <w:sz w:val="24"/>
-          <w:szCs w:val="24"/>
-          <w:u w:val="single"/>
-        </w:rPr>
-        <w:t xml:space="preserve">5. TRATAMIENTO PSICOFARMACOLÓGICO FUTURO. </w:t>
-      </w:r>
-    </w:p>
-    <w:p>
-      <w:pPr>
-        <w:spacing w:after="0" w:line="360" w:lineRule="auto"/>
-        <w:ind w:firstLine="720"/>
-        <w:jc w:val="both"/>
-        <w:rPr>
-          <w:rFonts w:ascii="Times New Roman" w:eastAsia="Times New Roman" w:hAnsi="Times New Roman" w:cs="Times New Roman"/>
-          <w:sz w:val="24"/>
-          <w:szCs w:val="24"/>
-        </w:rPr>
-      </w:pPr>
-      <w:r>
-        <w:rPr>
-          <w:rFonts w:ascii="Times New Roman" w:eastAsia="Times New Roman" w:hAnsi="Times New Roman" w:cs="Times New Roman"/>
-          <w:sz w:val="24"/>
-          <w:szCs w:val="24"/>
-        </w:rPr>
-        <w:t xml:space="preserve">Como fuera mencionado ut supra, ha sido aconsejado la actora, para paliar las secuelas conflictivas del evento dañoso, una terapia dirigida o breve, tendiente a neutralizar los disturbios mentales que padece, los cuales tienen una raíz específica desde el accidente. Concretamente le ha sido recomendada la realización de un tratamiento psicológico, con dos sesiones semanales por el lapso aproximado de </w:t>
-      </w:r>
-      <w:proofErr w:type="gramStart"/>
-      <w:r>
-        <w:rPr>
-          <w:rFonts w:ascii="Times New Roman" w:eastAsia="Times New Roman" w:hAnsi="Times New Roman" w:cs="Times New Roman"/>
-          <w:sz w:val="24"/>
-          <w:szCs w:val="24"/>
-        </w:rPr>
-        <w:t>dos  años</w:t>
-      </w:r>
-      <w:proofErr w:type="gramEnd"/>
-      <w:r>
-        <w:rPr>
-          <w:rFonts w:ascii="Times New Roman" w:eastAsia="Times New Roman" w:hAnsi="Times New Roman" w:cs="Times New Roman"/>
-          <w:sz w:val="24"/>
-          <w:szCs w:val="24"/>
-        </w:rPr>
-        <w:t>, lo cual se encuentra supeditado a su estado psicofísico actual y futuro.</w:t>
-      </w:r>
-    </w:p>
-    <w:p>
-      <w:pPr>
-        <w:spacing w:after="0" w:line="360" w:lineRule="auto"/>
-        <w:ind w:firstLine="720"/>
-        <w:jc w:val="both"/>
-        <w:rPr>
-          <w:rFonts w:ascii="Times New Roman" w:eastAsia="Times New Roman" w:hAnsi="Times New Roman" w:cs="Times New Roman"/>
-          <w:sz w:val="24"/>
-          <w:szCs w:val="24"/>
-        </w:rPr>
-      </w:pPr>
-      <w:r>
-        <w:rPr>
-          <w:rFonts w:ascii="Times New Roman" w:eastAsia="Times New Roman" w:hAnsi="Times New Roman" w:cs="Times New Roman"/>
-          <w:sz w:val="24"/>
-          <w:szCs w:val="24"/>
-        </w:rPr>
-        <w:t>En este caso, el requisito de certidumbre solicitado para hacer lugar al presente reclamo es claro, ya que se trata de consecuencias del hecho ilícito que aparecen como una prolongación previsible e inevitable del daño padecido. La jurisprudencia establece al respecto que “comprobada la responsabilidad del demandado en el acaecimiento del ilícito, forzoso es concluir en su deber de cargar con las erogaciones de una terapia psicológica que, al menos, contribuya a sobrellevar las secuelas conflictivas sobrevinientes y que sean consecuencia directa del evento” (</w:t>
-      </w:r>
-      <w:proofErr w:type="spellStart"/>
-      <w:r>
-        <w:rPr>
-          <w:rFonts w:ascii="Times New Roman" w:eastAsia="Times New Roman" w:hAnsi="Times New Roman" w:cs="Times New Roman"/>
-          <w:sz w:val="24"/>
-          <w:szCs w:val="24"/>
-        </w:rPr>
-        <w:t>CNCiv</w:t>
-      </w:r>
-      <w:proofErr w:type="spellEnd"/>
-      <w:r>
-        <w:rPr>
-          <w:rFonts w:ascii="Times New Roman" w:eastAsia="Times New Roman" w:hAnsi="Times New Roman" w:cs="Times New Roman"/>
-          <w:sz w:val="24"/>
-          <w:szCs w:val="24"/>
-        </w:rPr>
-        <w:t xml:space="preserve">., Sala A, 19/06/97, “Leiva, Natividad c/ </w:t>
-      </w:r>
-      <w:proofErr w:type="spellStart"/>
-      <w:r>
-        <w:rPr>
-          <w:rFonts w:ascii="Times New Roman" w:eastAsia="Times New Roman" w:hAnsi="Times New Roman" w:cs="Times New Roman"/>
-          <w:sz w:val="24"/>
-          <w:szCs w:val="24"/>
-        </w:rPr>
-        <w:t>Petrola</w:t>
-      </w:r>
-      <w:proofErr w:type="spellEnd"/>
-      <w:r>
-        <w:rPr>
-          <w:rFonts w:ascii="Times New Roman" w:eastAsia="Times New Roman" w:hAnsi="Times New Roman" w:cs="Times New Roman"/>
-          <w:sz w:val="24"/>
-          <w:szCs w:val="24"/>
-        </w:rPr>
-        <w:t xml:space="preserve">, Raúl R. s/ daños y perjuicios”). “Respecto al costo de una psicoterapia solicitada por la actora, sea que las lesiones de carácter </w:t>
-      </w:r>
-      <w:proofErr w:type="gramStart"/>
-      <w:r>
-        <w:rPr>
-          <w:rFonts w:ascii="Times New Roman" w:eastAsia="Times New Roman" w:hAnsi="Times New Roman" w:cs="Times New Roman"/>
-          <w:sz w:val="24"/>
-          <w:szCs w:val="24"/>
-        </w:rPr>
-        <w:t>psicológico,</w:t>
-      </w:r>
-      <w:proofErr w:type="gramEnd"/>
-      <w:r>
-        <w:rPr>
-          <w:rFonts w:ascii="Times New Roman" w:eastAsia="Times New Roman" w:hAnsi="Times New Roman" w:cs="Times New Roman"/>
-          <w:sz w:val="24"/>
-          <w:szCs w:val="24"/>
-        </w:rPr>
-        <w:t xml:space="preserve"> puedan superarse o no, corresponde resarcir lo que fuere necesario para el tratamiento, al menos con el propósito de evitar el empeoramiento; ello pese a que falte precisión en el dictamen acerca del costo de las sesiones” (</w:t>
-      </w:r>
-      <w:proofErr w:type="spellStart"/>
-      <w:r>
-        <w:rPr>
-          <w:rFonts w:ascii="Times New Roman" w:eastAsia="Times New Roman" w:hAnsi="Times New Roman" w:cs="Times New Roman"/>
-          <w:sz w:val="24"/>
-          <w:szCs w:val="24"/>
-        </w:rPr>
-        <w:t>CNCiv</w:t>
-      </w:r>
-      <w:proofErr w:type="spellEnd"/>
-      <w:r>
-        <w:rPr>
-          <w:rFonts w:ascii="Times New Roman" w:eastAsia="Times New Roman" w:hAnsi="Times New Roman" w:cs="Times New Roman"/>
-          <w:sz w:val="24"/>
-          <w:szCs w:val="24"/>
-        </w:rPr>
-        <w:t>, Sala B, 12/07/96, “Arroyo, Jorge E c/ Reyes, Arandu s/ daños y perjuicios”).</w:t>
-      </w:r>
-    </w:p>
-    <w:p>
-      <w:pPr>
-        <w:spacing w:after="0" w:line="360" w:lineRule="auto"/>
-        <w:ind w:firstLine="720"/>
-        <w:jc w:val="both"/>
-        <w:rPr>
-          <w:rFonts w:ascii="Times New Roman" w:eastAsia="Times New Roman" w:hAnsi="Times New Roman" w:cs="Times New Roman"/>
-          <w:sz w:val="24"/>
-          <w:szCs w:val="24"/>
-        </w:rPr>
-      </w:pPr>
-      <w:r>
-        <w:rPr>
-          <w:rFonts w:ascii="Times New Roman" w:eastAsia="Times New Roman" w:hAnsi="Times New Roman" w:cs="Times New Roman"/>
-          <w:sz w:val="24"/>
-          <w:szCs w:val="24"/>
-        </w:rPr>
-        <w:t xml:space="preserve">Por lo expuesto reclamo por este rubro la suma de </w:t>
-      </w:r>
-      <w:r>
-        <w:rPr>
-          <w:rFonts w:ascii="Times New Roman" w:eastAsia="Times New Roman" w:hAnsi="Times New Roman" w:cs="Times New Roman"/>
-          <w:sz w:val="24"/>
-          <w:szCs w:val="24"/>
-          <w:highlight w:val="yellow"/>
-        </w:rPr>
-        <w:t>{{</w:t>
-      </w:r>
-      <w:proofErr w:type="spellStart"/>
-      <w:r>
-        <w:rPr>
-          <w:rFonts w:ascii="Times New Roman" w:eastAsia="Times New Roman" w:hAnsi="Times New Roman" w:cs="Times New Roman"/>
-          <w:sz w:val="24"/>
-          <w:szCs w:val="24"/>
-          <w:highlight w:val="yellow"/>
-        </w:rPr>
-        <w:t>LiquiGastosFarmaciaLetras</w:t>
-      </w:r>
-      <w:proofErr w:type="spellEnd"/>
-      <w:r>
-        <w:rPr>
-          <w:rFonts w:ascii="Times New Roman" w:eastAsia="Times New Roman" w:hAnsi="Times New Roman" w:cs="Times New Roman"/>
-          <w:sz w:val="24"/>
-          <w:szCs w:val="24"/>
-          <w:highlight w:val="yellow"/>
-        </w:rPr>
-        <w:t>}}</w:t>
-      </w:r>
-      <w:r>
-        <w:rPr>
-          <w:rFonts w:ascii="Times New Roman" w:eastAsia="Times New Roman" w:hAnsi="Times New Roman" w:cs="Times New Roman"/>
-          <w:sz w:val="24"/>
-          <w:szCs w:val="24"/>
-        </w:rPr>
-        <w:t xml:space="preserve"> (</w:t>
-      </w:r>
-      <w:r>
-        <w:rPr>
-          <w:rFonts w:ascii="Times New Roman" w:eastAsia="Times New Roman" w:hAnsi="Times New Roman" w:cs="Times New Roman"/>
-          <w:sz w:val="24"/>
-          <w:szCs w:val="24"/>
-          <w:highlight w:val="yellow"/>
-        </w:rPr>
-        <w:t>{{</w:t>
-      </w:r>
-      <w:proofErr w:type="spellStart"/>
-      <w:r>
-        <w:rPr>
-          <w:rFonts w:ascii="Times New Roman" w:eastAsia="Times New Roman" w:hAnsi="Times New Roman" w:cs="Times New Roman"/>
-          <w:sz w:val="24"/>
-          <w:szCs w:val="24"/>
-          <w:highlight w:val="yellow"/>
-        </w:rPr>
-        <w:t>LiquiGastosFarmaciaNum</w:t>
-      </w:r>
-      <w:proofErr w:type="spellEnd"/>
-      <w:r>
-        <w:rPr>
-          <w:rFonts w:ascii="Times New Roman" w:eastAsia="Times New Roman" w:hAnsi="Times New Roman" w:cs="Times New Roman"/>
-          <w:sz w:val="24"/>
-          <w:szCs w:val="24"/>
-          <w:highlight w:val="yellow"/>
-        </w:rPr>
-        <w:t>}</w:t>
-      </w:r>
-      <w:proofErr w:type="gramStart"/>
-      <w:r>
-        <w:rPr>
-          <w:rFonts w:ascii="Times New Roman" w:eastAsia="Times New Roman" w:hAnsi="Times New Roman" w:cs="Times New Roman"/>
-          <w:sz w:val="24"/>
-          <w:szCs w:val="24"/>
-          <w:highlight w:val="yellow"/>
-        </w:rPr>
-        <w:t>}</w:t>
-      </w:r>
-      <w:r>
-        <w:rPr>
-          <w:rFonts w:ascii="Times New Roman" w:eastAsia="Times New Roman" w:hAnsi="Times New Roman" w:cs="Times New Roman"/>
-          <w:sz w:val="24"/>
-          <w:szCs w:val="24"/>
-        </w:rPr>
-        <w:t>)</w:t>
-      </w:r>
-      <w:r>
-        <w:rPr>
-          <w:rFonts w:ascii="Times New Roman" w:eastAsia="Times New Roman" w:hAnsi="Times New Roman" w:cs="Times New Roman"/>
-          <w:b/>
-          <w:bCs/>
-          <w:sz w:val="24"/>
-          <w:szCs w:val="24"/>
-        </w:rPr>
-        <w:t xml:space="preserve">  </w:t>
-      </w:r>
-      <w:r>
-        <w:rPr>
-          <w:rFonts w:ascii="Times New Roman" w:eastAsia="Times New Roman" w:hAnsi="Times New Roman" w:cs="Times New Roman"/>
-          <w:sz w:val="24"/>
-          <w:szCs w:val="24"/>
-        </w:rPr>
-        <w:t>o</w:t>
-      </w:r>
-      <w:proofErr w:type="gramEnd"/>
-      <w:r>
-        <w:rPr>
-          <w:rFonts w:ascii="Times New Roman" w:eastAsia="Times New Roman" w:hAnsi="Times New Roman" w:cs="Times New Roman"/>
-          <w:sz w:val="24"/>
-          <w:szCs w:val="24"/>
-        </w:rPr>
-        <w:t xml:space="preserve"> lo que en más o en menos resulte de las probanzas de autos.</w:t>
-      </w:r>
-    </w:p>
-    <w:p>
-      <w:pPr>
-        <w:spacing w:after="0" w:line="360" w:lineRule="auto"/>
-        <w:jc w:val="both"/>
-        <w:rPr>
-          <w:rFonts w:ascii="Times New Roman" w:eastAsia="Times New Roman" w:hAnsi="Times New Roman" w:cs="Times New Roman"/>
-          <w:sz w:val="24"/>
-          <w:szCs w:val="24"/>
-          <w:highlight w:val="yellow"/>
-        </w:rPr>
-      </w:pPr>
-    </w:p>
-    <w:p>
-      <w:pPr>
-        <w:spacing w:after="0" w:line="360" w:lineRule="auto"/>
-        <w:jc w:val="both"/>
-        <w:rPr>
-          <w:rFonts w:ascii="Times New Roman" w:eastAsia="Times New Roman" w:hAnsi="Times New Roman" w:cs="Times New Roman"/>
-          <w:b/>
-          <w:bCs/>
-          <w:sz w:val="24"/>
-          <w:szCs w:val="24"/>
-          <w:u w:val="single"/>
-        </w:rPr>
-      </w:pPr>
-      <w:r>
-        <w:rPr>
-          <w:rFonts w:ascii="Times New Roman" w:eastAsia="Times New Roman" w:hAnsi="Times New Roman" w:cs="Times New Roman"/>
-          <w:b/>
-          <w:bCs/>
-          <w:sz w:val="24"/>
-          <w:szCs w:val="24"/>
-          <w:u w:val="single"/>
-        </w:rPr>
-        <w:t>6. ASISTENCIA MÉDICA - GASTOS FARMACOLÓGICOS</w:t>
-      </w:r>
-    </w:p>
-    <w:p>
-      <w:pPr>
-        <w:spacing w:after="0" w:line="360" w:lineRule="auto"/>
-        <w:ind w:firstLine="720"/>
-        <w:jc w:val="both"/>
-        <w:rPr>
-          <w:rFonts w:ascii="Times New Roman" w:eastAsia="Times New Roman" w:hAnsi="Times New Roman" w:cs="Times New Roman"/>
-          <w:sz w:val="24"/>
-          <w:szCs w:val="24"/>
-        </w:rPr>
-      </w:pPr>
-      <w:r>
-        <w:rPr>
-          <w:rFonts w:ascii="Times New Roman" w:eastAsia="Times New Roman" w:hAnsi="Times New Roman" w:cs="Times New Roman"/>
-          <w:sz w:val="24"/>
-          <w:szCs w:val="24"/>
-        </w:rPr>
-        <w:t xml:space="preserve">La atención médica </w:t>
-      </w:r>
-      <w:proofErr w:type="spellStart"/>
-      <w:r>
-        <w:rPr>
-          <w:rFonts w:ascii="Times New Roman" w:eastAsia="Times New Roman" w:hAnsi="Times New Roman" w:cs="Times New Roman"/>
-          <w:sz w:val="24"/>
-          <w:szCs w:val="24"/>
-        </w:rPr>
-        <w:t>querecibio</w:t>
-      </w:r>
-      <w:proofErr w:type="spellEnd"/>
-      <w:r>
-        <w:rPr>
-          <w:rFonts w:ascii="Times New Roman" w:eastAsia="Times New Roman" w:hAnsi="Times New Roman" w:cs="Times New Roman"/>
-          <w:sz w:val="24"/>
-          <w:szCs w:val="24"/>
-        </w:rPr>
-        <w:t xml:space="preserve"> se </w:t>
-      </w:r>
-      <w:proofErr w:type="gramStart"/>
-      <w:r>
-        <w:rPr>
-          <w:rFonts w:ascii="Times New Roman" w:eastAsia="Times New Roman" w:hAnsi="Times New Roman" w:cs="Times New Roman"/>
-          <w:sz w:val="24"/>
-          <w:szCs w:val="24"/>
-        </w:rPr>
-        <w:t>realizó  en</w:t>
-      </w:r>
-      <w:proofErr w:type="gramEnd"/>
-      <w:r>
-        <w:rPr>
-          <w:rFonts w:ascii="Times New Roman" w:eastAsia="Times New Roman" w:hAnsi="Times New Roman" w:cs="Times New Roman"/>
-          <w:sz w:val="24"/>
-          <w:szCs w:val="24"/>
-        </w:rPr>
-        <w:t xml:space="preserve"> el centro mencionado, debiendo luego de la consulta continuar con tratamiento ambulatorio hasta la actualidad. Se generaron </w:t>
-      </w:r>
-      <w:r>
-        <w:rPr>
-          <w:rFonts w:ascii="Times New Roman" w:eastAsia="Times New Roman" w:hAnsi="Times New Roman" w:cs="Times New Roman"/>
-          <w:sz w:val="24"/>
-          <w:szCs w:val="24"/>
-        </w:rPr>
-        <w:lastRenderedPageBreak/>
-        <w:t xml:space="preserve">considerables gastos (tomografías, medicamentos, calmantes, analgésicos, antibióticos, radiografías, psicofármacos, estudios, inyectables, antiinflamatorios) los cuales fueron solventados con la ayuda de familiares y amigos. </w:t>
-      </w:r>
-    </w:p>
-    <w:p>
-      <w:pPr>
-        <w:spacing w:after="0" w:line="360" w:lineRule="auto"/>
-        <w:ind w:firstLine="720"/>
-        <w:jc w:val="both"/>
-        <w:rPr>
-          <w:rFonts w:ascii="Times New Roman" w:eastAsia="Times New Roman" w:hAnsi="Times New Roman" w:cs="Times New Roman"/>
-          <w:sz w:val="24"/>
-          <w:szCs w:val="24"/>
-        </w:rPr>
-      </w:pPr>
-      <w:r>
-        <w:rPr>
-          <w:rFonts w:ascii="Times New Roman" w:eastAsia="Times New Roman" w:hAnsi="Times New Roman" w:cs="Times New Roman"/>
-          <w:sz w:val="24"/>
-          <w:szCs w:val="24"/>
-        </w:rPr>
-        <w:t>Conforme al art. 68 de la Ley Nacional de Tránsito, establece que: “...Los gastos de sanatorio o velatorio de terceros, serán abonados de inmediato por el asegurador, sin perjuicio de los derechos que se pueden hacer valer luego...”</w:t>
-      </w:r>
-    </w:p>
-    <w:p>
-      <w:pPr>
-        <w:spacing w:after="0" w:line="360" w:lineRule="auto"/>
-        <w:ind w:firstLine="720"/>
-        <w:jc w:val="both"/>
-        <w:rPr>
-          <w:rFonts w:ascii="Times New Roman" w:eastAsia="Times New Roman" w:hAnsi="Times New Roman" w:cs="Times New Roman"/>
-          <w:sz w:val="24"/>
-          <w:szCs w:val="24"/>
-        </w:rPr>
-      </w:pPr>
-      <w:r>
-        <w:rPr>
-          <w:rFonts w:ascii="Times New Roman" w:eastAsia="Times New Roman" w:hAnsi="Times New Roman" w:cs="Times New Roman"/>
-          <w:sz w:val="24"/>
-          <w:szCs w:val="24"/>
-        </w:rPr>
-        <w:t xml:space="preserve">Es pacífica la jurisprudencia en conceder este rubro y se ha resuelto </w:t>
-      </w:r>
-      <w:proofErr w:type="gramStart"/>
-      <w:r>
-        <w:rPr>
-          <w:rFonts w:ascii="Times New Roman" w:eastAsia="Times New Roman" w:hAnsi="Times New Roman" w:cs="Times New Roman"/>
-          <w:sz w:val="24"/>
-          <w:szCs w:val="24"/>
-        </w:rPr>
-        <w:t>que</w:t>
-      </w:r>
-      <w:proofErr w:type="gramEnd"/>
-      <w:r>
-        <w:rPr>
-          <w:rFonts w:ascii="Times New Roman" w:eastAsia="Times New Roman" w:hAnsi="Times New Roman" w:cs="Times New Roman"/>
-          <w:sz w:val="24"/>
-          <w:szCs w:val="24"/>
-        </w:rPr>
-        <w:t xml:space="preserve"> probado el daño, este rubro procede sin necesidad de la prueba concreta y acabada. En efecto, en este sentido se manifiesta que: “Resulta procedente indemnizar los gastos médicos producidos como consecuencia del accidente, </w:t>
-      </w:r>
-      <w:proofErr w:type="spellStart"/>
-      <w:r>
-        <w:rPr>
-          <w:rFonts w:ascii="Times New Roman" w:eastAsia="Times New Roman" w:hAnsi="Times New Roman" w:cs="Times New Roman"/>
-          <w:sz w:val="24"/>
-          <w:szCs w:val="24"/>
-        </w:rPr>
-        <w:t>aún</w:t>
-      </w:r>
-      <w:proofErr w:type="spellEnd"/>
-      <w:r>
-        <w:rPr>
-          <w:rFonts w:ascii="Times New Roman" w:eastAsia="Times New Roman" w:hAnsi="Times New Roman" w:cs="Times New Roman"/>
-          <w:sz w:val="24"/>
-          <w:szCs w:val="24"/>
-        </w:rPr>
-        <w:t xml:space="preserve"> cuando no exista prueba documental, ya que la asistencia hospitalaria provoca una serie de desembolso de no fácil acreditación...” (Conf. Cam. </w:t>
-      </w:r>
-      <w:proofErr w:type="spellStart"/>
-      <w:r>
-        <w:rPr>
-          <w:rFonts w:ascii="Times New Roman" w:eastAsia="Times New Roman" w:hAnsi="Times New Roman" w:cs="Times New Roman"/>
-          <w:sz w:val="24"/>
-          <w:szCs w:val="24"/>
-        </w:rPr>
-        <w:t>Civ</w:t>
-      </w:r>
-      <w:proofErr w:type="spellEnd"/>
-      <w:r>
-        <w:rPr>
-          <w:rFonts w:ascii="Times New Roman" w:eastAsia="Times New Roman" w:hAnsi="Times New Roman" w:cs="Times New Roman"/>
-          <w:sz w:val="24"/>
-          <w:szCs w:val="24"/>
-        </w:rPr>
-        <w:t xml:space="preserve">. y Com. Fed. Sala II, marzo 24 de 1981). A su vez se establece que: “cuando se han acreditado lesiones, deben presumirse erogaciones por gastos médicos, y farmacéuticos, aun cuando hayan intervenido establecimientos asistenciales hospitalarios y no se encuentren documentado su importe, pues es evidente que existen gastos que debe soportar el accidentado, además el art 1086 del CC establece que la indemnización comprenderá el pago de todos los gastos de curación y convalecencia del ofendido” (Sala II, Cam. </w:t>
-      </w:r>
-      <w:proofErr w:type="spellStart"/>
-      <w:r>
-        <w:rPr>
-          <w:rFonts w:ascii="Times New Roman" w:eastAsia="Times New Roman" w:hAnsi="Times New Roman" w:cs="Times New Roman"/>
-          <w:sz w:val="24"/>
-          <w:szCs w:val="24"/>
-        </w:rPr>
-        <w:t>Civ</w:t>
-      </w:r>
-      <w:proofErr w:type="spellEnd"/>
-      <w:r>
-        <w:rPr>
-          <w:rFonts w:ascii="Times New Roman" w:eastAsia="Times New Roman" w:hAnsi="Times New Roman" w:cs="Times New Roman"/>
-          <w:sz w:val="24"/>
-          <w:szCs w:val="24"/>
-        </w:rPr>
-        <w:t xml:space="preserve">. Y Com. Morón, CC002 MORSD- 7-93 s 4-2-93, “Caceres </w:t>
-      </w:r>
-      <w:proofErr w:type="spellStart"/>
-      <w:r>
-        <w:rPr>
-          <w:rFonts w:ascii="Times New Roman" w:eastAsia="Times New Roman" w:hAnsi="Times New Roman" w:cs="Times New Roman"/>
-          <w:sz w:val="24"/>
-          <w:szCs w:val="24"/>
-        </w:rPr>
-        <w:t>Perez</w:t>
-      </w:r>
-      <w:proofErr w:type="spellEnd"/>
-      <w:r>
-        <w:rPr>
-          <w:rFonts w:ascii="Times New Roman" w:eastAsia="Times New Roman" w:hAnsi="Times New Roman" w:cs="Times New Roman"/>
-          <w:sz w:val="24"/>
-          <w:szCs w:val="24"/>
-        </w:rPr>
-        <w:t xml:space="preserve"> Alma C/ Morais </w:t>
-      </w:r>
-      <w:proofErr w:type="spellStart"/>
-      <w:r>
-        <w:rPr>
-          <w:rFonts w:ascii="Times New Roman" w:eastAsia="Times New Roman" w:hAnsi="Times New Roman" w:cs="Times New Roman"/>
-          <w:sz w:val="24"/>
-          <w:szCs w:val="24"/>
-        </w:rPr>
-        <w:t>Maria</w:t>
-      </w:r>
-      <w:proofErr w:type="spellEnd"/>
-      <w:r>
-        <w:rPr>
-          <w:rFonts w:ascii="Times New Roman" w:eastAsia="Times New Roman" w:hAnsi="Times New Roman" w:cs="Times New Roman"/>
-          <w:sz w:val="24"/>
-          <w:szCs w:val="24"/>
-        </w:rPr>
-        <w:t xml:space="preserve"> Elena S/ Daños y Perjuicios).</w:t>
-      </w:r>
-    </w:p>
-    <w:p>
-      <w:pPr>
-        <w:spacing w:after="0" w:line="360" w:lineRule="auto"/>
-        <w:ind w:firstLine="720"/>
-        <w:jc w:val="both"/>
-        <w:rPr>
-          <w:rFonts w:ascii="Times New Roman" w:eastAsia="Times New Roman" w:hAnsi="Times New Roman" w:cs="Times New Roman"/>
-          <w:sz w:val="24"/>
-          <w:szCs w:val="24"/>
-        </w:rPr>
-      </w:pPr>
-      <w:r>
-        <w:rPr>
-          <w:rFonts w:ascii="Times New Roman" w:eastAsia="Times New Roman" w:hAnsi="Times New Roman" w:cs="Times New Roman"/>
-          <w:sz w:val="24"/>
-          <w:szCs w:val="24"/>
-        </w:rPr>
-        <w:t>Todas las erogaciones realizadas con la finalidad de recuperar el estado del lesionado, anterior a las lesiones sufridas, entran en el concepto de gastos de curación y convalecencia (</w:t>
-      </w:r>
-      <w:proofErr w:type="spellStart"/>
-      <w:r>
-        <w:rPr>
-          <w:rFonts w:ascii="Times New Roman" w:eastAsia="Times New Roman" w:hAnsi="Times New Roman" w:cs="Times New Roman"/>
-          <w:sz w:val="24"/>
-          <w:szCs w:val="24"/>
-        </w:rPr>
-        <w:t>CNCiv</w:t>
-      </w:r>
-      <w:proofErr w:type="spellEnd"/>
-      <w:r>
-        <w:rPr>
-          <w:rFonts w:ascii="Times New Roman" w:eastAsia="Times New Roman" w:hAnsi="Times New Roman" w:cs="Times New Roman"/>
-          <w:sz w:val="24"/>
-          <w:szCs w:val="24"/>
-        </w:rPr>
-        <w:t>. Sala A, 29-3-95, Saavedra, Dora y otro c/ Lorenzo s/ Daños y perjuicios).</w:t>
-      </w:r>
-    </w:p>
-    <w:p>
-      <w:pPr>
-        <w:spacing w:after="0" w:line="360" w:lineRule="auto"/>
-        <w:ind w:firstLine="720"/>
-        <w:jc w:val="both"/>
-        <w:rPr>
-          <w:rFonts w:ascii="Times New Roman" w:eastAsia="Times New Roman" w:hAnsi="Times New Roman" w:cs="Times New Roman"/>
-          <w:sz w:val="24"/>
-          <w:szCs w:val="24"/>
-        </w:rPr>
-      </w:pPr>
-      <w:r>
-        <w:rPr>
-          <w:rFonts w:ascii="Times New Roman" w:eastAsia="Times New Roman" w:hAnsi="Times New Roman" w:cs="Times New Roman"/>
-          <w:sz w:val="24"/>
-          <w:szCs w:val="24"/>
-        </w:rPr>
-        <w:t>Por lo expuesto, estimo en este rubro la suma de </w:t>
-      </w:r>
-      <w:r>
-        <w:rPr>
-          <w:rFonts w:ascii="Times New Roman" w:eastAsia="Times New Roman" w:hAnsi="Times New Roman" w:cs="Times New Roman"/>
-          <w:b/>
-          <w:bCs/>
-          <w:sz w:val="24"/>
-          <w:szCs w:val="24"/>
-          <w:highlight w:val="yellow"/>
-        </w:rPr>
-        <w:t>{{</w:t>
-      </w:r>
-      <w:proofErr w:type="spellStart"/>
-      <w:r>
-        <w:rPr>
-          <w:rFonts w:ascii="Times New Roman" w:eastAsia="Times New Roman" w:hAnsi="Times New Roman" w:cs="Times New Roman"/>
-          <w:sz w:val="24"/>
-          <w:szCs w:val="24"/>
-          <w:highlight w:val="yellow"/>
-        </w:rPr>
-        <w:t>LiquiGastosMedicosLetras</w:t>
-      </w:r>
-      <w:proofErr w:type="spellEnd"/>
-      <w:r>
-        <w:rPr>
-          <w:rFonts w:ascii="Times New Roman" w:eastAsia="Times New Roman" w:hAnsi="Times New Roman" w:cs="Times New Roman"/>
-          <w:sz w:val="24"/>
-          <w:szCs w:val="24"/>
-          <w:highlight w:val="yellow"/>
-        </w:rPr>
-        <w:t>}}</w:t>
-      </w:r>
-      <w:r>
-        <w:rPr>
-          <w:rFonts w:ascii="Times New Roman" w:eastAsia="Times New Roman" w:hAnsi="Times New Roman" w:cs="Times New Roman"/>
-          <w:b/>
-          <w:bCs/>
-          <w:sz w:val="24"/>
-          <w:szCs w:val="24"/>
-        </w:rPr>
-        <w:t xml:space="preserve"> (</w:t>
-      </w:r>
-      <w:r>
-        <w:rPr>
-          <w:rFonts w:ascii="Times New Roman" w:eastAsia="Times New Roman" w:hAnsi="Times New Roman" w:cs="Times New Roman"/>
-          <w:b/>
-          <w:bCs/>
-          <w:sz w:val="24"/>
-          <w:szCs w:val="24"/>
-          <w:highlight w:val="yellow"/>
-        </w:rPr>
-        <w:t>{{</w:t>
-      </w:r>
-      <w:proofErr w:type="spellStart"/>
-      <w:r>
-        <w:rPr>
-          <w:rFonts w:ascii="Times New Roman" w:eastAsia="Times New Roman" w:hAnsi="Times New Roman" w:cs="Times New Roman"/>
-          <w:sz w:val="24"/>
-          <w:szCs w:val="24"/>
-          <w:highlight w:val="yellow"/>
-        </w:rPr>
-        <w:t>LiquiGastosMedicos</w:t>
-      </w:r>
-      <w:r>
-        <w:rPr>
-          <w:rFonts w:ascii="Times New Roman" w:eastAsia="Times New Roman" w:hAnsi="Times New Roman" w:cs="Times New Roman"/>
-          <w:sz w:val="24"/>
-          <w:szCs w:val="24"/>
-          <w:highlight w:val="yellow"/>
-        </w:rPr>
-        <w:t>Num</w:t>
-      </w:r>
-      <w:proofErr w:type="spellEnd"/>
-      <w:r>
-        <w:rPr>
-          <w:rFonts w:ascii="Times New Roman" w:eastAsia="Times New Roman" w:hAnsi="Times New Roman" w:cs="Times New Roman"/>
-          <w:sz w:val="24"/>
-          <w:szCs w:val="24"/>
-          <w:highlight w:val="yellow"/>
-        </w:rPr>
-        <w:t>}}</w:t>
-      </w:r>
-      <w:r>
-        <w:rPr>
-          <w:rFonts w:ascii="Times New Roman" w:eastAsia="Times New Roman" w:hAnsi="Times New Roman" w:cs="Times New Roman"/>
-          <w:b/>
-          <w:bCs/>
-          <w:sz w:val="24"/>
-          <w:szCs w:val="24"/>
-        </w:rPr>
-        <w:t>)</w:t>
-      </w:r>
-      <w:r>
-        <w:rPr>
-          <w:rFonts w:ascii="Times New Roman" w:eastAsia="Times New Roman" w:hAnsi="Times New Roman" w:cs="Times New Roman"/>
-          <w:b/>
-          <w:bCs/>
-          <w:sz w:val="24"/>
-          <w:szCs w:val="24"/>
-        </w:rPr>
-        <w:t xml:space="preserve"> </w:t>
-      </w:r>
-      <w:r>
-        <w:rPr>
-          <w:rFonts w:ascii="Times New Roman" w:eastAsia="Times New Roman" w:hAnsi="Times New Roman" w:cs="Times New Roman"/>
-          <w:sz w:val="24"/>
-          <w:szCs w:val="24"/>
-        </w:rPr>
-        <w:t>por la asistencia médica y gastos farmacológicos del aquí actor.</w:t>
-      </w:r>
-    </w:p>
-    <w:p>
-      <w:pPr>
-        <w:spacing w:after="0" w:line="360" w:lineRule="auto"/>
-        <w:jc w:val="both"/>
-        <w:rPr>
-          <w:rFonts w:ascii="Times New Roman" w:eastAsia="Times New Roman" w:hAnsi="Times New Roman" w:cs="Times New Roman"/>
-          <w:sz w:val="24"/>
-          <w:szCs w:val="24"/>
-        </w:rPr>
-      </w:pPr>
-    </w:p>
-    <w:p>
-      <w:pPr>
-        <w:spacing w:after="0" w:line="360" w:lineRule="auto"/>
-        <w:jc w:val="both"/>
-        <w:rPr>
-          <w:rFonts w:ascii="Times New Roman" w:eastAsia="Times New Roman" w:hAnsi="Times New Roman" w:cs="Times New Roman"/>
-          <w:sz w:val="24"/>
-          <w:szCs w:val="24"/>
-          <w:highlight w:val="yellow"/>
-        </w:rPr>
-      </w:pPr>
-    </w:p>
-    <w:p>
-      <w:pPr>
-        <w:spacing w:after="0" w:line="360" w:lineRule="auto"/>
-        <w:jc w:val="both"/>
-        <w:rPr>
-          <w:rFonts w:ascii="Times New Roman" w:eastAsia="Times New Roman" w:hAnsi="Times New Roman" w:cs="Times New Roman"/>
-          <w:b/>
-          <w:bCs/>
-          <w:sz w:val="24"/>
-          <w:szCs w:val="24"/>
-          <w:u w:val="single"/>
-        </w:rPr>
-      </w:pPr>
-      <w:r>
-        <w:rPr>
-          <w:rFonts w:ascii="Times New Roman" w:eastAsia="Times New Roman" w:hAnsi="Times New Roman" w:cs="Times New Roman"/>
-          <w:b/>
-          <w:bCs/>
-          <w:sz w:val="24"/>
-          <w:szCs w:val="24"/>
-          <w:u w:val="single"/>
-        </w:rPr>
-        <w:t>VIII. LIQUIDACIÓN:</w:t>
-      </w:r>
-    </w:p>
-    <w:p>
-      <w:pPr>
-        <w:spacing w:after="0" w:line="360" w:lineRule="auto"/>
-        <w:ind w:firstLine="554"/>
-        <w:jc w:val="both"/>
-        <w:rPr>
-          <w:rFonts w:ascii="Times New Roman" w:eastAsia="Times New Roman" w:hAnsi="Times New Roman" w:cs="Times New Roman"/>
-          <w:sz w:val="24"/>
-          <w:szCs w:val="24"/>
-        </w:rPr>
-      </w:pPr>
-      <w:r>
-        <w:rPr>
-          <w:rFonts w:ascii="Times New Roman" w:eastAsia="Times New Roman" w:hAnsi="Times New Roman" w:cs="Times New Roman"/>
-          <w:sz w:val="24"/>
-          <w:szCs w:val="24"/>
-        </w:rPr>
-        <w:t>Se practica la siguiente liquidación, suma que se reclama debidamente actualizada, con más sus intereses desde la fecha del evento hasta la de su efectivo pago, o la que en más o en menos resulte de las probanzas a rendirse en autos:</w:t>
-      </w:r>
-    </w:p>
-    <w:p>
-      <w:pPr>
-        <w:spacing w:after="0" w:line="360" w:lineRule="auto"/>
-        <w:jc w:val="both"/>
-        <w:rPr>
-          <w:rFonts w:ascii="Times New Roman" w:eastAsia="Times New Roman" w:hAnsi="Times New Roman" w:cs="Times New Roman"/>
-          <w:sz w:val="24"/>
-          <w:szCs w:val="24"/>
-          <w:highlight w:val="yellow"/>
-        </w:rPr>
-      </w:pPr>
-    </w:p>
-    <w:p>
-      <w:pPr>
-        <w:spacing w:after="0" w:line="360" w:lineRule="auto"/>
-        <w:rPr>
-          <w:rFonts w:ascii="Times New Roman" w:eastAsia="Times New Roman" w:hAnsi="Times New Roman" w:cs="Times New Roman"/>
-          <w:sz w:val="24"/>
-          <w:szCs w:val="24"/>
-        </w:rPr>
-      </w:pPr>
-      <w:r>
-        <w:rPr>
-          <w:rFonts w:ascii="Times New Roman" w:eastAsia="Times New Roman" w:hAnsi="Times New Roman" w:cs="Times New Roman"/>
-          <w:sz w:val="24"/>
-          <w:szCs w:val="24"/>
-        </w:rPr>
-        <w:t>1. DAÑO MATERIAL …………</w:t>
-      </w:r>
-      <w:r>
-        <w:rPr>
-          <w:rFonts w:ascii="Times New Roman" w:eastAsia="Times New Roman" w:hAnsi="Times New Roman" w:cs="Times New Roman"/>
-          <w:sz w:val="24"/>
-          <w:szCs w:val="24"/>
-        </w:rPr>
-        <w:t xml:space="preserve">………. </w:t>
-      </w:r>
-      <w:r>
-        <w:rPr>
-          <w:rFonts w:ascii="Times New Roman" w:eastAsia="Times New Roman" w:hAnsi="Times New Roman" w:cs="Times New Roman"/>
-          <w:sz w:val="24"/>
-          <w:szCs w:val="24"/>
-        </w:rPr>
-        <w:t xml:space="preserve"> </w:t>
-      </w:r>
-      <w:r>
-        <w:rPr>
-          <w:rFonts w:ascii="Times New Roman" w:eastAsia="Times New Roman" w:hAnsi="Times New Roman" w:cs="Times New Roman"/>
-          <w:sz w:val="24"/>
-          <w:szCs w:val="24"/>
-          <w:highlight w:val="yellow"/>
-        </w:rPr>
-        <w:t>{{</w:t>
-      </w:r>
-      <w:proofErr w:type="spellStart"/>
-      <w:r>
-        <w:rPr>
-          <w:rFonts w:ascii="Times New Roman" w:eastAsia="Times New Roman" w:hAnsi="Times New Roman" w:cs="Times New Roman"/>
-          <w:sz w:val="24"/>
-          <w:szCs w:val="24"/>
-          <w:highlight w:val="yellow"/>
-        </w:rPr>
-        <w:t>LiquiDanoMaterialNum</w:t>
-      </w:r>
-      <w:proofErr w:type="spellEnd"/>
-      <w:r>
-        <w:rPr>
-          <w:rFonts w:ascii="Times New Roman" w:eastAsia="Times New Roman" w:hAnsi="Times New Roman" w:cs="Times New Roman"/>
-          <w:sz w:val="24"/>
-          <w:szCs w:val="24"/>
-          <w:highlight w:val="yellow"/>
-        </w:rPr>
-        <w:t>}}</w:t>
-      </w:r>
-    </w:p>
-    <w:p>
-      <w:pPr>
-        <w:spacing w:after="0" w:line="360" w:lineRule="auto"/>
-        <w:rPr>
-          <w:rFonts w:ascii="Times New Roman" w:eastAsia="Times New Roman" w:hAnsi="Times New Roman" w:cs="Times New Roman"/>
-          <w:sz w:val="24"/>
-          <w:szCs w:val="24"/>
-        </w:rPr>
-      </w:pPr>
-      <w:r>
-        <w:rPr>
-          <w:rFonts w:ascii="Times New Roman" w:eastAsia="Times New Roman" w:hAnsi="Times New Roman" w:cs="Times New Roman"/>
-          <w:sz w:val="24"/>
-          <w:szCs w:val="24"/>
-        </w:rPr>
-        <w:t>2.  DAÑO FÍSICO E INCAPACIDAD</w:t>
-      </w:r>
-      <w:proofErr w:type="gramStart"/>
-      <w:r>
-        <w:rPr>
-          <w:rFonts w:ascii="Times New Roman" w:eastAsia="Times New Roman" w:hAnsi="Times New Roman" w:cs="Times New Roman"/>
-          <w:sz w:val="24"/>
-          <w:szCs w:val="24"/>
-        </w:rPr>
-        <w:t xml:space="preserve"> ..</w:t>
-      </w:r>
-      <w:proofErr w:type="gramEnd"/>
-      <w:r>
-        <w:rPr>
-          <w:rFonts w:ascii="Times New Roman" w:eastAsia="Times New Roman" w:hAnsi="Times New Roman" w:cs="Times New Roman"/>
-          <w:sz w:val="24"/>
-          <w:szCs w:val="24"/>
-        </w:rPr>
-        <w:t>…</w:t>
-      </w:r>
-      <w:r>
-        <w:rPr>
-          <w:rFonts w:ascii="Times New Roman" w:eastAsia="Times New Roman" w:hAnsi="Times New Roman" w:cs="Times New Roman"/>
-          <w:sz w:val="24"/>
-          <w:szCs w:val="24"/>
-          <w:highlight w:val="yellow"/>
-        </w:rPr>
-        <w:t>{{</w:t>
-      </w:r>
-      <w:proofErr w:type="spellStart"/>
-      <w:r>
-        <w:rPr>
-          <w:rFonts w:ascii="Times New Roman" w:eastAsia="Times New Roman" w:hAnsi="Times New Roman" w:cs="Times New Roman"/>
-          <w:sz w:val="24"/>
-          <w:szCs w:val="24"/>
-          <w:highlight w:val="yellow"/>
-        </w:rPr>
-        <w:t>LiquiIncapacidadFisicaNum</w:t>
-      </w:r>
-      <w:proofErr w:type="spellEnd"/>
-      <w:r>
-        <w:rPr>
-          <w:rFonts w:ascii="Times New Roman" w:eastAsia="Times New Roman" w:hAnsi="Times New Roman" w:cs="Times New Roman"/>
-          <w:sz w:val="24"/>
-          <w:szCs w:val="24"/>
-          <w:highlight w:val="yellow"/>
-        </w:rPr>
-        <w:t>}}</w:t>
-      </w:r>
-    </w:p>
-    <w:p>
-      <w:pPr>
-        <w:spacing w:after="0" w:line="360" w:lineRule="auto"/>
-        <w:rPr>
-          <w:rFonts w:ascii="Times New Roman" w:eastAsia="Times New Roman" w:hAnsi="Times New Roman" w:cs="Times New Roman"/>
-          <w:sz w:val="24"/>
-          <w:szCs w:val="24"/>
-        </w:rPr>
-      </w:pPr>
-      <w:r>
-        <w:rPr>
-          <w:rFonts w:ascii="Times New Roman" w:eastAsia="Times New Roman" w:hAnsi="Times New Roman" w:cs="Times New Roman"/>
-          <w:sz w:val="24"/>
-          <w:szCs w:val="24"/>
-        </w:rPr>
-        <w:t>3. DAÑO MORAL</w:t>
-      </w:r>
-      <w:proofErr w:type="gramStart"/>
-      <w:r>
-        <w:rPr>
-          <w:rFonts w:ascii="Times New Roman" w:eastAsia="Times New Roman" w:hAnsi="Times New Roman" w:cs="Times New Roman"/>
-          <w:sz w:val="24"/>
-          <w:szCs w:val="24"/>
-        </w:rPr>
-        <w:t xml:space="preserve"> ….</w:t>
-      </w:r>
-      <w:proofErr w:type="gramEnd"/>
-      <w:r>
-        <w:rPr>
-          <w:rFonts w:ascii="Times New Roman" w:eastAsia="Times New Roman" w:hAnsi="Times New Roman" w:cs="Times New Roman"/>
-          <w:sz w:val="24"/>
-          <w:szCs w:val="24"/>
-        </w:rPr>
-        <w:t xml:space="preserve">.…………… </w:t>
-      </w:r>
-      <w:r>
-        <w:rPr>
-          <w:rFonts w:ascii="Times New Roman" w:eastAsia="Times New Roman" w:hAnsi="Times New Roman" w:cs="Times New Roman"/>
-          <w:sz w:val="24"/>
-          <w:szCs w:val="24"/>
-          <w:highlight w:val="yellow"/>
-        </w:rPr>
-        <w:t>{{</w:t>
-      </w:r>
-      <w:proofErr w:type="spellStart"/>
-      <w:r>
-        <w:rPr>
-          <w:rFonts w:ascii="Times New Roman" w:eastAsia="Times New Roman" w:hAnsi="Times New Roman" w:cs="Times New Roman"/>
-          <w:sz w:val="24"/>
-          <w:szCs w:val="24"/>
-          <w:highlight w:val="yellow"/>
-        </w:rPr>
-        <w:t>LiquiDanoMoralNum</w:t>
-      </w:r>
-      <w:proofErr w:type="spellEnd"/>
-      <w:r>
-        <w:rPr>
-          <w:rFonts w:ascii="Times New Roman" w:eastAsia="Times New Roman" w:hAnsi="Times New Roman" w:cs="Times New Roman"/>
-          <w:sz w:val="24"/>
-          <w:szCs w:val="24"/>
-          <w:highlight w:val="yellow"/>
-        </w:rPr>
-        <w:t>}}</w:t>
-      </w:r>
-    </w:p>
-    <w:p>
-      <w:pPr>
-        <w:spacing w:after="0" w:line="360" w:lineRule="auto"/>
-        <w:rPr>
-          <w:rFonts w:ascii="Times New Roman" w:eastAsia="Times New Roman" w:hAnsi="Times New Roman" w:cs="Times New Roman"/>
-          <w:sz w:val="24"/>
-          <w:szCs w:val="24"/>
-        </w:rPr>
-      </w:pPr>
-      <w:r>
-        <w:rPr>
-          <w:rFonts w:ascii="Times New Roman" w:eastAsia="Times New Roman" w:hAnsi="Times New Roman" w:cs="Times New Roman"/>
-          <w:sz w:val="24"/>
-          <w:szCs w:val="24"/>
-        </w:rPr>
-        <w:t>4. DAÑO PSICOLÓGICO …</w:t>
-      </w:r>
-      <w:r>
-        <w:rPr>
-          <w:rFonts w:ascii="Times New Roman" w:eastAsia="Times New Roman" w:hAnsi="Times New Roman" w:cs="Times New Roman"/>
-          <w:sz w:val="24"/>
-          <w:szCs w:val="24"/>
-        </w:rPr>
-        <w:t>….</w:t>
-      </w:r>
-      <w:r>
-        <w:rPr>
-          <w:rFonts w:ascii="Times New Roman" w:eastAsia="Times New Roman" w:hAnsi="Times New Roman" w:cs="Times New Roman"/>
-          <w:sz w:val="24"/>
-          <w:szCs w:val="24"/>
-        </w:rPr>
-        <w:t xml:space="preserve"> </w:t>
-      </w:r>
-      <w:r>
-        <w:rPr>
-          <w:rFonts w:ascii="Times New Roman" w:eastAsia="Times New Roman" w:hAnsi="Times New Roman" w:cs="Times New Roman"/>
-          <w:sz w:val="24"/>
-          <w:szCs w:val="24"/>
-          <w:highlight w:val="yellow"/>
-        </w:rPr>
-        <w:t>{{</w:t>
-      </w:r>
-      <w:proofErr w:type="spellStart"/>
-      <w:r>
-        <w:rPr>
-          <w:rFonts w:ascii="Times New Roman" w:eastAsia="Times New Roman" w:hAnsi="Times New Roman" w:cs="Times New Roman"/>
-          <w:sz w:val="24"/>
-          <w:szCs w:val="24"/>
-          <w:highlight w:val="yellow"/>
-        </w:rPr>
-        <w:t>LiquiDanoPsicologicoNum</w:t>
-      </w:r>
-      <w:proofErr w:type="spellEnd"/>
-      <w:r>
-        <w:rPr>
-          <w:rFonts w:ascii="Times New Roman" w:eastAsia="Times New Roman" w:hAnsi="Times New Roman" w:cs="Times New Roman"/>
-          <w:sz w:val="24"/>
-          <w:szCs w:val="24"/>
-          <w:highlight w:val="yellow"/>
-        </w:rPr>
-        <w:t>}}</w:t>
-      </w:r>
-    </w:p>
-    <w:p>
-      <w:pPr>
-        <w:spacing w:after="0" w:line="360" w:lineRule="auto"/>
-        <w:rPr>
-          <w:rFonts w:ascii="Times New Roman" w:eastAsia="Times New Roman" w:hAnsi="Times New Roman" w:cs="Times New Roman"/>
-          <w:sz w:val="24"/>
-          <w:szCs w:val="24"/>
-        </w:rPr>
-      </w:pPr>
-      <w:r>
-        <w:rPr>
-          <w:rFonts w:ascii="Times New Roman" w:eastAsia="Times New Roman" w:hAnsi="Times New Roman" w:cs="Times New Roman"/>
-          <w:sz w:val="24"/>
-          <w:szCs w:val="24"/>
-        </w:rPr>
-        <w:t>5. DAÑO PSICOFARMACOLÓGICO FUTURO.…</w:t>
-      </w:r>
-      <w:r>
-        <w:rPr>
-          <w:rFonts w:ascii="Times New Roman" w:eastAsia="Times New Roman" w:hAnsi="Times New Roman" w:cs="Times New Roman"/>
-          <w:sz w:val="24"/>
-          <w:szCs w:val="24"/>
-        </w:rPr>
-        <w:t xml:space="preserve"> </w:t>
-      </w:r>
-      <w:r>
-        <w:rPr>
-          <w:rFonts w:ascii="Times New Roman" w:eastAsia="Times New Roman" w:hAnsi="Times New Roman" w:cs="Times New Roman"/>
-          <w:sz w:val="24"/>
-          <w:szCs w:val="24"/>
-          <w:highlight w:val="yellow"/>
-        </w:rPr>
-        <w:t>{{</w:t>
-      </w:r>
-      <w:proofErr w:type="spellStart"/>
-      <w:r>
-        <w:rPr>
-          <w:rFonts w:ascii="Times New Roman" w:eastAsia="Times New Roman" w:hAnsi="Times New Roman" w:cs="Times New Roman"/>
-          <w:sz w:val="24"/>
-          <w:szCs w:val="24"/>
-          <w:highlight w:val="yellow"/>
-        </w:rPr>
-        <w:t>Liqui</w:t>
-      </w:r>
-      <w:r>
-        <w:rPr>
-          <w:rFonts w:ascii="Times New Roman" w:eastAsia="Times New Roman" w:hAnsi="Times New Roman" w:cs="Times New Roman"/>
-          <w:sz w:val="24"/>
-          <w:szCs w:val="24"/>
-          <w:highlight w:val="yellow"/>
-        </w:rPr>
-        <w:t>GastosFarmacia</w:t>
-      </w:r>
-      <w:r>
-        <w:rPr>
-          <w:rFonts w:ascii="Times New Roman" w:eastAsia="Times New Roman" w:hAnsi="Times New Roman" w:cs="Times New Roman"/>
-          <w:sz w:val="24"/>
-          <w:szCs w:val="24"/>
-          <w:highlight w:val="yellow"/>
-        </w:rPr>
-        <w:t>Num</w:t>
-      </w:r>
-      <w:proofErr w:type="spellEnd"/>
-      <w:r>
-        <w:rPr>
-          <w:rFonts w:ascii="Times New Roman" w:eastAsia="Times New Roman" w:hAnsi="Times New Roman" w:cs="Times New Roman"/>
-          <w:sz w:val="24"/>
-          <w:szCs w:val="24"/>
-          <w:highlight w:val="yellow"/>
-        </w:rPr>
-        <w:t>}}</w:t>
-      </w:r>
-    </w:p>
-    <w:p>
-      <w:pPr>
-        <w:spacing w:after="0" w:line="360" w:lineRule="auto"/>
-        <w:rPr>
-          <w:rFonts w:ascii="Times New Roman" w:eastAsia="Times New Roman" w:hAnsi="Times New Roman" w:cs="Times New Roman"/>
-          <w:sz w:val="24"/>
-          <w:szCs w:val="24"/>
-        </w:rPr>
-      </w:pPr>
-      <w:r>
-        <w:rPr>
-          <w:rFonts w:ascii="Times New Roman" w:eastAsia="Times New Roman" w:hAnsi="Times New Roman" w:cs="Times New Roman"/>
-          <w:sz w:val="24"/>
-          <w:szCs w:val="24"/>
-        </w:rPr>
-        <w:t>6. ASISTENCIA MÉDICA- GASTOS</w:t>
-      </w:r>
-      <w:r>
-        <w:rPr>
-          <w:rFonts w:ascii="Times New Roman" w:eastAsia="Times New Roman" w:hAnsi="Times New Roman" w:cs="Times New Roman"/>
-          <w:sz w:val="24"/>
-          <w:szCs w:val="24"/>
-        </w:rPr>
-        <w:t xml:space="preserve"> </w:t>
-      </w:r>
-      <w:r>
-        <w:rPr>
-          <w:rFonts w:ascii="Times New Roman" w:eastAsia="Times New Roman" w:hAnsi="Times New Roman" w:cs="Times New Roman"/>
-          <w:sz w:val="24"/>
-          <w:szCs w:val="24"/>
-        </w:rPr>
-        <w:t>FARMACOLÓGICOS</w:t>
-      </w:r>
-      <w:r>
-        <w:rPr>
-          <w:rFonts w:ascii="Times New Roman" w:eastAsia="Times New Roman" w:hAnsi="Times New Roman" w:cs="Times New Roman"/>
-          <w:sz w:val="24"/>
-          <w:szCs w:val="24"/>
-        </w:rPr>
-        <w:t xml:space="preserve"> </w:t>
-      </w:r>
-      <w:r>
-        <w:rPr>
-          <w:rFonts w:ascii="Times New Roman" w:eastAsia="Times New Roman" w:hAnsi="Times New Roman" w:cs="Times New Roman"/>
-          <w:sz w:val="24"/>
-          <w:szCs w:val="24"/>
-          <w:highlight w:val="yellow"/>
-        </w:rPr>
-        <w:t>{{</w:t>
-      </w:r>
-      <w:proofErr w:type="spellStart"/>
-      <w:r>
-        <w:rPr>
-          <w:rFonts w:ascii="Times New Roman" w:eastAsia="Times New Roman" w:hAnsi="Times New Roman" w:cs="Times New Roman"/>
-          <w:sz w:val="24"/>
-          <w:szCs w:val="24"/>
-          <w:highlight w:val="yellow"/>
-        </w:rPr>
-        <w:t>Liqui</w:t>
-      </w:r>
-      <w:r>
-        <w:rPr>
-          <w:rFonts w:ascii="Times New Roman" w:eastAsia="Times New Roman" w:hAnsi="Times New Roman" w:cs="Times New Roman"/>
-          <w:sz w:val="24"/>
-          <w:szCs w:val="24"/>
-          <w:highlight w:val="yellow"/>
-        </w:rPr>
-        <w:t>GastosMedicos</w:t>
-      </w:r>
-      <w:r>
-        <w:rPr>
-          <w:rFonts w:ascii="Times New Roman" w:eastAsia="Times New Roman" w:hAnsi="Times New Roman" w:cs="Times New Roman"/>
-          <w:sz w:val="24"/>
-          <w:szCs w:val="24"/>
-          <w:highlight w:val="yellow"/>
-        </w:rPr>
-        <w:t>Num</w:t>
-      </w:r>
-      <w:proofErr w:type="spellEnd"/>
-      <w:r>
-        <w:rPr>
-          <w:rFonts w:ascii="Times New Roman" w:eastAsia="Times New Roman" w:hAnsi="Times New Roman" w:cs="Times New Roman"/>
-          <w:sz w:val="24"/>
-          <w:szCs w:val="24"/>
-          <w:highlight w:val="yellow"/>
-        </w:rPr>
-        <w:t>}}</w:t>
-      </w:r>
-    </w:p>
-    <w:p>
-      <w:pPr>
-        <w:spacing w:after="0" w:line="360" w:lineRule="auto"/>
-        <w:jc w:val="both"/>
-        <w:rPr>
-          <w:rFonts w:ascii="Times New Roman" w:eastAsia="Times New Roman" w:hAnsi="Times New Roman" w:cs="Times New Roman"/>
-          <w:b/>
-          <w:bCs/>
-          <w:sz w:val="24"/>
-          <w:szCs w:val="24"/>
-          <w:highlight w:val="yellow"/>
-        </w:rPr>
-      </w:pPr>
-    </w:p>
-    <w:p>
-      <w:pPr>
-        <w:spacing w:after="0" w:line="360" w:lineRule="auto"/>
-        <w:jc w:val="both"/>
-        <w:rPr>
-          <w:rFonts w:ascii="Times New Roman" w:eastAsia="Times New Roman" w:hAnsi="Times New Roman" w:cs="Times New Roman"/>
-          <w:b/>
-          <w:bCs/>
-          <w:sz w:val="24"/>
-          <w:szCs w:val="24"/>
-          <w:highlight w:val="yellow"/>
-        </w:rPr>
-      </w:pPr>
-      <w:r>
-        <w:rPr>
-          <w:rFonts w:ascii="Times New Roman" w:eastAsia="Times New Roman" w:hAnsi="Times New Roman" w:cs="Times New Roman"/>
-          <w:b/>
-          <w:bCs/>
-          <w:sz w:val="24"/>
-          <w:szCs w:val="24"/>
-          <w:u w:val="single"/>
-        </w:rPr>
-        <w:lastRenderedPageBreak/>
         <w:t xml:space="preserve">TOTAL: </w:t>
       </w:r>
       <w:r>
@@ -8061,7 +8114,18 @@
           <w:sz w:val="24"/>
           <w:szCs w:val="24"/>
         </w:rPr>
-        <w:t xml:space="preserve"> montos establecidos en la generalidad de las sentencias no han variado en los últimos 7 años, situación por la cual resulta sumamente </w:t>
+        <w:t xml:space="preserve"> montos establecidos en la generalidad de las sentencias no han variado en los últimos 7 </w:t>
+      </w:r>
+      <w:r>
+        <w:rPr>
+          <w:rFonts w:ascii="Times New Roman" w:eastAsia="Times New Roman" w:hAnsi="Times New Roman" w:cs="Times New Roman"/>
+          <w:b/>
+          <w:bCs/>
+          <w:sz w:val="24"/>
+          <w:szCs w:val="24"/>
+        </w:rPr>
+        <w:lastRenderedPageBreak/>
+        <w:t xml:space="preserve">años, situación por la cual resulta sumamente </w:t>
       </w:r>
       <w:proofErr w:type="gramStart"/>
       <w:r>
@@ -8171,8 +8235,380 @@
           <w:sz w:val="24"/>
           <w:szCs w:val="24"/>
         </w:rPr>
-        <w:t xml:space="preserve"> se puede corroborar en </w:t>
-      </w:r>
+        <w:t xml:space="preserve"> se puede corroborar en la nota periodística que se acompaña a la parte documental del presente libelo, emitida por el diario Clarín con fecha 11 de enero de 2009, en la cual se informa que en los últimos siete </w:t>
+      </w:r>
+      <w:proofErr w:type="gramStart"/>
+      <w:r>
+        <w:rPr>
+          <w:rFonts w:ascii="Times New Roman" w:eastAsia="Times New Roman" w:hAnsi="Times New Roman" w:cs="Times New Roman"/>
+          <w:b/>
+          <w:bCs/>
+          <w:sz w:val="24"/>
+          <w:szCs w:val="24"/>
+        </w:rPr>
+        <w:t>años  hay</w:t>
+      </w:r>
+      <w:proofErr w:type="gramEnd"/>
+      <w:r>
+        <w:rPr>
+          <w:rFonts w:ascii="Times New Roman" w:eastAsia="Times New Roman" w:hAnsi="Times New Roman" w:cs="Times New Roman"/>
+          <w:b/>
+          <w:bCs/>
+          <w:sz w:val="24"/>
+          <w:szCs w:val="24"/>
+        </w:rPr>
+        <w:t xml:space="preserve"> precios que subieron más del 500%. Y desde allí hasta la </w:t>
+      </w:r>
+      <w:proofErr w:type="gramStart"/>
+      <w:r>
+        <w:rPr>
+          <w:rFonts w:ascii="Times New Roman" w:eastAsia="Times New Roman" w:hAnsi="Times New Roman" w:cs="Times New Roman"/>
+          <w:b/>
+          <w:bCs/>
+          <w:sz w:val="24"/>
+          <w:szCs w:val="24"/>
+        </w:rPr>
+        <w:t>actualidad  los</w:t>
+      </w:r>
+      <w:proofErr w:type="gramEnd"/>
+      <w:r>
+        <w:rPr>
+          <w:rFonts w:ascii="Times New Roman" w:eastAsia="Times New Roman" w:hAnsi="Times New Roman" w:cs="Times New Roman"/>
+          <w:b/>
+          <w:bCs/>
+          <w:sz w:val="24"/>
+          <w:szCs w:val="24"/>
+        </w:rPr>
+        <w:t xml:space="preserve"> aumentos alcanzan un 250</w:t>
+      </w:r>
+      <w:proofErr w:type="gramStart"/>
+      <w:r>
+        <w:rPr>
+          <w:rFonts w:ascii="Times New Roman" w:eastAsia="Times New Roman" w:hAnsi="Times New Roman" w:cs="Times New Roman"/>
+          <w:b/>
+          <w:bCs/>
+          <w:sz w:val="24"/>
+          <w:szCs w:val="24"/>
+        </w:rPr>
+        <w:t>%,  Consecuentemente</w:t>
+      </w:r>
+      <w:proofErr w:type="gramEnd"/>
+      <w:r>
+        <w:rPr>
+          <w:rFonts w:ascii="Times New Roman" w:eastAsia="Times New Roman" w:hAnsi="Times New Roman" w:cs="Times New Roman"/>
+          <w:b/>
+          <w:bCs/>
+          <w:sz w:val="24"/>
+          <w:szCs w:val="24"/>
+        </w:rPr>
+        <w:t xml:space="preserve"> con lo expuesto podemos arribar a las conclusiones mencionadas, ya que tal como manifiestan los representantes de la mayoría de las aseguradoras, les resulta más conveniente generar litigios que </w:t>
+      </w:r>
+      <w:proofErr w:type="gramStart"/>
+      <w:r>
+        <w:rPr>
+          <w:rFonts w:ascii="Times New Roman" w:eastAsia="Times New Roman" w:hAnsi="Times New Roman" w:cs="Times New Roman"/>
+          <w:b/>
+          <w:bCs/>
+          <w:sz w:val="24"/>
+          <w:szCs w:val="24"/>
+        </w:rPr>
+        <w:t>conciliaciones,  consiguiendo</w:t>
+      </w:r>
+      <w:proofErr w:type="gramEnd"/>
+      <w:r>
+        <w:rPr>
+          <w:rFonts w:ascii="Times New Roman" w:eastAsia="Times New Roman" w:hAnsi="Times New Roman" w:cs="Times New Roman"/>
+          <w:b/>
+          <w:bCs/>
+          <w:sz w:val="24"/>
+          <w:szCs w:val="24"/>
+        </w:rPr>
+        <w:t xml:space="preserve"> con ello un claro colapso judicial y un importantísimo beneficio económico.</w:t>
+      </w:r>
+    </w:p>
+    <w:p>
+      <w:pPr>
+        <w:spacing w:after="0" w:line="360" w:lineRule="auto"/>
+        <w:ind w:firstLine="554"/>
+        <w:jc w:val="both"/>
+        <w:rPr>
+          <w:rFonts w:ascii="Times New Roman" w:eastAsia="Times New Roman" w:hAnsi="Times New Roman" w:cs="Times New Roman"/>
+          <w:sz w:val="24"/>
+          <w:szCs w:val="24"/>
+        </w:rPr>
+      </w:pPr>
+      <w:r>
+        <w:rPr>
+          <w:rFonts w:ascii="Times New Roman" w:eastAsia="Times New Roman" w:hAnsi="Times New Roman" w:cs="Times New Roman"/>
+          <w:b/>
+          <w:bCs/>
+          <w:sz w:val="24"/>
+          <w:szCs w:val="24"/>
+        </w:rPr>
+        <w:t xml:space="preserve">AHORA </w:t>
+      </w:r>
+      <w:proofErr w:type="gramStart"/>
+      <w:r>
+        <w:rPr>
+          <w:rFonts w:ascii="Times New Roman" w:eastAsia="Times New Roman" w:hAnsi="Times New Roman" w:cs="Times New Roman"/>
+          <w:b/>
+          <w:bCs/>
+          <w:sz w:val="24"/>
+          <w:szCs w:val="24"/>
+        </w:rPr>
+        <w:t>BIEN</w:t>
+      </w:r>
+      <w:proofErr w:type="gramEnd"/>
+      <w:r>
+        <w:rPr>
+          <w:rFonts w:ascii="Times New Roman" w:eastAsia="Times New Roman" w:hAnsi="Times New Roman" w:cs="Times New Roman"/>
+          <w:b/>
+          <w:bCs/>
+          <w:sz w:val="24"/>
+          <w:szCs w:val="24"/>
+        </w:rPr>
+        <w:t xml:space="preserve"> POR ÚLTIMO Y DE MAYOR RELEVANCIA ES DE MENCIONAR QUE COMO ES DE PÚBLICO CONOCIMIENTO DURANTE TODO 2020, HEMOS SUFRIDO UNA DEVALUACIÓN APROXIMADA DEL 40</w:t>
+      </w:r>
+      <w:proofErr w:type="gramStart"/>
+      <w:r>
+        <w:rPr>
+          <w:rFonts w:ascii="Times New Roman" w:eastAsia="Times New Roman" w:hAnsi="Times New Roman" w:cs="Times New Roman"/>
+          <w:b/>
+          <w:bCs/>
+          <w:sz w:val="24"/>
+          <w:szCs w:val="24"/>
+        </w:rPr>
+        <w:t>%,  SIENDO</w:t>
+      </w:r>
+      <w:proofErr w:type="gramEnd"/>
+      <w:r>
+        <w:rPr>
+          <w:rFonts w:ascii="Times New Roman" w:eastAsia="Times New Roman" w:hAnsi="Times New Roman" w:cs="Times New Roman"/>
+          <w:b/>
+          <w:bCs/>
+          <w:sz w:val="24"/>
+          <w:szCs w:val="24"/>
+        </w:rPr>
+        <w:t xml:space="preserve"> RECONOCIDO OFICIALMENTE QUE LA INFLACIÓN TAN SOLO PARA EL MES DE ENERO DE ESE AÑO FUE DEL 4%, CONSECUENTEMENTE Y REALIZANDO UNA PROYECCIÓN PODRÍAMOS AFIRMAR QUE </w:t>
+      </w:r>
+      <w:proofErr w:type="gramStart"/>
+      <w:r>
+        <w:rPr>
+          <w:rFonts w:ascii="Times New Roman" w:eastAsia="Times New Roman" w:hAnsi="Times New Roman" w:cs="Times New Roman"/>
+          <w:b/>
+          <w:bCs/>
+          <w:sz w:val="24"/>
+          <w:szCs w:val="24"/>
+        </w:rPr>
+        <w:t>LA  INFLACIÓN</w:t>
+      </w:r>
+      <w:proofErr w:type="gramEnd"/>
+      <w:r>
+        <w:rPr>
+          <w:rFonts w:ascii="Times New Roman" w:eastAsia="Times New Roman" w:hAnsi="Times New Roman" w:cs="Times New Roman"/>
+          <w:b/>
+          <w:bCs/>
+          <w:sz w:val="24"/>
+          <w:szCs w:val="24"/>
+        </w:rPr>
+        <w:t xml:space="preserve"> ANUAL EN 2022 RONDARÁ EL 1500%...  SABIENDO </w:t>
+      </w:r>
+      <w:proofErr w:type="gramStart"/>
+      <w:r>
+        <w:rPr>
+          <w:rFonts w:ascii="Times New Roman" w:eastAsia="Times New Roman" w:hAnsi="Times New Roman" w:cs="Times New Roman"/>
+          <w:b/>
+          <w:bCs/>
+          <w:sz w:val="24"/>
+          <w:szCs w:val="24"/>
+        </w:rPr>
+        <w:t>ELLO  S.S</w:t>
+      </w:r>
+      <w:proofErr w:type="gramEnd"/>
+      <w:r>
+        <w:rPr>
+          <w:rFonts w:ascii="Times New Roman" w:eastAsia="Times New Roman" w:hAnsi="Times New Roman" w:cs="Times New Roman"/>
+          <w:b/>
+          <w:bCs/>
+          <w:sz w:val="24"/>
+          <w:szCs w:val="24"/>
+        </w:rPr>
+        <w:t xml:space="preserve"> COMPRENDERÁ QUE NINGUNA DE LAS TASAS DE INTERÉS QUE SE APLICAN PARA ACTUALIZAR MONTOS DE SENTENCIAS SE CONDICEN CON LA REALIDAD DE NUESTRO PAÍS, MENOS AÚN LA TASA PASIVA Y/O LA DEL 8% LAS CUALES HOY POR HOY RESULTAN HASTA IRRISORIAS, SIENDO ESTO </w:t>
+      </w:r>
+      <w:proofErr w:type="gramStart"/>
+      <w:r>
+        <w:rPr>
+          <w:rFonts w:ascii="Times New Roman" w:eastAsia="Times New Roman" w:hAnsi="Times New Roman" w:cs="Times New Roman"/>
+          <w:b/>
+          <w:bCs/>
+          <w:sz w:val="24"/>
+          <w:szCs w:val="24"/>
+        </w:rPr>
+        <w:t>ÚNICAMENTE  UN</w:t>
+      </w:r>
+      <w:proofErr w:type="gramEnd"/>
+      <w:r>
+        <w:rPr>
+          <w:rFonts w:ascii="Times New Roman" w:eastAsia="Times New Roman" w:hAnsi="Times New Roman" w:cs="Times New Roman"/>
+          <w:b/>
+          <w:bCs/>
+          <w:sz w:val="24"/>
+          <w:szCs w:val="24"/>
+        </w:rPr>
+        <w:t xml:space="preserve"> EXCELENTE </w:t>
+      </w:r>
+      <w:proofErr w:type="gramStart"/>
+      <w:r>
+        <w:rPr>
+          <w:rFonts w:ascii="Times New Roman" w:eastAsia="Times New Roman" w:hAnsi="Times New Roman" w:cs="Times New Roman"/>
+          <w:b/>
+          <w:bCs/>
+          <w:sz w:val="24"/>
+          <w:szCs w:val="24"/>
+        </w:rPr>
+        <w:t>NEGOCIO  PARA</w:t>
+      </w:r>
+      <w:proofErr w:type="gramEnd"/>
+      <w:r>
+        <w:rPr>
+          <w:rFonts w:ascii="Times New Roman" w:eastAsia="Times New Roman" w:hAnsi="Times New Roman" w:cs="Times New Roman"/>
+          <w:b/>
+          <w:bCs/>
+          <w:sz w:val="24"/>
+          <w:szCs w:val="24"/>
+        </w:rPr>
+        <w:t xml:space="preserve"> LAS ASEGURADORAS, LAS CUALES AL DILATAR LOS </w:t>
+      </w:r>
+      <w:proofErr w:type="gramStart"/>
+      <w:r>
+        <w:rPr>
+          <w:rFonts w:ascii="Times New Roman" w:eastAsia="Times New Roman" w:hAnsi="Times New Roman" w:cs="Times New Roman"/>
+          <w:b/>
+          <w:bCs/>
+          <w:sz w:val="24"/>
+          <w:szCs w:val="24"/>
+        </w:rPr>
+        <w:t>PAGOS  GENERAN</w:t>
+      </w:r>
+      <w:proofErr w:type="gramEnd"/>
+      <w:r>
+        <w:rPr>
+          <w:rFonts w:ascii="Times New Roman" w:eastAsia="Times New Roman" w:hAnsi="Times New Roman" w:cs="Times New Roman"/>
+          <w:b/>
+          <w:bCs/>
+          <w:sz w:val="24"/>
+          <w:szCs w:val="24"/>
+        </w:rPr>
+        <w:t xml:space="preserve"> UN PERJUICIO DESMESURADO EN EL ACTOR QUIEN JAMÁS TENDRÁ UN RECLAMO AJUSTADO A LA REALIDAD QUE ATRAVESAMOS.</w:t>
+      </w:r>
+    </w:p>
+    <w:p>
+      <w:pPr>
+        <w:spacing w:after="0" w:line="360" w:lineRule="auto"/>
+        <w:ind w:firstLine="554"/>
+        <w:jc w:val="both"/>
+        <w:rPr>
+          <w:rFonts w:ascii="Times New Roman" w:eastAsia="Times New Roman" w:hAnsi="Times New Roman" w:cs="Times New Roman"/>
+          <w:b/>
+          <w:bCs/>
+          <w:sz w:val="24"/>
+          <w:szCs w:val="24"/>
+        </w:rPr>
+      </w:pPr>
+      <w:r>
+        <w:rPr>
+          <w:rFonts w:ascii="Times New Roman" w:eastAsia="Times New Roman" w:hAnsi="Times New Roman" w:cs="Times New Roman"/>
+          <w:b/>
+          <w:bCs/>
+          <w:sz w:val="24"/>
+          <w:szCs w:val="24"/>
+        </w:rPr>
+        <w:t xml:space="preserve">Cabe destacar que en los últimos años hasta el 2024 inclusive hemos sufrido un proceso inflacionario del orden del 150% aproximadamente en cada periodo anual. </w:t>
+      </w:r>
+    </w:p>
+    <w:p>
+      <w:pPr>
+        <w:spacing w:after="0" w:line="360" w:lineRule="auto"/>
+        <w:ind w:firstLine="720"/>
+        <w:jc w:val="both"/>
+        <w:rPr>
+          <w:rFonts w:ascii="Times New Roman" w:eastAsia="Times New Roman" w:hAnsi="Times New Roman" w:cs="Times New Roman"/>
+          <w:b/>
+          <w:bCs/>
+          <w:sz w:val="24"/>
+          <w:szCs w:val="24"/>
+        </w:rPr>
+      </w:pPr>
+      <w:r>
+        <w:rPr>
+          <w:rFonts w:ascii="Times New Roman" w:eastAsia="Times New Roman" w:hAnsi="Times New Roman" w:cs="Times New Roman"/>
+          <w:b/>
+          <w:bCs/>
+          <w:sz w:val="24"/>
+          <w:szCs w:val="24"/>
+        </w:rPr>
+        <w:t>En este orden de ideas, la Suprema Corte de la Provincia de Buenos Aires, ha tenido una postura favorable a los argumentos esgrimidos, sentado un cambio de criterio en lo que refiere a la actualización de los créditos en las acciones de daños y perjuicios, conforme a la doctrina legal establecida por la Suprema Corte de Justicia en la causa C. 124.096, "Barrios, Héctor Francisco y otra C/ Lascano, Sandra Beatriz y otra. S/ Daños y Perjuicios" (</w:t>
+      </w:r>
+      <w:proofErr w:type="spellStart"/>
+      <w:r>
+        <w:rPr>
+          <w:rFonts w:ascii="Times New Roman" w:eastAsia="Times New Roman" w:hAnsi="Times New Roman" w:cs="Times New Roman"/>
+          <w:b/>
+          <w:bCs/>
+          <w:sz w:val="24"/>
+          <w:szCs w:val="24"/>
+        </w:rPr>
+        <w:t>sent</w:t>
+      </w:r>
+      <w:proofErr w:type="spellEnd"/>
+      <w:r>
+        <w:rPr>
+          <w:rFonts w:ascii="Times New Roman" w:eastAsia="Times New Roman" w:hAnsi="Times New Roman" w:cs="Times New Roman"/>
+          <w:b/>
+          <w:bCs/>
+          <w:sz w:val="24"/>
+          <w:szCs w:val="24"/>
+        </w:rPr>
+        <w:t xml:space="preserve">. del 17/4/2024). </w:t>
+      </w:r>
+    </w:p>
+    <w:p>
+      <w:pPr>
+        <w:spacing w:after="0" w:line="360" w:lineRule="auto"/>
+        <w:ind w:firstLine="720"/>
+        <w:jc w:val="both"/>
+        <w:rPr>
+          <w:rFonts w:ascii="Times New Roman" w:eastAsia="Times New Roman" w:hAnsi="Times New Roman" w:cs="Times New Roman"/>
+          <w:b/>
+          <w:bCs/>
+          <w:sz w:val="24"/>
+          <w:szCs w:val="24"/>
+        </w:rPr>
+      </w:pPr>
+      <w:r>
+        <w:rPr>
+          <w:rFonts w:ascii="Times New Roman" w:eastAsia="Times New Roman" w:hAnsi="Times New Roman" w:cs="Times New Roman"/>
+          <w:b/>
+          <w:bCs/>
+          <w:sz w:val="24"/>
+          <w:szCs w:val="24"/>
+        </w:rPr>
+        <w:t xml:space="preserve">En cuanto, declaró la inconstitucionalidad sobrevenida del artículo 7 de la Ley 23.928 (texto según Ley 25.561), en cuanto prohíbe la actualización monetaria o la indexación de créditos para las obligaciones dinerarias. Asimismo, sentó los criterios para la determinación de las deudas de valor, como así también dispuso una serie de directrices para delimitar el alcance de la indexación. </w:t>
+      </w:r>
+    </w:p>
+    <w:p>
+      <w:pPr>
+        <w:spacing w:after="0" w:line="360" w:lineRule="auto"/>
+        <w:ind w:firstLine="720"/>
+        <w:jc w:val="both"/>
+        <w:rPr>
+          <w:rFonts w:ascii="Times New Roman" w:eastAsia="Times New Roman" w:hAnsi="Times New Roman" w:cs="Times New Roman"/>
+          <w:b/>
+          <w:bCs/>
+          <w:sz w:val="24"/>
+          <w:szCs w:val="24"/>
+        </w:rPr>
+      </w:pPr>
       <w:r>
         <w:rPr>
           <w:rFonts w:ascii="Times New Roman" w:eastAsia="Times New Roman" w:hAnsi="Times New Roman" w:cs="Times New Roman"/>
@@ -8182,7 +8618,7 @@
           <w:szCs w:val="24"/>
         </w:rPr>
         <w:lastRenderedPageBreak/>
-        <w:t xml:space="preserve">la nota periodística que se acompaña a la parte documental del presente libelo, emitida por el diario Clarín con fecha 11 de enero de 2009, en la cual se informa que en los últimos siete </w:t>
+        <w:t xml:space="preserve">Se declara la inconstitucionalidad del artículo 7 de la Ley 23.928 y su inaplicabilidad, en virtud del cambio de escenario económico, ya que debe ser descalificado porque desconoce el principio de razonabilidad, el derecho de propiedad del reclamante y no permite proveer una tutela judicial eficaz (arts. </w:t>
       </w:r>
       <w:proofErr w:type="gramStart"/>
       <w:r>
@@ -8193,7 +8629,7 @@
           <w:sz w:val="24"/>
           <w:szCs w:val="24"/>
         </w:rPr>
-        <w:t>años  hay</w:t>
+        <w:t>1 ,</w:t>
       </w:r>
       <w:proofErr w:type="gramEnd"/>
       <w:r>
@@ -8204,7 +8640,7 @@
           <w:sz w:val="24"/>
           <w:szCs w:val="24"/>
         </w:rPr>
-        <w:t xml:space="preserve"> precios que subieron más del 500%. Y desde allí hasta la </w:t>
+        <w:t xml:space="preserve"> </w:t>
       </w:r>
       <w:proofErr w:type="gramStart"/>
       <w:r>
@@ -8215,7 +8651,7 @@
           <w:sz w:val="24"/>
           <w:szCs w:val="24"/>
         </w:rPr>
-        <w:t>actualidad  los</w:t>
+        <w:t>17 ,</w:t>
       </w:r>
       <w:proofErr w:type="gramEnd"/>
       <w:r>
@@ -8226,7 +8662,7 @@
           <w:sz w:val="24"/>
           <w:szCs w:val="24"/>
         </w:rPr>
-        <w:t xml:space="preserve"> aumentos alcanzan un 250</w:t>
+        <w:t xml:space="preserve"> </w:t>
       </w:r>
       <w:proofErr w:type="gramStart"/>
       <w:r>
@@ -8237,7 +8673,7 @@
           <w:sz w:val="24"/>
           <w:szCs w:val="24"/>
         </w:rPr>
-        <w:t>%,  Consecuentemente</w:t>
+        <w:t>18 ,</w:t>
       </w:r>
       <w:proofErr w:type="gramEnd"/>
       <w:r>
@@ -8248,614 +8684,373 @@
           <w:sz w:val="24"/>
           <w:szCs w:val="24"/>
         </w:rPr>
-        <w:t xml:space="preserve"> con lo expuesto podemos arribar a las conclusiones mencionadas, ya que tal como manifiestan los representantes de la mayoría de las aseguradoras, les resulta más conveniente generar litigios que </w:t>
+        <w:t xml:space="preserve"> 28 y </w:t>
+      </w:r>
+      <w:proofErr w:type="spellStart"/>
+      <w:r>
+        <w:rPr>
+          <w:rFonts w:ascii="Times New Roman" w:eastAsia="Times New Roman" w:hAnsi="Times New Roman" w:cs="Times New Roman"/>
+          <w:b/>
+          <w:bCs/>
+          <w:sz w:val="24"/>
+          <w:szCs w:val="24"/>
+        </w:rPr>
+        <w:t>concs</w:t>
+      </w:r>
+      <w:proofErr w:type="spellEnd"/>
+      <w:r>
+        <w:rPr>
+          <w:rFonts w:ascii="Times New Roman" w:eastAsia="Times New Roman" w:hAnsi="Times New Roman" w:cs="Times New Roman"/>
+          <w:b/>
+          <w:bCs/>
+          <w:sz w:val="24"/>
+          <w:szCs w:val="24"/>
+        </w:rPr>
+        <w:t xml:space="preserve">., Const. </w:t>
+      </w:r>
+      <w:proofErr w:type="spellStart"/>
+      <w:r>
+        <w:rPr>
+          <w:rFonts w:ascii="Times New Roman" w:eastAsia="Times New Roman" w:hAnsi="Times New Roman" w:cs="Times New Roman"/>
+          <w:b/>
+          <w:bCs/>
+          <w:sz w:val="24"/>
+          <w:szCs w:val="24"/>
+        </w:rPr>
+        <w:t>nac</w:t>
+      </w:r>
+      <w:proofErr w:type="spellEnd"/>
+      <w:r>
+        <w:rPr>
+          <w:rFonts w:ascii="Times New Roman" w:eastAsia="Times New Roman" w:hAnsi="Times New Roman" w:cs="Times New Roman"/>
+          <w:b/>
+          <w:bCs/>
+          <w:sz w:val="24"/>
+          <w:szCs w:val="24"/>
+        </w:rPr>
+        <w:t>.).</w:t>
+      </w:r>
+    </w:p>
+    <w:p>
+      <w:pPr>
+        <w:spacing w:after="0" w:line="360" w:lineRule="auto"/>
+        <w:ind w:firstLine="720"/>
+        <w:jc w:val="both"/>
+        <w:rPr>
+          <w:rFonts w:ascii="Times New Roman" w:eastAsia="Times New Roman" w:hAnsi="Times New Roman" w:cs="Times New Roman"/>
+          <w:b/>
+          <w:bCs/>
+          <w:sz w:val="24"/>
+          <w:szCs w:val="24"/>
+        </w:rPr>
+      </w:pPr>
+      <w:r>
+        <w:rPr>
+          <w:rFonts w:ascii="Times New Roman" w:eastAsia="Times New Roman" w:hAnsi="Times New Roman" w:cs="Times New Roman"/>
+          <w:b/>
+          <w:bCs/>
+          <w:sz w:val="24"/>
+          <w:szCs w:val="24"/>
+        </w:rPr>
+        <w:t>Finalmente se dispuso que las sumas de condena se actualizarán y devengarán intereses compensatorios conforme la actualización del crédito siguiendo como pautas aplicables los coeficientes como el IPC (Índice del precio del consumidor) y/o Coeficiente CER y/o la remuneración imponible promedio de los trabajadores estables -RIPTE-; debiendo agregarse desde la fecha en que los créditos se tornaron exigibles una tasa pura del 6% anual.</w:t>
+      </w:r>
+    </w:p>
+    <w:p>
+      <w:pPr>
+        <w:spacing w:after="0" w:line="360" w:lineRule="auto"/>
+        <w:ind w:firstLine="720"/>
+        <w:jc w:val="both"/>
+        <w:rPr>
+          <w:rFonts w:ascii="Times New Roman" w:eastAsia="Times New Roman" w:hAnsi="Times New Roman" w:cs="Times New Roman"/>
+          <w:b/>
+          <w:bCs/>
+          <w:sz w:val="24"/>
+          <w:szCs w:val="24"/>
+        </w:rPr>
+      </w:pPr>
+      <w:r>
+        <w:rPr>
+          <w:rFonts w:ascii="Times New Roman" w:eastAsia="Times New Roman" w:hAnsi="Times New Roman" w:cs="Times New Roman"/>
+          <w:b/>
+          <w:bCs/>
+          <w:sz w:val="24"/>
+          <w:szCs w:val="24"/>
+        </w:rPr>
+        <w:t xml:space="preserve">En virtud de lo expuesto, solicito que sean de consideración los antecedentes jurisprudenciales mencionados ut-supra al momento de dictar sentencia. </w:t>
+      </w:r>
+    </w:p>
+    <w:p>
+      <w:pPr>
+        <w:spacing w:after="0" w:line="360" w:lineRule="auto"/>
+        <w:ind w:firstLine="554"/>
+        <w:jc w:val="both"/>
+        <w:rPr>
+          <w:rFonts w:ascii="Times New Roman" w:eastAsia="Times New Roman" w:hAnsi="Times New Roman" w:cs="Times New Roman"/>
+          <w:sz w:val="24"/>
+          <w:szCs w:val="24"/>
+          <w:u w:val="single"/>
+        </w:rPr>
+      </w:pPr>
+    </w:p>
+    <w:p>
+      <w:pPr>
+        <w:spacing w:after="0" w:line="360" w:lineRule="auto"/>
+        <w:ind w:firstLine="554"/>
+        <w:jc w:val="both"/>
+        <w:rPr>
+          <w:rFonts w:ascii="Times New Roman" w:eastAsia="Times New Roman" w:hAnsi="Times New Roman" w:cs="Times New Roman"/>
+          <w:sz w:val="24"/>
+          <w:szCs w:val="24"/>
+          <w:u w:val="single"/>
+        </w:rPr>
+      </w:pPr>
+    </w:p>
+    <w:p>
+      <w:pPr>
+        <w:spacing w:after="0" w:line="360" w:lineRule="auto"/>
+        <w:jc w:val="both"/>
+        <w:rPr>
+          <w:rFonts w:ascii="Times New Roman" w:eastAsia="Times New Roman" w:hAnsi="Times New Roman" w:cs="Times New Roman"/>
+          <w:sz w:val="24"/>
+          <w:szCs w:val="24"/>
+          <w:u w:val="single"/>
+        </w:rPr>
+      </w:pPr>
+      <w:r>
+        <w:rPr>
+          <w:rFonts w:ascii="Times New Roman" w:eastAsia="Times New Roman" w:hAnsi="Times New Roman" w:cs="Times New Roman"/>
+          <w:b/>
+          <w:bCs/>
+          <w:sz w:val="24"/>
+          <w:szCs w:val="24"/>
+          <w:u w:val="single"/>
+        </w:rPr>
+        <w:t>X.  RESERVA DEL CASO FEDERAL</w:t>
+      </w:r>
+      <w:r>
+        <w:rPr>
+          <w:rFonts w:ascii="Times New Roman" w:eastAsia="Times New Roman" w:hAnsi="Times New Roman" w:cs="Times New Roman"/>
+          <w:sz w:val="24"/>
+          <w:szCs w:val="24"/>
+          <w:u w:val="single"/>
+        </w:rPr>
+        <w:t>.</w:t>
+      </w:r>
+    </w:p>
+    <w:p>
+      <w:pPr>
+        <w:spacing w:after="0" w:line="360" w:lineRule="auto"/>
+        <w:ind w:firstLine="554"/>
+        <w:jc w:val="both"/>
+        <w:rPr>
+          <w:rFonts w:ascii="Times New Roman" w:eastAsia="Times New Roman" w:hAnsi="Times New Roman" w:cs="Times New Roman"/>
+          <w:sz w:val="24"/>
+          <w:szCs w:val="24"/>
+        </w:rPr>
+      </w:pPr>
+      <w:r>
+        <w:rPr>
+          <w:rFonts w:ascii="Times New Roman" w:eastAsia="Times New Roman" w:hAnsi="Times New Roman" w:cs="Times New Roman"/>
+          <w:sz w:val="24"/>
+          <w:szCs w:val="24"/>
+        </w:rPr>
+        <w:t>Al encontrarse violentado el DERECHO DE PROPIEDAD, Y A LA INTEGRIDAD FÍSICA, siendo éstos reconocidos constitucionalmente a través de los artículos 14,17,18,19 y 75 inc. 22 de la Constitución Nacional (que incorpora los Tratados Internacionales sobre Derechos Humanos y les otorga jerarquía constitucional), es que se realizó formal reserva de recurrir a la Corte Suprema de Justicia de la Nación por vía del Recurso Extraordinario Federal consagrado en el art. 14 de la Ley 48 en caso de sentencia adversa.</w:t>
+      </w:r>
+    </w:p>
+    <w:p>
+      <w:pPr>
+        <w:spacing w:after="0" w:line="360" w:lineRule="auto"/>
+        <w:rPr>
+          <w:rFonts w:ascii="Times New Roman" w:eastAsia="Times New Roman" w:hAnsi="Times New Roman" w:cs="Times New Roman"/>
+          <w:sz w:val="24"/>
+          <w:szCs w:val="24"/>
+        </w:rPr>
+      </w:pPr>
+    </w:p>
+    <w:p>
+      <w:pPr>
+        <w:spacing w:after="0" w:line="360" w:lineRule="auto"/>
+        <w:ind w:firstLine="554"/>
+        <w:jc w:val="both"/>
+        <w:rPr>
+          <w:rFonts w:ascii="Times New Roman" w:eastAsia="Times New Roman" w:hAnsi="Times New Roman" w:cs="Times New Roman"/>
+          <w:sz w:val="24"/>
+          <w:szCs w:val="24"/>
+        </w:rPr>
+      </w:pPr>
+    </w:p>
+    <w:p>
+      <w:pPr>
+        <w:spacing w:after="0" w:line="360" w:lineRule="auto"/>
+        <w:jc w:val="both"/>
+        <w:rPr>
+          <w:rFonts w:ascii="Times New Roman" w:eastAsia="Times New Roman" w:hAnsi="Times New Roman" w:cs="Times New Roman"/>
+          <w:sz w:val="24"/>
+          <w:szCs w:val="24"/>
+        </w:rPr>
+      </w:pPr>
+      <w:r>
+        <w:rPr>
+          <w:rFonts w:ascii="Times New Roman" w:eastAsia="Times New Roman" w:hAnsi="Times New Roman" w:cs="Times New Roman"/>
+          <w:b/>
+          <w:bCs/>
+          <w:sz w:val="24"/>
+          <w:szCs w:val="24"/>
+          <w:u w:val="single"/>
+        </w:rPr>
+        <w:t>XI. DAÑO FUTURO - RESERVA DE DERECHO:</w:t>
+      </w:r>
+    </w:p>
+    <w:p>
+      <w:pPr>
+        <w:spacing w:after="0" w:line="360" w:lineRule="auto"/>
+        <w:ind w:left="11" w:firstLine="720"/>
+        <w:jc w:val="both"/>
+        <w:rPr>
+          <w:rFonts w:ascii="Times New Roman" w:eastAsia="Times New Roman" w:hAnsi="Times New Roman" w:cs="Times New Roman"/>
+          <w:sz w:val="24"/>
+          <w:szCs w:val="24"/>
+        </w:rPr>
+      </w:pPr>
+      <w:r>
+        <w:rPr>
+          <w:rFonts w:ascii="Times New Roman" w:eastAsia="Times New Roman" w:hAnsi="Times New Roman" w:cs="Times New Roman"/>
+          <w:sz w:val="24"/>
+          <w:szCs w:val="24"/>
+        </w:rPr>
+        <w:t>Atento que la estimación efectuada en los diversos rubros tiene carácter provisional, se hace reserva de derecho de acompañar a juicio los comprobantes de gastos sufridos en la atención médica. Así lo ha aceptado la jurisprudencia, dado que la secuela de los traumatismos y lesiones suelen ser prolongadas y derivarse en el tiempo en consecuencias imprevistas (</w:t>
+      </w:r>
+      <w:proofErr w:type="spellStart"/>
+      <w:r>
+        <w:rPr>
+          <w:rFonts w:ascii="Times New Roman" w:eastAsia="Times New Roman" w:hAnsi="Times New Roman" w:cs="Times New Roman"/>
+          <w:sz w:val="24"/>
+          <w:szCs w:val="24"/>
+        </w:rPr>
+        <w:t>CNCiv</w:t>
+      </w:r>
+      <w:proofErr w:type="spellEnd"/>
+      <w:r>
+        <w:rPr>
+          <w:rFonts w:ascii="Times New Roman" w:eastAsia="Times New Roman" w:hAnsi="Times New Roman" w:cs="Times New Roman"/>
+          <w:sz w:val="24"/>
+          <w:szCs w:val="24"/>
+        </w:rPr>
+        <w:t>., Sala A, 11/09/1974, E.D., 11-121). La sentencia puede condenar a indemnización mayor que la estimada en la demanda si se hizo expresa reserva de derecho con el fin de ampliar el período, si al momento de considerarse las lesiones sufridas subsistiera una incapacidad permanente mayor a la que se comprobó en aquel momento (</w:t>
+      </w:r>
+      <w:proofErr w:type="spellStart"/>
+      <w:r>
+        <w:rPr>
+          <w:rFonts w:ascii="Times New Roman" w:eastAsia="Times New Roman" w:hAnsi="Times New Roman" w:cs="Times New Roman"/>
+          <w:sz w:val="24"/>
+          <w:szCs w:val="24"/>
+        </w:rPr>
+        <w:t>CNCiv</w:t>
+      </w:r>
+      <w:proofErr w:type="spellEnd"/>
+      <w:r>
+        <w:rPr>
+          <w:rFonts w:ascii="Times New Roman" w:eastAsia="Times New Roman" w:hAnsi="Times New Roman" w:cs="Times New Roman"/>
+          <w:sz w:val="24"/>
+          <w:szCs w:val="24"/>
+        </w:rPr>
+        <w:t>., Sala D, 25/07/1965, E.D., 13-203).</w:t>
+      </w:r>
+    </w:p>
+    <w:p>
+      <w:pPr>
+        <w:spacing w:after="0" w:line="360" w:lineRule="auto"/>
+        <w:ind w:left="-709" w:firstLine="720"/>
+        <w:jc w:val="both"/>
+        <w:rPr>
+          <w:rFonts w:ascii="Times New Roman" w:eastAsia="Times New Roman" w:hAnsi="Times New Roman" w:cs="Times New Roman"/>
+          <w:sz w:val="24"/>
+          <w:szCs w:val="24"/>
+        </w:rPr>
+      </w:pPr>
+    </w:p>
+    <w:p>
+      <w:pPr>
+        <w:spacing w:after="0" w:line="360" w:lineRule="auto"/>
+        <w:jc w:val="both"/>
+        <w:rPr>
+          <w:rFonts w:ascii="Times New Roman" w:eastAsia="Times New Roman" w:hAnsi="Times New Roman" w:cs="Times New Roman"/>
+          <w:sz w:val="24"/>
+          <w:szCs w:val="24"/>
+        </w:rPr>
+      </w:pPr>
+    </w:p>
+    <w:p>
+      <w:pPr>
+        <w:spacing w:after="0" w:line="360" w:lineRule="auto"/>
+        <w:ind w:left="-709" w:firstLine="720"/>
+        <w:jc w:val="both"/>
+        <w:rPr>
+          <w:rFonts w:ascii="Times New Roman" w:eastAsia="Times New Roman" w:hAnsi="Times New Roman" w:cs="Times New Roman"/>
+          <w:b/>
+          <w:bCs/>
+          <w:sz w:val="24"/>
+          <w:szCs w:val="24"/>
+          <w:u w:val="single"/>
+        </w:rPr>
+      </w:pPr>
+      <w:r>
+        <w:rPr>
+          <w:rFonts w:ascii="Times New Roman" w:eastAsia="Times New Roman" w:hAnsi="Times New Roman" w:cs="Times New Roman"/>
+          <w:b/>
+          <w:bCs/>
+          <w:sz w:val="24"/>
+          <w:szCs w:val="24"/>
+          <w:u w:val="single"/>
+        </w:rPr>
+        <w:t>XII.- JURISPRUDENCIA - DERECHO:</w:t>
+      </w:r>
+    </w:p>
+    <w:p>
+      <w:pPr>
+        <w:spacing w:after="0" w:line="360" w:lineRule="auto"/>
+        <w:ind w:left="11" w:firstLine="720"/>
+        <w:jc w:val="both"/>
+        <w:rPr>
+          <w:rFonts w:ascii="Times New Roman" w:eastAsia="Times New Roman" w:hAnsi="Times New Roman" w:cs="Times New Roman"/>
+          <w:sz w:val="24"/>
+          <w:szCs w:val="24"/>
+        </w:rPr>
+      </w:pPr>
+      <w:r>
+        <w:rPr>
+          <w:rFonts w:ascii="Times New Roman" w:eastAsia="Times New Roman" w:hAnsi="Times New Roman" w:cs="Times New Roman"/>
+          <w:sz w:val="24"/>
+          <w:szCs w:val="24"/>
+        </w:rPr>
+        <w:t xml:space="preserve">Fundo el derecho que me asiste en lo dispuesto en los arts. 726, 1721, 1722, 1723, 1724, 1725, 1731, 1741, 1753, 1757, 1758, 1769 del Código Civil y Comercial de la Nación; </w:t>
+      </w:r>
+      <w:r>
+        <w:rPr>
+          <w:rFonts w:ascii="Times New Roman" w:eastAsia="Times New Roman" w:hAnsi="Times New Roman" w:cs="Times New Roman"/>
+          <w:sz w:val="24"/>
+          <w:szCs w:val="24"/>
+        </w:rPr>
+        <w:lastRenderedPageBreak/>
+        <w:t xml:space="preserve">art. 118, Ley 17.418 y Ley 24.449, Ley Nacional de Tránsito, jurisprudencia y doctrina citadas en la presente </w:t>
       </w:r>
       <w:proofErr w:type="gramStart"/>
       <w:r>
         <w:rPr>
           <w:rFonts w:ascii="Times New Roman" w:eastAsia="Times New Roman" w:hAnsi="Times New Roman" w:cs="Times New Roman"/>
-          <w:b/>
-          <w:bCs/>
-          <w:sz w:val="24"/>
-          <w:szCs w:val="24"/>
-        </w:rPr>
-        <w:t>conciliaciones,  consiguiendo</w:t>
+          <w:sz w:val="24"/>
+          <w:szCs w:val="24"/>
+        </w:rPr>
+        <w:t>demanda.-</w:t>
       </w:r>
       <w:proofErr w:type="gramEnd"/>
       <w:r>
         <w:rPr>
           <w:rFonts w:ascii="Times New Roman" w:eastAsia="Times New Roman" w:hAnsi="Times New Roman" w:cs="Times New Roman"/>
-          <w:b/>
-          <w:bCs/>
-          <w:sz w:val="24"/>
-          <w:szCs w:val="24"/>
-        </w:rPr>
-        <w:t xml:space="preserve"> con ello un claro colapso judicial y un importantísimo beneficio económico.</w:t>
-      </w:r>
-    </w:p>
-    <w:p>
-      <w:pPr>
-        <w:spacing w:after="0" w:line="360" w:lineRule="auto"/>
-        <w:ind w:firstLine="554"/>
-        <w:jc w:val="both"/>
-        <w:rPr>
-          <w:rFonts w:ascii="Times New Roman" w:eastAsia="Times New Roman" w:hAnsi="Times New Roman" w:cs="Times New Roman"/>
-          <w:sz w:val="24"/>
-          <w:szCs w:val="24"/>
-        </w:rPr>
-      </w:pPr>
-      <w:r>
-        <w:rPr>
-          <w:rFonts w:ascii="Times New Roman" w:eastAsia="Times New Roman" w:hAnsi="Times New Roman" w:cs="Times New Roman"/>
-          <w:b/>
-          <w:bCs/>
-          <w:sz w:val="24"/>
-          <w:szCs w:val="24"/>
-        </w:rPr>
-        <w:t xml:space="preserve">AHORA </w:t>
-      </w:r>
-      <w:proofErr w:type="gramStart"/>
-      <w:r>
-        <w:rPr>
-          <w:rFonts w:ascii="Times New Roman" w:eastAsia="Times New Roman" w:hAnsi="Times New Roman" w:cs="Times New Roman"/>
-          <w:b/>
-          <w:bCs/>
-          <w:sz w:val="24"/>
-          <w:szCs w:val="24"/>
-        </w:rPr>
-        <w:t>BIEN</w:t>
-      </w:r>
-      <w:proofErr w:type="gramEnd"/>
-      <w:r>
-        <w:rPr>
-          <w:rFonts w:ascii="Times New Roman" w:eastAsia="Times New Roman" w:hAnsi="Times New Roman" w:cs="Times New Roman"/>
-          <w:b/>
-          <w:bCs/>
-          <w:sz w:val="24"/>
-          <w:szCs w:val="24"/>
-        </w:rPr>
-        <w:t xml:space="preserve"> POR ÚLTIMO Y DE MAYOR RELEVANCIA ES DE MENCIONAR QUE COMO ES DE PÚBLICO CONOCIMIENTO DURANTE TODO 2020, HEMOS SUFRIDO UNA DEVALUACIÓN APROXIMADA DEL 40</w:t>
-      </w:r>
-      <w:proofErr w:type="gramStart"/>
-      <w:r>
-        <w:rPr>
-          <w:rFonts w:ascii="Times New Roman" w:eastAsia="Times New Roman" w:hAnsi="Times New Roman" w:cs="Times New Roman"/>
-          <w:b/>
-          <w:bCs/>
-          <w:sz w:val="24"/>
-          <w:szCs w:val="24"/>
-        </w:rPr>
-        <w:t>%,  SIENDO</w:t>
-      </w:r>
-      <w:proofErr w:type="gramEnd"/>
-      <w:r>
-        <w:rPr>
-          <w:rFonts w:ascii="Times New Roman" w:eastAsia="Times New Roman" w:hAnsi="Times New Roman" w:cs="Times New Roman"/>
-          <w:b/>
-          <w:bCs/>
-          <w:sz w:val="24"/>
-          <w:szCs w:val="24"/>
-        </w:rPr>
-        <w:t xml:space="preserve"> RECONOCIDO OFICIALMENTE QUE LA INFLACIÓN TAN SOLO PARA EL MES DE ENERO DE ESE AÑO FUE DEL 4%, CONSECUENTEMENTE Y REALIZANDO UNA PROYECCIÓN PODRÍAMOS AFIRMAR QUE </w:t>
-      </w:r>
-      <w:proofErr w:type="gramStart"/>
-      <w:r>
-        <w:rPr>
-          <w:rFonts w:ascii="Times New Roman" w:eastAsia="Times New Roman" w:hAnsi="Times New Roman" w:cs="Times New Roman"/>
-          <w:b/>
-          <w:bCs/>
-          <w:sz w:val="24"/>
-          <w:szCs w:val="24"/>
-        </w:rPr>
-        <w:t>LA  INFLACIÓN</w:t>
-      </w:r>
-      <w:proofErr w:type="gramEnd"/>
-      <w:r>
-        <w:rPr>
-          <w:rFonts w:ascii="Times New Roman" w:eastAsia="Times New Roman" w:hAnsi="Times New Roman" w:cs="Times New Roman"/>
-          <w:b/>
-          <w:bCs/>
-          <w:sz w:val="24"/>
-          <w:szCs w:val="24"/>
-        </w:rPr>
-        <w:t xml:space="preserve"> ANUAL EN 2022 RONDARÁ EL 1500%...  SABIENDO </w:t>
-      </w:r>
-      <w:proofErr w:type="gramStart"/>
-      <w:r>
-        <w:rPr>
-          <w:rFonts w:ascii="Times New Roman" w:eastAsia="Times New Roman" w:hAnsi="Times New Roman" w:cs="Times New Roman"/>
-          <w:b/>
-          <w:bCs/>
-          <w:sz w:val="24"/>
-          <w:szCs w:val="24"/>
-        </w:rPr>
-        <w:t>ELLO  S.S</w:t>
-      </w:r>
-      <w:proofErr w:type="gramEnd"/>
-      <w:r>
-        <w:rPr>
-          <w:rFonts w:ascii="Times New Roman" w:eastAsia="Times New Roman" w:hAnsi="Times New Roman" w:cs="Times New Roman"/>
-          <w:b/>
-          <w:bCs/>
-          <w:sz w:val="24"/>
-          <w:szCs w:val="24"/>
-        </w:rPr>
-        <w:t xml:space="preserve"> COMPRENDERÁ QUE NINGUNA DE LAS TASAS DE INTERÉS QUE SE APLICAN PARA ACTUALIZAR MONTOS DE SENTENCIAS SE CONDICEN CON LA REALIDAD DE NUESTRO PAÍS, MENOS AÚN LA TASA PASIVA Y/O LA DEL 8% LAS CUALES HOY POR HOY RESULTAN HASTA IRRISORIAS, SIENDO ESTO </w:t>
-      </w:r>
-      <w:proofErr w:type="gramStart"/>
-      <w:r>
-        <w:rPr>
-          <w:rFonts w:ascii="Times New Roman" w:eastAsia="Times New Roman" w:hAnsi="Times New Roman" w:cs="Times New Roman"/>
-          <w:b/>
-          <w:bCs/>
-          <w:sz w:val="24"/>
-          <w:szCs w:val="24"/>
-        </w:rPr>
-        <w:t>ÚNICAMENTE  UN</w:t>
-      </w:r>
-      <w:proofErr w:type="gramEnd"/>
-      <w:r>
-        <w:rPr>
-          <w:rFonts w:ascii="Times New Roman" w:eastAsia="Times New Roman" w:hAnsi="Times New Roman" w:cs="Times New Roman"/>
-          <w:b/>
-          <w:bCs/>
-          <w:sz w:val="24"/>
-          <w:szCs w:val="24"/>
-        </w:rPr>
-        <w:t xml:space="preserve"> EXCELENTE </w:t>
-      </w:r>
-      <w:proofErr w:type="gramStart"/>
-      <w:r>
-        <w:rPr>
-          <w:rFonts w:ascii="Times New Roman" w:eastAsia="Times New Roman" w:hAnsi="Times New Roman" w:cs="Times New Roman"/>
-          <w:b/>
-          <w:bCs/>
-          <w:sz w:val="24"/>
-          <w:szCs w:val="24"/>
-        </w:rPr>
-        <w:t>NEGOCIO  PARA</w:t>
-      </w:r>
-      <w:proofErr w:type="gramEnd"/>
-      <w:r>
-        <w:rPr>
-          <w:rFonts w:ascii="Times New Roman" w:eastAsia="Times New Roman" w:hAnsi="Times New Roman" w:cs="Times New Roman"/>
-          <w:b/>
-          <w:bCs/>
-          <w:sz w:val="24"/>
-          <w:szCs w:val="24"/>
-        </w:rPr>
-        <w:t xml:space="preserve"> LAS ASEGURADORAS, LAS CUALES AL DILATAR LOS </w:t>
-      </w:r>
-      <w:proofErr w:type="gramStart"/>
-      <w:r>
-        <w:rPr>
-          <w:rFonts w:ascii="Times New Roman" w:eastAsia="Times New Roman" w:hAnsi="Times New Roman" w:cs="Times New Roman"/>
-          <w:b/>
-          <w:bCs/>
-          <w:sz w:val="24"/>
-          <w:szCs w:val="24"/>
-        </w:rPr>
-        <w:t>PAGOS  GENERAN</w:t>
-      </w:r>
-      <w:proofErr w:type="gramEnd"/>
-      <w:r>
-        <w:rPr>
-          <w:rFonts w:ascii="Times New Roman" w:eastAsia="Times New Roman" w:hAnsi="Times New Roman" w:cs="Times New Roman"/>
-          <w:b/>
-          <w:bCs/>
-          <w:sz w:val="24"/>
-          <w:szCs w:val="24"/>
-        </w:rPr>
-        <w:t xml:space="preserve"> UN PERJUICIO DESMESURADO EN EL ACTOR QUIEN JAMÁS TENDRÁ UN RECLAMO AJUSTADO A LA REALIDAD QUE ATRAVESAMOS.</w:t>
-      </w:r>
-    </w:p>
-    <w:p>
-      <w:pPr>
-        <w:spacing w:after="0" w:line="360" w:lineRule="auto"/>
-        <w:ind w:firstLine="554"/>
-        <w:jc w:val="both"/>
-        <w:rPr>
-          <w:rFonts w:ascii="Times New Roman" w:eastAsia="Times New Roman" w:hAnsi="Times New Roman" w:cs="Times New Roman"/>
-          <w:b/>
-          <w:bCs/>
-          <w:sz w:val="24"/>
-          <w:szCs w:val="24"/>
-        </w:rPr>
-      </w:pPr>
-      <w:r>
-        <w:rPr>
-          <w:rFonts w:ascii="Times New Roman" w:eastAsia="Times New Roman" w:hAnsi="Times New Roman" w:cs="Times New Roman"/>
-          <w:b/>
-          <w:bCs/>
-          <w:sz w:val="24"/>
-          <w:szCs w:val="24"/>
-        </w:rPr>
-        <w:t xml:space="preserve">Cabe destacar que en los últimos años hasta el 2024 inclusive hemos sufrido un proceso inflacionario del orden del 150% aproximadamente en cada periodo anual. </w:t>
-      </w:r>
-    </w:p>
-    <w:p>
-      <w:pPr>
-        <w:spacing w:after="0" w:line="360" w:lineRule="auto"/>
-        <w:ind w:firstLine="720"/>
-        <w:jc w:val="both"/>
-        <w:rPr>
-          <w:rFonts w:ascii="Times New Roman" w:eastAsia="Times New Roman" w:hAnsi="Times New Roman" w:cs="Times New Roman"/>
-          <w:b/>
-          <w:bCs/>
-          <w:sz w:val="24"/>
-          <w:szCs w:val="24"/>
-        </w:rPr>
-      </w:pPr>
-      <w:r>
-        <w:rPr>
-          <w:rFonts w:ascii="Times New Roman" w:eastAsia="Times New Roman" w:hAnsi="Times New Roman" w:cs="Times New Roman"/>
-          <w:b/>
-          <w:bCs/>
-          <w:sz w:val="24"/>
-          <w:szCs w:val="24"/>
-        </w:rPr>
-        <w:t>En este orden de ideas, la Suprema Corte de la Provincia de Buenos Aires, ha tenido una postura favorable a los argumentos esgrimidos, sentado un cambio de criterio en lo que refiere a la actualización de los créditos en las acciones de daños y perjuicios, conforme a la doctrina legal establecida por la Suprema Corte de Justicia en la causa C. 124.096, "Barrios, Héctor Francisco y otra C/ Lascano, Sandra Beatriz y otra. S/ Daños y Perjuicios" (</w:t>
-      </w:r>
-      <w:proofErr w:type="spellStart"/>
-      <w:r>
-        <w:rPr>
-          <w:rFonts w:ascii="Times New Roman" w:eastAsia="Times New Roman" w:hAnsi="Times New Roman" w:cs="Times New Roman"/>
-          <w:b/>
-          <w:bCs/>
-          <w:sz w:val="24"/>
-          <w:szCs w:val="24"/>
-        </w:rPr>
-        <w:t>sent</w:t>
-      </w:r>
-      <w:proofErr w:type="spellEnd"/>
-      <w:r>
-        <w:rPr>
-          <w:rFonts w:ascii="Times New Roman" w:eastAsia="Times New Roman" w:hAnsi="Times New Roman" w:cs="Times New Roman"/>
-          <w:b/>
-          <w:bCs/>
-          <w:sz w:val="24"/>
-          <w:szCs w:val="24"/>
-        </w:rPr>
-        <w:t xml:space="preserve">. del 17/4/2024). </w:t>
-      </w:r>
-    </w:p>
-    <w:p>
-      <w:pPr>
-        <w:spacing w:after="0" w:line="360" w:lineRule="auto"/>
-        <w:ind w:firstLine="720"/>
-        <w:jc w:val="both"/>
-        <w:rPr>
-          <w:rFonts w:ascii="Times New Roman" w:eastAsia="Times New Roman" w:hAnsi="Times New Roman" w:cs="Times New Roman"/>
-          <w:b/>
-          <w:bCs/>
-          <w:sz w:val="24"/>
-          <w:szCs w:val="24"/>
-        </w:rPr>
-      </w:pPr>
-      <w:r>
-        <w:rPr>
-          <w:rFonts w:ascii="Times New Roman" w:eastAsia="Times New Roman" w:hAnsi="Times New Roman" w:cs="Times New Roman"/>
-          <w:b/>
-          <w:bCs/>
-          <w:sz w:val="24"/>
-          <w:szCs w:val="24"/>
-        </w:rPr>
-        <w:t xml:space="preserve">En cuanto, declaró la inconstitucionalidad sobrevenida del artículo 7 de la Ley 23.928 (texto según Ley 25.561), en cuanto prohíbe la actualización monetaria o la indexación de créditos para las obligaciones dinerarias. Asimismo, sentó los criterios para la determinación de las deudas de valor, como así también dispuso una serie de directrices para delimitar el alcance de la indexación. </w:t>
-      </w:r>
-    </w:p>
-    <w:p>
-      <w:pPr>
-        <w:spacing w:after="0" w:line="360" w:lineRule="auto"/>
-        <w:ind w:firstLine="720"/>
-        <w:jc w:val="both"/>
-        <w:rPr>
-          <w:rFonts w:ascii="Times New Roman" w:eastAsia="Times New Roman" w:hAnsi="Times New Roman" w:cs="Times New Roman"/>
-          <w:b/>
-          <w:bCs/>
-          <w:sz w:val="24"/>
-          <w:szCs w:val="24"/>
-        </w:rPr>
-      </w:pPr>
-      <w:r>
-        <w:rPr>
-          <w:rFonts w:ascii="Times New Roman" w:eastAsia="Times New Roman" w:hAnsi="Times New Roman" w:cs="Times New Roman"/>
-          <w:b/>
-          <w:bCs/>
-          <w:sz w:val="24"/>
-          <w:szCs w:val="24"/>
-        </w:rPr>
-        <w:t xml:space="preserve">Se declara la inconstitucionalidad del artículo 7 de la Ley 23.928 y su inaplicabilidad, en virtud del cambio de escenario económico, ya que debe ser descalificado porque desconoce el principio de razonabilidad, el derecho de propiedad </w:t>
-      </w:r>
-      <w:r>
-        <w:rPr>
-          <w:rFonts w:ascii="Times New Roman" w:eastAsia="Times New Roman" w:hAnsi="Times New Roman" w:cs="Times New Roman"/>
-          <w:b/>
-          <w:bCs/>
-          <w:sz w:val="24"/>
-          <w:szCs w:val="24"/>
-        </w:rPr>
-        <w:lastRenderedPageBreak/>
-        <w:t xml:space="preserve">del reclamante y no permite proveer una tutela judicial eficaz (arts. </w:t>
-      </w:r>
-      <w:proofErr w:type="gramStart"/>
-      <w:r>
-        <w:rPr>
-          <w:rFonts w:ascii="Times New Roman" w:eastAsia="Times New Roman" w:hAnsi="Times New Roman" w:cs="Times New Roman"/>
-          <w:b/>
-          <w:bCs/>
-          <w:sz w:val="24"/>
-          <w:szCs w:val="24"/>
-        </w:rPr>
-        <w:t>1 ,</w:t>
-      </w:r>
-      <w:proofErr w:type="gramEnd"/>
-      <w:r>
-        <w:rPr>
-          <w:rFonts w:ascii="Times New Roman" w:eastAsia="Times New Roman" w:hAnsi="Times New Roman" w:cs="Times New Roman"/>
-          <w:b/>
-          <w:bCs/>
-          <w:sz w:val="24"/>
-          <w:szCs w:val="24"/>
-        </w:rPr>
-        <w:t xml:space="preserve"> </w:t>
-      </w:r>
-      <w:proofErr w:type="gramStart"/>
-      <w:r>
-        <w:rPr>
-          <w:rFonts w:ascii="Times New Roman" w:eastAsia="Times New Roman" w:hAnsi="Times New Roman" w:cs="Times New Roman"/>
-          <w:b/>
-          <w:bCs/>
-          <w:sz w:val="24"/>
-          <w:szCs w:val="24"/>
-        </w:rPr>
-        <w:t>17 ,</w:t>
-      </w:r>
-      <w:proofErr w:type="gramEnd"/>
-      <w:r>
-        <w:rPr>
-          <w:rFonts w:ascii="Times New Roman" w:eastAsia="Times New Roman" w:hAnsi="Times New Roman" w:cs="Times New Roman"/>
-          <w:b/>
-          <w:bCs/>
-          <w:sz w:val="24"/>
-          <w:szCs w:val="24"/>
-        </w:rPr>
-        <w:t xml:space="preserve"> </w:t>
-      </w:r>
-      <w:proofErr w:type="gramStart"/>
-      <w:r>
-        <w:rPr>
-          <w:rFonts w:ascii="Times New Roman" w:eastAsia="Times New Roman" w:hAnsi="Times New Roman" w:cs="Times New Roman"/>
-          <w:b/>
-          <w:bCs/>
-          <w:sz w:val="24"/>
-          <w:szCs w:val="24"/>
-        </w:rPr>
-        <w:t>18 ,</w:t>
-      </w:r>
-      <w:proofErr w:type="gramEnd"/>
-      <w:r>
-        <w:rPr>
-          <w:rFonts w:ascii="Times New Roman" w:eastAsia="Times New Roman" w:hAnsi="Times New Roman" w:cs="Times New Roman"/>
-          <w:b/>
-          <w:bCs/>
-          <w:sz w:val="24"/>
-          <w:szCs w:val="24"/>
-        </w:rPr>
-        <w:t xml:space="preserve"> 28 y </w:t>
-      </w:r>
-      <w:proofErr w:type="spellStart"/>
-      <w:r>
-        <w:rPr>
-          <w:rFonts w:ascii="Times New Roman" w:eastAsia="Times New Roman" w:hAnsi="Times New Roman" w:cs="Times New Roman"/>
-          <w:b/>
-          <w:bCs/>
-          <w:sz w:val="24"/>
-          <w:szCs w:val="24"/>
-        </w:rPr>
-        <w:t>concs</w:t>
-      </w:r>
-      <w:proofErr w:type="spellEnd"/>
-      <w:r>
-        <w:rPr>
-          <w:rFonts w:ascii="Times New Roman" w:eastAsia="Times New Roman" w:hAnsi="Times New Roman" w:cs="Times New Roman"/>
-          <w:b/>
-          <w:bCs/>
-          <w:sz w:val="24"/>
-          <w:szCs w:val="24"/>
-        </w:rPr>
-        <w:t xml:space="preserve">., Const. </w:t>
-      </w:r>
-      <w:proofErr w:type="spellStart"/>
-      <w:r>
-        <w:rPr>
-          <w:rFonts w:ascii="Times New Roman" w:eastAsia="Times New Roman" w:hAnsi="Times New Roman" w:cs="Times New Roman"/>
-          <w:b/>
-          <w:bCs/>
-          <w:sz w:val="24"/>
-          <w:szCs w:val="24"/>
-        </w:rPr>
-        <w:t>nac</w:t>
-      </w:r>
-      <w:proofErr w:type="spellEnd"/>
-      <w:r>
-        <w:rPr>
-          <w:rFonts w:ascii="Times New Roman" w:eastAsia="Times New Roman" w:hAnsi="Times New Roman" w:cs="Times New Roman"/>
-          <w:b/>
-          <w:bCs/>
-          <w:sz w:val="24"/>
-          <w:szCs w:val="24"/>
-        </w:rPr>
-        <w:t>.).</w:t>
-      </w:r>
-    </w:p>
-    <w:p>
-      <w:pPr>
-        <w:spacing w:after="0" w:line="360" w:lineRule="auto"/>
-        <w:ind w:firstLine="720"/>
-        <w:jc w:val="both"/>
-        <w:rPr>
-          <w:rFonts w:ascii="Times New Roman" w:eastAsia="Times New Roman" w:hAnsi="Times New Roman" w:cs="Times New Roman"/>
-          <w:b/>
-          <w:bCs/>
-          <w:sz w:val="24"/>
-          <w:szCs w:val="24"/>
-        </w:rPr>
-      </w:pPr>
-      <w:r>
-        <w:rPr>
-          <w:rFonts w:ascii="Times New Roman" w:eastAsia="Times New Roman" w:hAnsi="Times New Roman" w:cs="Times New Roman"/>
-          <w:b/>
-          <w:bCs/>
-          <w:sz w:val="24"/>
-          <w:szCs w:val="24"/>
-        </w:rPr>
-        <w:t>Finalmente se dispuso que las sumas de condena se actualizarán y devengarán intereses compensatorios conforme la actualización del crédito siguiendo como pautas aplicables los coeficientes como el IPC (Índice del precio del consumidor) y/o Coeficiente CER y/o la remuneración imponible promedio de los trabajadores estables -RIPTE-; debiendo agregarse desde la fecha en que los créditos se tornaron exigibles una tasa pura del 6% anual.</w:t>
-      </w:r>
-    </w:p>
-    <w:p>
-      <w:pPr>
-        <w:spacing w:after="0" w:line="360" w:lineRule="auto"/>
-        <w:ind w:firstLine="720"/>
-        <w:jc w:val="both"/>
-        <w:rPr>
-          <w:rFonts w:ascii="Times New Roman" w:eastAsia="Times New Roman" w:hAnsi="Times New Roman" w:cs="Times New Roman"/>
-          <w:b/>
-          <w:bCs/>
-          <w:sz w:val="24"/>
-          <w:szCs w:val="24"/>
-        </w:rPr>
-      </w:pPr>
-      <w:r>
-        <w:rPr>
-          <w:rFonts w:ascii="Times New Roman" w:eastAsia="Times New Roman" w:hAnsi="Times New Roman" w:cs="Times New Roman"/>
-          <w:b/>
-          <w:bCs/>
-          <w:sz w:val="24"/>
-          <w:szCs w:val="24"/>
-        </w:rPr>
-        <w:t xml:space="preserve">En virtud de lo expuesto, solicito que sean de consideración los antecedentes jurisprudenciales mencionados ut-supra al momento de dictar sentencia. </w:t>
-      </w:r>
-    </w:p>
-    <w:p>
-      <w:pPr>
-        <w:spacing w:after="0" w:line="360" w:lineRule="auto"/>
-        <w:ind w:firstLine="554"/>
-        <w:jc w:val="both"/>
-        <w:rPr>
-          <w:rFonts w:ascii="Times New Roman" w:eastAsia="Times New Roman" w:hAnsi="Times New Roman" w:cs="Times New Roman"/>
-          <w:sz w:val="24"/>
-          <w:szCs w:val="24"/>
-          <w:u w:val="single"/>
-        </w:rPr>
-      </w:pPr>
-    </w:p>
-    <w:p>
-      <w:pPr>
-        <w:spacing w:after="0" w:line="360" w:lineRule="auto"/>
-        <w:ind w:firstLine="554"/>
-        <w:jc w:val="both"/>
-        <w:rPr>
-          <w:rFonts w:ascii="Times New Roman" w:eastAsia="Times New Roman" w:hAnsi="Times New Roman" w:cs="Times New Roman"/>
-          <w:sz w:val="24"/>
-          <w:szCs w:val="24"/>
-          <w:u w:val="single"/>
-        </w:rPr>
-      </w:pPr>
-    </w:p>
-    <w:p>
-      <w:pPr>
-        <w:spacing w:after="0" w:line="360" w:lineRule="auto"/>
-        <w:jc w:val="both"/>
-        <w:rPr>
-          <w:rFonts w:ascii="Times New Roman" w:eastAsia="Times New Roman" w:hAnsi="Times New Roman" w:cs="Times New Roman"/>
-          <w:sz w:val="24"/>
-          <w:szCs w:val="24"/>
-          <w:u w:val="single"/>
-        </w:rPr>
-      </w:pPr>
-      <w:r>
-        <w:rPr>
-          <w:rFonts w:ascii="Times New Roman" w:eastAsia="Times New Roman" w:hAnsi="Times New Roman" w:cs="Times New Roman"/>
-          <w:b/>
-          <w:bCs/>
-          <w:sz w:val="24"/>
-          <w:szCs w:val="24"/>
-          <w:u w:val="single"/>
-        </w:rPr>
-        <w:t>X.  RESERVA DEL CASO FEDERAL</w:t>
-      </w:r>
-      <w:r>
-        <w:rPr>
-          <w:rFonts w:ascii="Times New Roman" w:eastAsia="Times New Roman" w:hAnsi="Times New Roman" w:cs="Times New Roman"/>
-          <w:sz w:val="24"/>
-          <w:szCs w:val="24"/>
-          <w:u w:val="single"/>
-        </w:rPr>
-        <w:t>.</w:t>
-      </w:r>
-    </w:p>
-    <w:p>
-      <w:pPr>
-        <w:spacing w:after="0" w:line="360" w:lineRule="auto"/>
-        <w:ind w:firstLine="554"/>
-        <w:jc w:val="both"/>
-        <w:rPr>
-          <w:rFonts w:ascii="Times New Roman" w:eastAsia="Times New Roman" w:hAnsi="Times New Roman" w:cs="Times New Roman"/>
-          <w:sz w:val="24"/>
-          <w:szCs w:val="24"/>
-        </w:rPr>
-      </w:pPr>
-      <w:r>
-        <w:rPr>
-          <w:rFonts w:ascii="Times New Roman" w:eastAsia="Times New Roman" w:hAnsi="Times New Roman" w:cs="Times New Roman"/>
-          <w:sz w:val="24"/>
-          <w:szCs w:val="24"/>
-        </w:rPr>
-        <w:t>Al encontrarse violentado el DERECHO DE PROPIEDAD, Y A LA INTEGRIDAD FÍSICA, siendo éstos reconocidos constitucionalmente a través de los artículos 14,17,18,19 y 75 inc. 22 de la Constitución Nacional (que incorpora los Tratados Internacionales sobre Derechos Humanos y les otorga jerarquía constitucional), es que se realizó formal reserva de recurrir a la Corte Suprema de Justicia de la Nación por vía del Recurso Extraordinario Federal consagrado en el art. 14 de la Ley 48 en caso de sentencia adversa.</w:t>
-      </w:r>
-    </w:p>
-    <w:p>
-      <w:pPr>
-        <w:spacing w:after="0" w:line="360" w:lineRule="auto"/>
-        <w:rPr>
-          <w:rFonts w:ascii="Times New Roman" w:eastAsia="Times New Roman" w:hAnsi="Times New Roman" w:cs="Times New Roman"/>
-          <w:sz w:val="24"/>
-          <w:szCs w:val="24"/>
-        </w:rPr>
-      </w:pPr>
-    </w:p>
-    <w:p>
-      <w:pPr>
-        <w:spacing w:after="0" w:line="360" w:lineRule="auto"/>
-        <w:ind w:firstLine="554"/>
-        <w:jc w:val="both"/>
-        <w:rPr>
-          <w:rFonts w:ascii="Times New Roman" w:eastAsia="Times New Roman" w:hAnsi="Times New Roman" w:cs="Times New Roman"/>
-          <w:sz w:val="24"/>
-          <w:szCs w:val="24"/>
-        </w:rPr>
-      </w:pPr>
-    </w:p>
-    <w:p>
-      <w:pPr>
-        <w:spacing w:after="0" w:line="360" w:lineRule="auto"/>
-        <w:jc w:val="both"/>
-        <w:rPr>
-          <w:rFonts w:ascii="Times New Roman" w:eastAsia="Times New Roman" w:hAnsi="Times New Roman" w:cs="Times New Roman"/>
-          <w:sz w:val="24"/>
-          <w:szCs w:val="24"/>
-        </w:rPr>
-      </w:pPr>
-      <w:r>
-        <w:rPr>
-          <w:rFonts w:ascii="Times New Roman" w:eastAsia="Times New Roman" w:hAnsi="Times New Roman" w:cs="Times New Roman"/>
-          <w:b/>
-          <w:bCs/>
-          <w:sz w:val="24"/>
-          <w:szCs w:val="24"/>
-          <w:u w:val="single"/>
-        </w:rPr>
-        <w:t>XI. DAÑO FUTURO - RESERVA DE DERECHO:</w:t>
+          <w:sz w:val="24"/>
+          <w:szCs w:val="24"/>
+        </w:rPr>
+        <w:t> </w:t>
       </w:r>
     </w:p>
     <w:p>
@@ -8872,155 +9067,11 @@
       <w:r>
         <w:rPr>
           <w:rFonts w:ascii="Times New Roman" w:eastAsia="Times New Roman" w:hAnsi="Times New Roman" w:cs="Times New Roman"/>
-          <w:sz w:val="24"/>
-          <w:szCs w:val="24"/>
-        </w:rPr>
-        <w:t>Atento que la estimación efectuada en los diversos rubros tiene carácter provisional, se hace reserva de derecho de acompañar a juicio los comprobantes de gastos sufridos en la atención médica. Así lo ha aceptado la jurisprudencia, dado que la secuela de los traumatismos y lesiones suelen ser prolongadas y derivarse en el tiempo en consecuencias imprevistas (</w:t>
-      </w:r>
-      <w:proofErr w:type="spellStart"/>
-      <w:r>
-        <w:rPr>
-          <w:rFonts w:ascii="Times New Roman" w:eastAsia="Times New Roman" w:hAnsi="Times New Roman" w:cs="Times New Roman"/>
-          <w:sz w:val="24"/>
-          <w:szCs w:val="24"/>
-        </w:rPr>
-        <w:t>CNCiv</w:t>
-      </w:r>
-      <w:proofErr w:type="spellEnd"/>
-      <w:r>
-        <w:rPr>
-          <w:rFonts w:ascii="Times New Roman" w:eastAsia="Times New Roman" w:hAnsi="Times New Roman" w:cs="Times New Roman"/>
-          <w:sz w:val="24"/>
-          <w:szCs w:val="24"/>
-        </w:rPr>
-        <w:t>., Sala A, 11/09/1974, E.D., 11-121). La sentencia puede condenar a indemnización mayor que la estimada en la demanda si se hizo expresa reserva de derecho con el fin de ampliar el período, si al momento de considerarse las lesiones sufridas subsistiera una incapacidad permanente mayor a la que se comprobó en aquel momento (</w:t>
-      </w:r>
-      <w:proofErr w:type="spellStart"/>
-      <w:r>
-        <w:rPr>
-          <w:rFonts w:ascii="Times New Roman" w:eastAsia="Times New Roman" w:hAnsi="Times New Roman" w:cs="Times New Roman"/>
-          <w:sz w:val="24"/>
-          <w:szCs w:val="24"/>
-        </w:rPr>
-        <w:t>CNCiv</w:t>
-      </w:r>
-      <w:proofErr w:type="spellEnd"/>
-      <w:r>
-        <w:rPr>
-          <w:rFonts w:ascii="Times New Roman" w:eastAsia="Times New Roman" w:hAnsi="Times New Roman" w:cs="Times New Roman"/>
-          <w:sz w:val="24"/>
-          <w:szCs w:val="24"/>
-        </w:rPr>
-        <w:t>., Sala D, 25/07/1965, E.D., 13-203).</w:t>
-      </w:r>
-    </w:p>
-    <w:p>
-      <w:pPr>
-        <w:spacing w:after="0" w:line="360" w:lineRule="auto"/>
-        <w:ind w:left="-709" w:firstLine="720"/>
-        <w:jc w:val="both"/>
-        <w:rPr>
-          <w:rFonts w:ascii="Times New Roman" w:eastAsia="Times New Roman" w:hAnsi="Times New Roman" w:cs="Times New Roman"/>
-          <w:sz w:val="24"/>
-          <w:szCs w:val="24"/>
-        </w:rPr>
-      </w:pPr>
-    </w:p>
-    <w:p>
-      <w:pPr>
-        <w:spacing w:after="0" w:line="360" w:lineRule="auto"/>
-        <w:jc w:val="both"/>
-        <w:rPr>
-          <w:rFonts w:ascii="Times New Roman" w:eastAsia="Times New Roman" w:hAnsi="Times New Roman" w:cs="Times New Roman"/>
-          <w:sz w:val="24"/>
-          <w:szCs w:val="24"/>
-        </w:rPr>
-      </w:pPr>
-    </w:p>
-    <w:p>
-      <w:pPr>
-        <w:spacing w:after="0" w:line="360" w:lineRule="auto"/>
-        <w:ind w:left="-709" w:firstLine="720"/>
-        <w:jc w:val="both"/>
-        <w:rPr>
-          <w:rFonts w:ascii="Times New Roman" w:eastAsia="Times New Roman" w:hAnsi="Times New Roman" w:cs="Times New Roman"/>
-          <w:b/>
-          <w:bCs/>
-          <w:sz w:val="24"/>
-          <w:szCs w:val="24"/>
-          <w:u w:val="single"/>
-        </w:rPr>
-      </w:pPr>
-      <w:r>
-        <w:rPr>
-          <w:rFonts w:ascii="Times New Roman" w:eastAsia="Times New Roman" w:hAnsi="Times New Roman" w:cs="Times New Roman"/>
-          <w:b/>
-          <w:bCs/>
-          <w:sz w:val="24"/>
-          <w:szCs w:val="24"/>
-          <w:u w:val="single"/>
-        </w:rPr>
-        <w:t>XII.- JURISPRUDENCIA - DERECHO:</w:t>
-      </w:r>
-    </w:p>
-    <w:p>
-      <w:pPr>
-        <w:spacing w:after="0" w:line="360" w:lineRule="auto"/>
-        <w:ind w:left="11" w:firstLine="720"/>
-        <w:jc w:val="both"/>
-        <w:rPr>
-          <w:rFonts w:ascii="Times New Roman" w:eastAsia="Times New Roman" w:hAnsi="Times New Roman" w:cs="Times New Roman"/>
-          <w:sz w:val="24"/>
-          <w:szCs w:val="24"/>
-        </w:rPr>
-      </w:pPr>
-      <w:r>
-        <w:rPr>
-          <w:rFonts w:ascii="Times New Roman" w:eastAsia="Times New Roman" w:hAnsi="Times New Roman" w:cs="Times New Roman"/>
-          <w:sz w:val="24"/>
-          <w:szCs w:val="24"/>
-        </w:rPr>
-        <w:t xml:space="preserve">Fundo el derecho que me asiste en lo dispuesto en los arts. 726, 1721, 1722, 1723, 1724, 1725, 1731, 1741, 1753, 1757, 1758, 1769 del Código Civil y Comercial de la Nación; art. 118, Ley 17.418 y Ley 24.449, Ley Nacional de Tránsito, jurisprudencia y doctrina citadas en la presente </w:t>
-      </w:r>
-      <w:proofErr w:type="gramStart"/>
-      <w:r>
-        <w:rPr>
-          <w:rFonts w:ascii="Times New Roman" w:eastAsia="Times New Roman" w:hAnsi="Times New Roman" w:cs="Times New Roman"/>
-          <w:sz w:val="24"/>
-          <w:szCs w:val="24"/>
-        </w:rPr>
-        <w:t>demanda.-</w:t>
-      </w:r>
-      <w:proofErr w:type="gramEnd"/>
-      <w:r>
-        <w:rPr>
-          <w:rFonts w:ascii="Times New Roman" w:eastAsia="Times New Roman" w:hAnsi="Times New Roman" w:cs="Times New Roman"/>
-          <w:sz w:val="24"/>
-          <w:szCs w:val="24"/>
-        </w:rPr>
-        <w:t> </w:t>
-      </w:r>
-    </w:p>
-    <w:p>
-      <w:pPr>
-        <w:spacing w:after="0" w:line="360" w:lineRule="auto"/>
-        <w:ind w:left="11" w:firstLine="720"/>
-        <w:jc w:val="both"/>
-        <w:rPr>
-          <w:rFonts w:ascii="Times New Roman" w:eastAsia="Times New Roman" w:hAnsi="Times New Roman" w:cs="Times New Roman"/>
-          <w:sz w:val="24"/>
-          <w:szCs w:val="24"/>
-        </w:rPr>
-      </w:pPr>
-      <w:r>
-        <w:rPr>
-          <w:rFonts w:ascii="Times New Roman" w:eastAsia="Times New Roman" w:hAnsi="Times New Roman" w:cs="Times New Roman"/>
-          <w:b/>
-          <w:bCs/>
-          <w:sz w:val="24"/>
-          <w:szCs w:val="24"/>
-        </w:rPr>
-        <w:lastRenderedPageBreak/>
+          <w:b/>
+          <w:bCs/>
+          <w:sz w:val="24"/>
+          <w:szCs w:val="24"/>
+        </w:rPr>
         <w:t xml:space="preserve">Mora: </w:t>
       </w:r>
       <w:r>
@@ -9521,6 +9572,7 @@
           <w:highlight w:val="yellow"/>
           <w:lang w:val="en-US"/>
         </w:rPr>
+        <w:lastRenderedPageBreak/>
         <w:t>{{ item</w:t>
       </w:r>
       <w:proofErr w:type="gramEnd"/>
@@ -9602,7 +9654,6 @@
           <w:szCs w:val="24"/>
           <w:u w:val="single"/>
         </w:rPr>
-        <w:lastRenderedPageBreak/>
         <w:t>DOCUMENTAL EN PODER DE TERCEROS</w:t>
       </w:r>
     </w:p>
@@ -10778,6 +10829,7 @@
           <w:sz w:val="24"/>
           <w:szCs w:val="24"/>
         </w:rPr>
+        <w:lastRenderedPageBreak/>
         <w:t>A.</w:t>
       </w:r>
       <w:r>
@@ -10841,7 +10893,6 @@
           <w:sz w:val="24"/>
           <w:szCs w:val="24"/>
         </w:rPr>
-        <w:lastRenderedPageBreak/>
         <w:t xml:space="preserve">1.- Interrogue al actor sobre su estado de salud previo al accidente y actividades laborales y particulares que </w:t>
       </w:r>
       <w:proofErr w:type="gramStart"/>
@@ -11783,19 +11834,8 @@
           <w:sz w:val="24"/>
           <w:szCs w:val="24"/>
         </w:rPr>
-        <w:t>El experto debe tener en cuenta que los libros mercantiles que carezcan de alguna de las formalidades prescriptas en el art. 53 del Código de Comercio, o tengan algunos de los defectos y vicios notados en el art. 54 (espacios en blanco, huecos, interlineados, raspaduras, etc.), no tienen valor alguno en juicio a favor del comerciante a quien pertenezcan (art. 55 C.Com.).</w:t>
-      </w:r>
-    </w:p>
-    <w:p>
-      <w:pPr>
-        <w:spacing w:after="0" w:line="360" w:lineRule="auto"/>
-        <w:jc w:val="both"/>
-        <w:rPr>
-          <w:rFonts w:ascii="Times New Roman" w:eastAsia="Times New Roman" w:hAnsi="Times New Roman" w:cs="Times New Roman"/>
-          <w:sz w:val="24"/>
-          <w:szCs w:val="24"/>
-        </w:rPr>
-      </w:pPr>
+        <w:t xml:space="preserve">El experto debe tener en cuenta que los libros mercantiles que carezcan de alguna de las formalidades prescriptas en el art. 53 del Código de Comercio, o tengan algunos de los defectos y vicios notados en el art. 54 (espacios en blanco, huecos, interlineados, raspaduras, </w:t>
+      </w:r>
       <w:r>
         <w:rPr>
           <w:rFonts w:ascii="Times New Roman" w:eastAsia="Times New Roman" w:hAnsi="Times New Roman" w:cs="Times New Roman"/>
@@ -11803,6 +11843,25 @@
           <w:szCs w:val="24"/>
         </w:rPr>
         <w:lastRenderedPageBreak/>
+        <w:t>etc.), no tienen valor alguno en juicio a favor del comerciante a quien pertenezcan (art. 55 C.Com.).</w:t>
+      </w:r>
+    </w:p>
+    <w:p>
+      <w:pPr>
+        <w:spacing w:after="0" w:line="360" w:lineRule="auto"/>
+        <w:jc w:val="both"/>
+        <w:rPr>
+          <w:rFonts w:ascii="Times New Roman" w:eastAsia="Times New Roman" w:hAnsi="Times New Roman" w:cs="Times New Roman"/>
+          <w:sz w:val="24"/>
+          <w:szCs w:val="24"/>
+        </w:rPr>
+      </w:pPr>
+      <w:r>
+        <w:rPr>
+          <w:rFonts w:ascii="Times New Roman" w:eastAsia="Times New Roman" w:hAnsi="Times New Roman" w:cs="Times New Roman"/>
+          <w:sz w:val="24"/>
+          <w:szCs w:val="24"/>
+        </w:rPr>
         <w:t xml:space="preserve">3) Si la empresa era la aseguradora del vehículo demandado a la fecha de ocurrencia </w:t>
       </w:r>
       <w:proofErr w:type="gramStart"/>
@@ -12149,19 +12208,8 @@
           <w:sz w:val="24"/>
           <w:szCs w:val="24"/>
         </w:rPr>
-        <w:t>; si es titular/es de dicha/s cuenta/s; si estas cuentas son unipersonales o no, si se encuentran a nombre de otra/s persona/s, sean estas físicas o jurídicas. Informe los movimientos de estas cuentas bancarias y situación actual de las mismas.</w:t>
-      </w:r>
-    </w:p>
-    <w:p>
-      <w:pPr>
-        <w:spacing w:after="0" w:line="360" w:lineRule="auto"/>
-        <w:jc w:val="both"/>
-        <w:rPr>
-          <w:rFonts w:ascii="Times New Roman" w:eastAsia="Times New Roman" w:hAnsi="Times New Roman" w:cs="Times New Roman"/>
-          <w:sz w:val="24"/>
-          <w:szCs w:val="24"/>
-        </w:rPr>
-      </w:pPr>
+        <w:t xml:space="preserve">; si es titular/es de dicha/s cuenta/s; si estas cuentas son unipersonales o no, si se encuentran a nombre de otra/s persona/s, sean estas físicas o </w:t>
+      </w:r>
       <w:r>
         <w:rPr>
           <w:rFonts w:ascii="Times New Roman" w:eastAsia="Times New Roman" w:hAnsi="Times New Roman" w:cs="Times New Roman"/>
@@ -12169,6 +12217,25 @@
           <w:szCs w:val="24"/>
         </w:rPr>
         <w:lastRenderedPageBreak/>
+        <w:t>jurídicas. Informe los movimientos de estas cuentas bancarias y situación actual de las mismas.</w:t>
+      </w:r>
+    </w:p>
+    <w:p>
+      <w:pPr>
+        <w:spacing w:after="0" w:line="360" w:lineRule="auto"/>
+        <w:jc w:val="both"/>
+        <w:rPr>
+          <w:rFonts w:ascii="Times New Roman" w:eastAsia="Times New Roman" w:hAnsi="Times New Roman" w:cs="Times New Roman"/>
+          <w:sz w:val="24"/>
+          <w:szCs w:val="24"/>
+        </w:rPr>
+      </w:pPr>
+      <w:r>
+        <w:rPr>
+          <w:rFonts w:ascii="Times New Roman" w:eastAsia="Times New Roman" w:hAnsi="Times New Roman" w:cs="Times New Roman"/>
+          <w:sz w:val="24"/>
+          <w:szCs w:val="24"/>
+        </w:rPr>
         <w:t>16) Informe sobre el estado patrimonial de los capitales activos. </w:t>
       </w:r>
     </w:p>
@@ -12638,6 +12705,7 @@
           <w:sz w:val="24"/>
           <w:szCs w:val="24"/>
         </w:rPr>
+        <w:lastRenderedPageBreak/>
         <w:t xml:space="preserve">8) Indique si la cantidad solicitada por daños al </w:t>
       </w:r>
       <w:proofErr w:type="spellStart"/>
@@ -12676,7 +12744,6 @@
           <w:sz w:val="24"/>
           <w:szCs w:val="24"/>
         </w:rPr>
-        <w:lastRenderedPageBreak/>
         <w:t xml:space="preserve">9) Estime de ser posible monto de reparación a valor actualizado a la fecha de la pericia sobre los daños del vehículo del actor. Asimismo, estime el valor de los accesorios de motocicleta dañados tales como guantes, casco y campera de motocicletas adjuntos en fotos como prueba documental. </w:t>
       </w:r>
     </w:p>
@@ -13293,7 +13360,16 @@
           <w:sz w:val="24"/>
           <w:szCs w:val="24"/>
         </w:rPr>
-        <w:t>; que le significaron un endeudamiento atento a que han tenido que acudir a la ayuda de familiares y terceros para poder solventar los múltiples gastos que un accidente de esta magnitud requiere.                             </w:t>
+        <w:t xml:space="preserve">; que le significaron un endeudamiento atento a que </w:t>
+      </w:r>
+      <w:r>
+        <w:rPr>
+          <w:rFonts w:ascii="Times New Roman" w:eastAsia="Times New Roman" w:hAnsi="Times New Roman" w:cs="Times New Roman"/>
+          <w:sz w:val="24"/>
+          <w:szCs w:val="24"/>
+        </w:rPr>
+        <w:lastRenderedPageBreak/>
+        <w:t>han tenido que acudir a la ayuda de familiares y terceros para poder solventar los múltiples gastos que un accidente de esta magnitud requiere.                             </w:t>
       </w:r>
     </w:p>
     <w:p>
@@ -13313,7 +13389,6 @@
           <w:sz w:val="24"/>
           <w:szCs w:val="24"/>
         </w:rPr>
-        <w:lastRenderedPageBreak/>
         <w:t>En base a lo expuesto, y en mérito a la </w:t>
       </w:r>
       <w:proofErr w:type="gramStart"/>
@@ -13913,7 +13988,6 @@
           <w:szCs w:val="24"/>
           <w:u w:val="single"/>
         </w:rPr>
-        <w:lastRenderedPageBreak/>
         <w:t>XVII. CUMPLIMIENTO LEY 26.589:</w:t>
       </w:r>
     </w:p>
@@ -15543,15 +15617,6 @@
   </w:num>
   <w:num w:numId="9" w16cid:durableId="1739089846">
     <w:abstractNumId w:val="2"/>
-    <w:lvlOverride w:ilvl="0"/>
-    <w:lvlOverride w:ilvl="1"/>
-    <w:lvlOverride w:ilvl="2"/>
-    <w:lvlOverride w:ilvl="3"/>
-    <w:lvlOverride w:ilvl="4"/>
-    <w:lvlOverride w:ilvl="5"/>
-    <w:lvlOverride w:ilvl="6"/>
-    <w:lvlOverride w:ilvl="7"/>
-    <w:lvlOverride w:ilvl="8"/>
   </w:num>
 </w:numbering>
 </file>

</xml_diff>